<commit_message>
Clarify soft-money Call Again and first-refusal Recall
- Soft money with near salary/callback stays Call Again (typo salery fixed)
- Direct No Interest only on curse+dont-want; otherwise 1st refusal day
  is always Recall (even if CRM/sheet says No Interest), 2nd day No Interest
- Count bare No Interest/Recall stamps as refusal days

Co-authored-by: ammartas3-png <ammartas3-png@users.noreply.github.com>
</commit_message>
<xml_diff>
--- a/docs/CRM-Status-Rehberi.docx
+++ b/docs/CRM-Status-Rehberi.docx
@@ -821,6 +821,48 @@
         <w:t>Belge tarihi: 2026-09-07 · Dal: cursor/fix-merge1-hang-1465 · Canlı V2 third_party/next_month/Wrong-verifier düzeltmeleri dahil.</w:t>
       </w:r>
     </w:p>
+    <w:p>
+      <w:pPr>
+        <w:pStyle w:val="Heading2"/>
+      </w:pPr>
+      <w:r>
+        <w:t>6. Güncelleme (2026-09-07 — soft money &amp; No Interest)</w:t>
+      </w:r>
+    </w:p>
+    <w:p>
+      <w:r>
+        <w:t>Çakışma 4A kararı: DOĞRU status Call Again. Parası olmasa bile yakın zamanda aranmak / maaş-timed callback istiyorsa Call Again (No Potential değil).</w:t>
+      </w:r>
+    </w:p>
+    <w:p>
+      <w:r>
+        <w:t>No Interest kuralları (net):</w:t>
+      </w:r>
+    </w:p>
+    <w:p>
+      <w:pPr>
+        <w:pStyle w:val="ListBullet"/>
+      </w:pPr>
+      <w:r>
+        <w:t>Doğrudan No Interest: yalnızca küfür/abuse + istemiyorum/not interested birlikteyse.</w:t>
+      </w:r>
+    </w:p>
+    <w:p>
+      <w:pPr>
+        <w:pStyle w:val="ListBullet"/>
+      </w:pPr>
+      <w:r>
+        <w:t>Diğer tüm istemiyorum / not interested / No Interest etiketleri: 1. gün = Recall (agent No Interest yazsa bile); 2. farklı gün = No Interest.</w:t>
+      </w:r>
+    </w:p>
+    <w:p>
+      <w:pPr>
+        <w:pStyle w:val="ListBullet"/>
+      </w:pPr>
+      <w:r>
+        <w:t>Recall sonrası 3 NA günü → No Interest kuralı ayrıca duruyor.</w:t>
+      </w:r>
+    </w:p>
     <w:sectPr>
       <w:pgSz w:w="12240" w:h="15840"/>
       <w:pgMar w:top="1440" w:right="1800" w:bottom="1440" w:left="1800" w:header="720" w:footer="720" w:gutter="0"/>

</xml_diff>

<commit_message>
Fix callback false positives: DIY, negated interested, CB REJS
Stop Call Again from "i will do it by myself", "dont think im interested"
(with stale call-me-back), and CB REJS. DIY/negated interested → Recall;
CB REJS blocks arrange but stays NA. Verifier guards aligned.

Co-authored-by: ammartas3-png <ammartas3-png@users.noreply.github.com>
</commit_message>
<xml_diff>
--- a/docs/CRM-Status-Rehberi.docx
+++ b/docs/CRM-Status-Rehberi.docx
@@ -863,6 +863,56 @@
         <w:t>Recall sonrası 3 NA günü → No Interest kuralı ayrıca duruyor.</w:t>
       </w:r>
     </w:p>
+    <w:p>
+      <w:pPr>
+        <w:pStyle w:val="Heading2"/>
+      </w:pPr>
+      <w:r>
+        <w:t>7. Güncelleme — callback keyword false positive (çakışma D)</w:t>
+      </w:r>
+    </w:p>
+    <w:p>
+      <w:r>
+        <w:t>Sorun: ARRANGE/callback ailesi kör eşleşiyordu.</w:t>
+      </w:r>
+    </w:p>
+    <w:p>
+      <w:pPr>
+        <w:pStyle w:val="ListBullet"/>
+      </w:pPr>
+      <w:r>
+        <w:t>i will do it by myself (DIY red) → Call Again olmamalı → Recall</w:t>
+      </w:r>
+    </w:p>
+    <w:p>
+      <w:pPr>
+        <w:pStyle w:val="ListBullet"/>
+      </w:pPr>
+      <w:r>
+        <w:t>dont think im interested (negation) → Call Again olmamalı; eski call me back newest red’i ezmemeli → Recall</w:t>
+      </w:r>
+    </w:p>
+    <w:p>
+      <w:pPr>
+        <w:pStyle w:val="ListBullet"/>
+      </w:pPr>
+      <w:r>
+        <w:t>CB REJS → Call Again olmamalı; Recall de değil → No Answer / CRM NA</w:t>
+      </w:r>
+    </w:p>
+    <w:p>
+      <w:pPr>
+        <w:pStyle w:val="ListBullet"/>
+      </w:pPr>
+      <w:r>
+        <w:t>next month (+ money) → No Potential (önceki düzeltme)</w:t>
+      </w:r>
+    </w:p>
+    <w:p>
+      <w:r>
+        <w:t>Verifier deterministic guard’lar aynı aile için eklendi.</w:t>
+      </w:r>
+    </w:p>
     <w:sectPr>
       <w:pgSz w:w="12240" w:h="15840"/>
       <w:pgMar w:top="1440" w:right="1800" w:bottom="1440" w:left="1800" w:header="720" w:footer="720" w:gutter="0"/>

</xml_diff>

<commit_message>
Prioritize identity denial over language barrier
im not <name> / wrong person beats speak arabic / Mandarin in the same
note (ACC90025 → Denied Registration). Tighten third_party so help or
language context without explicit owner-transfer does not fire Recall.

Co-authored-by: ammartas3-png <ammartas3-png@users.noreply.github.com>
</commit_message>
<xml_diff>
--- a/docs/CRM-Status-Rehberi.docx
+++ b/docs/CRM-Status-Rehberi.docx
@@ -913,6 +913,27 @@
         <w:t>Verifier deterministic guard’lar aynı aile için eklendi.</w:t>
       </w:r>
     </w:p>
+    <w:p>
+      <w:pPr>
+        <w:pStyle w:val="Heading2"/>
+      </w:pPr>
+      <w:r>
+        <w:t>8. Güncelleme — identity &gt; language (çakışma E)</w:t>
+      </w:r>
+    </w:p>
+    <w:p>
+      <w:r>
+        <w:t>Öncelik sırası: kimlik inkârı (im not Ahmad / wrong person) &gt; dil bariyeri (speak arabic / Mandarin). Aynı cümlede ikisi varsa Denied Registration.</w:t>
+      </w:r>
+    </w:p>
+    <w:p>
+      <w:pPr>
+        <w:pStyle w:val="ListBullet"/>
+      </w:pPr>
+      <w:r>
+        <w:t>third_party: yalnızca açık owner-transfer (registered by / someone else registered / this is his sons account). Help+translate+language → third_party yok; No Language veya Call Again kalır.</w:t>
+      </w:r>
+    </w:p>
     <w:sectPr>
       <w:pgSz w:w="12240" w:h="15840"/>
       <w:pgMar w:top="1440" w:right="1800" w:bottom="1440" w:left="1800" w:header="720" w:footer="720" w:gutter="0"/>

</xml_diff>

<commit_message>
Tighten Denied Registration vs docs vs bare didnt register
Require identity denial for Denied Registration; bare didnt register
stays Recall. no id/no documents/no bank wins as No Potential - no
documents over someone-else-on-my-number notes (ACC90019).

Co-authored-by: ammartas3-png <ammartas3-png@users.noreply.github.com>
</commit_message>
<xml_diff>
--- a/docs/CRM-Status-Rehberi.docx
+++ b/docs/CRM-Status-Rehberi.docx
@@ -934,6 +934,24 @@
         <w:t>third_party: yalnızca açık owner-transfer (registered by / someone else registered / this is his sons account). Help+translate+language → third_party yok; No Language veya Call Again kalır.</w:t>
       </w:r>
     </w:p>
+    <w:p>
+      <w:pPr>
+        <w:pStyle w:val="Heading2"/>
+      </w:pPr>
+      <w:r>
+        <w:t>9. Güncelleme — Denied vs Recall vs NP-no docs (çakışma F)</w:t>
+      </w:r>
+    </w:p>
+    <w:p>
+      <w:r>
+        <w:t>Öncelik: (1) no id/no documents/no bank → No Potential - no documents; (2) kimlik inkârı (im not &lt;name&gt;, not me, wrong person) → Denied Registration; (3) sadece didnt register → Recall.</w:t>
+      </w:r>
+    </w:p>
+    <w:p>
+      <w:r>
+        <w:t>denied_registration(1x) artık didnt register ile ateşlemez.</w:t>
+      </w:r>
+    </w:p>
     <w:sectPr>
       <w:pgSz w:w="12240" w:h="15840"/>
       <w:pgMar w:top="1440" w:right="1800" w:bottom="1440" w:left="1800" w:header="720" w:footer="720" w:gutter="0"/>

</xml_diff>

<commit_message>
fix(mm): Conflict G — phoneAlive keeps No Answer over Wrong Number
Newest dialer-alive signals (ring/NA/VM/DVM) suppress Wrong Number even when
older Invalid email / CRM rows look technical. Narrow techConfirmed so bare
crm/email no longer false-fire. Doc §10 + harness ACC493190.

Co-authored-by: ammartas3-png <ammartas3-png@users.noreply.github.com>
</commit_message>
<xml_diff>
--- a/docs/CRM-Status-Rehberi.docx
+++ b/docs/CRM-Status-Rehberi.docx
@@ -950,6 +950,141 @@
     <w:p>
       <w:r>
         <w:t>denied_registration(1x) artık didnt register ile ateşlemez.</w:t>
+      </w:r>
+    </w:p>
+    <w:p>
+      <w:pPr>
+        <w:pStyle w:val="Heading1"/>
+      </w:pPr>
+      <w:r>
+        <w:rPr>
+          <w:rFonts w:ascii="Calibri" w:hAnsi="Calibri" w:eastAsia="Calibri"/>
+          <w:b/>
+          <w:color w:val="1A365D"/>
+          <w:sz w:val="32"/>
+        </w:rPr>
+        <w:t>10. Çelişki G — Wrong Number vs No Answer (telefon canlı)</w:t>
+      </w:r>
+    </w:p>
+    <w:p>
+      <w:r>
+        <w:rPr>
+          <w:rFonts w:ascii="Calibri" w:hAnsi="Calibri" w:eastAsia="Calibri"/>
+          <w:b w:val="0"/>
+          <w:sz w:val="22"/>
+        </w:rPr>
+        <w:t>Kural (net): newest dialer satırı telefonun canlı olduğunu gösteriyorsa (ring / no answer / voice mail / DVM / unreachable) → Wrong Number üretme. Status No Answer kalır.</w:t>
+      </w:r>
+    </w:p>
+    <w:p>
+      <w:r>
+        <w:rPr>
+          <w:rFonts w:ascii="Calibri" w:hAnsi="Calibri" w:eastAsia="Calibri"/>
+          <w:b w:val="0"/>
+          <w:sz w:val="22"/>
+        </w:rPr>
+        <w:t>Neden Wrong üretildi (ACC493190):</w:t>
+      </w:r>
+    </w:p>
+    <w:p>
+      <w:pPr>
+        <w:pStyle w:val="ListBullet"/>
+      </w:pPr>
+      <w:r>
+        <w:rPr>
+          <w:rFonts w:ascii="Calibri" w:hAnsi="Calibri" w:eastAsia="Calibri"/>
+          <w:b w:val="0"/>
+          <w:sz w:val="22"/>
+        </w:rPr>
+        <w:t>Eski satır: Invalid email - CRM (techConfirmed yanlışlıkla tetiklenirdi — CRM kelimesi tek başına yetiyordu).</w:t>
+      </w:r>
+    </w:p>
+    <w:p>
+      <w:pPr>
+        <w:pStyle w:val="ListBullet"/>
+      </w:pPr>
+      <w:r>
+        <w:rPr>
+          <w:rFonts w:ascii="Calibri" w:hAnsi="Calibri" w:eastAsia="Calibri"/>
+          <w:b w:val="0"/>
+          <w:sz w:val="22"/>
+        </w:rPr>
+        <w:t>Newest: No Answer 30s / rings → phoneAlive.</w:t>
+      </w:r>
+    </w:p>
+    <w:p>
+      <w:pPr>
+        <w:pStyle w:val="ListBullet"/>
+      </w:pPr>
+      <w:r>
+        <w:rPr>
+          <w:rFonts w:ascii="Calibri" w:hAnsi="Calibri" w:eastAsia="Calibri"/>
+          <w:b w:val="0"/>
+          <w:sz w:val="22"/>
+        </w:rPr>
+        <w:t>Eski Memory Match: techConfirmed + softMoney yok → Wrong Number. Newest dialer-only koruması yoktu.</w:t>
+      </w:r>
+    </w:p>
+    <w:p>
+      <w:r>
+        <w:rPr>
+          <w:rFonts w:ascii="Calibri" w:hAnsi="Calibri" w:eastAsia="Calibri"/>
+          <w:b w:val="0"/>
+          <w:sz w:val="22"/>
+        </w:rPr>
+        <w:t>Fix (deployed):</w:t>
+      </w:r>
+    </w:p>
+    <w:p>
+      <w:pPr>
+        <w:pStyle w:val="ListBullet"/>
+      </w:pPr>
+      <w:r>
+        <w:rPr>
+          <w:rFonts w:ascii="Calibri" w:hAnsi="Calibri" w:eastAsia="Calibri"/>
+          <w:b w:val="0"/>
+          <w:sz w:val="22"/>
+        </w:rPr>
+        <w:t>techConfirmed: bare crm / email/mail/gmail kaldırıldı; sadece gerçek tech sinyalleri (disconnected, out of service, wrong number, invalid number, …).</w:t>
+      </w:r>
+    </w:p>
+    <w:p>
+      <w:pPr>
+        <w:pStyle w:val="ListBullet"/>
+      </w:pPr>
+      <w:r>
+        <w:rPr>
+          <w:rFonts w:ascii="Calibri" w:hAnsi="Calibri" w:eastAsia="Calibri"/>
+          <w:b w:val="0"/>
+          <w:sz w:val="22"/>
+        </w:rPr>
+        <w:t>phoneAliveNewest: ring / no answer / voice mail / DVM / unreachable.</w:t>
+      </w:r>
+    </w:p>
+    <w:p>
+      <w:pPr>
+        <w:pStyle w:val="ListBullet"/>
+      </w:pPr>
+      <w:r>
+        <w:rPr>
+          <w:rFonts w:ascii="Calibri" w:hAnsi="Calibri" w:eastAsia="Calibri"/>
+          <w:b w:val="0"/>
+          <w:sz w:val="22"/>
+        </w:rPr>
+        <w:t>Guard: phoneAliveNewest &amp;&amp; !hardWrong → Wrong Number adayı olsa bile No Answer'a düş.</w:t>
+      </w:r>
+    </w:p>
+    <w:p>
+      <w:pPr>
+        <w:pStyle w:val="ListBullet"/>
+      </w:pPr>
+      <w:r>
+        <w:rPr>
+          <w:rFonts w:ascii="Calibri" w:hAnsi="Calibri" w:eastAsia="Calibri"/>
+          <w:b w:val="0"/>
+          <w:sz w:val="22"/>
+        </w:rPr>
+        <w:t>Harness: ACC493190 + Invalid email - CRM (No Answer).</w:t>
       </w:r>
     </w:p>
     <w:sectPr>

</xml_diff>

<commit_message>
fix(verifier): Conflict H — narrow auditor + CA↔NP policy guards
Verifier stays keyword-sense only; deterministic soft/hard money guards
and override blocks stop LLM agree-bias and policy re-litigation.
Harness: verifier_guard_harness 13/13. Live V2 v461.

Co-authored-by: ammartas3-png <ammartas3-png@users.noreply.github.com>
</commit_message>
<xml_diff>
--- a/docs/CRM-Status-Rehberi.docx
+++ b/docs/CRM-Status-Rehberi.docx
@@ -1085,6 +1085,128 @@
           <w:sz w:val="22"/>
         </w:rPr>
         <w:t>Harness: ACC493190 + Invalid email - CRM (No Answer).</w:t>
+      </w:r>
+    </w:p>
+    <w:p>
+      <w:pPr>
+        <w:pStyle w:val="Heading1"/>
+      </w:pPr>
+      <w:r>
+        <w:rPr>
+          <w:rFonts w:ascii="Calibri" w:hAnsi="Calibri" w:eastAsia="Calibri"/>
+          <w:b/>
+          <w:color w:val="1A365D"/>
+          <w:sz w:val="32"/>
+        </w:rPr>
+        <w:t>11. Çelişki H — Verifier dar görev vs geniş beklenti</w:t>
+      </w:r>
+    </w:p>
+    <w:p>
+      <w:r>
+        <w:rPr>
+          <w:rFonts w:ascii="Calibri" w:hAnsi="Calibri" w:eastAsia="Calibri"/>
+          <w:b w:val="0"/>
+          <w:sz w:val="22"/>
+        </w:rPr>
+        <w:t>Kural: Verifier yalnızca eşleşen keyword’ün cümle içinde doğru anlamda olup olmadığını denetler. Soft money vs hard money / Call Again vs No Potential politika savaşını yeniden tartmaz.</w:t>
+      </w:r>
+    </w:p>
+    <w:p>
+      <w:r>
+        <w:rPr>
+          <w:rFonts w:ascii="Calibri" w:hAnsi="Calibri" w:eastAsia="Calibri"/>
+          <w:b w:val="0"/>
+          <w:sz w:val="22"/>
+        </w:rPr>
+        <w:t>Risk:</w:t>
+      </w:r>
+    </w:p>
+    <w:p>
+      <w:pPr>
+        <w:pStyle w:val="ListBullet"/>
+      </w:pPr>
+      <w:r>
+        <w:rPr>
+          <w:rFonts w:ascii="Calibri" w:hAnsi="Calibri" w:eastAsia="Calibri"/>
+          <w:b w:val="0"/>
+          <w:sz w:val="22"/>
+        </w:rPr>
+        <w:t>LLM agree bias: false CA (next month, hard money) üzerinde agree kalabilir.</w:t>
+      </w:r>
+    </w:p>
+    <w:p>
+      <w:pPr>
+        <w:pStyle w:val="ListBullet"/>
+      </w:pPr>
+      <w:r>
+        <w:rPr>
+          <w:rFonts w:ascii="Calibri" w:hAnsi="Calibri" w:eastAsia="Calibri"/>
+          <w:b w:val="0"/>
+          <w:sz w:val="22"/>
+        </w:rPr>
+        <w:t>LLM overreach: soft money CA’yi No Potential’a çevirebilir.</w:t>
+      </w:r>
+    </w:p>
+    <w:p>
+      <w:r>
+        <w:rPr>
+          <w:rFonts w:ascii="Calibri" w:hAnsi="Calibri" w:eastAsia="Calibri"/>
+          <w:b w:val="0"/>
+          <w:sz w:val="22"/>
+        </w:rPr>
+        <w:t>Fix:</w:t>
+      </w:r>
+    </w:p>
+    <w:p>
+      <w:pPr>
+        <w:pStyle w:val="ListBullet"/>
+      </w:pPr>
+      <w:r>
+        <w:rPr>
+          <w:rFonts w:ascii="Calibri" w:hAnsi="Calibri" w:eastAsia="Calibri"/>
+          <w:b w:val="0"/>
+          <w:sz w:val="22"/>
+        </w:rPr>
+        <w:t>Prompt: “NOT a second status engine”; soft money + salary/arrange → AGREE if keyword not negated.</w:t>
+      </w:r>
+    </w:p>
+    <w:p>
+      <w:pPr>
+        <w:pStyle w:val="ListBullet"/>
+      </w:pPr>
+      <w:r>
+        <w:rPr>
+          <w:rFonts w:ascii="Calibri" w:hAnsi="Calibri" w:eastAsia="Calibri"/>
+          <w:b w:val="0"/>
+          <w:sz w:val="22"/>
+        </w:rPr>
+        <w:t>Deterministic guards: next_month, hard_money_dead, soft_money_protect, negated/DIY/CB REJS.</w:t>
+      </w:r>
+    </w:p>
+    <w:p>
+      <w:pPr>
+        <w:pStyle w:val="ListBullet"/>
+      </w:pPr>
+      <w:r>
+        <w:rPr>
+          <w:rFonts w:ascii="Calibri" w:hAnsi="Calibri" w:eastAsia="Calibri"/>
+          <w:b w:val="0"/>
+          <w:sz w:val="22"/>
+        </w:rPr>
+        <w:t>Override block: blocked_soft_money_protect / blocked_hard_money_protect / blocked_false_callback_protect.</w:t>
+      </w:r>
+    </w:p>
+    <w:p>
+      <w:pPr>
+        <w:pStyle w:val="ListBullet"/>
+      </w:pPr>
+      <w:r>
+        <w:rPr>
+          <w:rFonts w:ascii="Calibri" w:hAnsi="Calibri" w:eastAsia="Calibri"/>
+          <w:b w:val="0"/>
+          <w:sz w:val="22"/>
+        </w:rPr>
+        <w:t>Harness: scripts/verifier_guard_harness.js (13 cases).</w:t>
       </w:r>
     </w:p>
     <w:sectPr>

</xml_diff>

<commit_message>
fix(sheet): Conflict I — fill when_not_to_use + MM [skip:] honor
Empty/weak Sheet avoid text filled with machine tags (negation, soft
money, identity vs language, agent cb, phone alive). Memory Match
sheetAvoidBlocks suppresses tagged rows so policy is not the only
source. CSV for live Google Sheet paste; doc §12; live V2 v463.

Co-authored-by: ammartas3-png <ammartas3-png@users.noreply.github.com>
</commit_message>
<xml_diff>
--- a/docs/CRM-Status-Rehberi.docx
+++ b/docs/CRM-Status-Rehberi.docx
@@ -1207,6 +1207,118 @@
           <w:sz w:val="22"/>
         </w:rPr>
         <w:t>Harness: scripts/verifier_guard_harness.js (13 cases).</w:t>
+      </w:r>
+    </w:p>
+    <w:p>
+      <w:pPr>
+        <w:pStyle w:val="Heading1"/>
+      </w:pPr>
+      <w:r>
+        <w:rPr>
+          <w:rFonts w:ascii="Calibri" w:hAnsi="Calibri" w:eastAsia="Calibri"/>
+          <w:b/>
+          <w:color w:val="1A365D"/>
+          <w:sz w:val="32"/>
+        </w:rPr>
+        <w:t>12. Çelişki I — Sheet when_not_to_use boşluğu</w:t>
+      </w:r>
+    </w:p>
+    <w:p>
+      <w:r>
+        <w:rPr>
+          <w:rFonts w:ascii="Calibri" w:hAnsi="Calibri" w:eastAsia="Calibri"/>
+          <w:b w:val="0"/>
+          <w:sz w:val="22"/>
+        </w:rPr>
+        <w:t>Sorun: Çoğu satırda when_not_to_use boş veya jenerik; negation / soft money / identity vs language Sheet’te yoktu. Motor+prompt telafi ediyordu → çift kaynaklı karmaşa.</w:t>
+      </w:r>
+    </w:p>
+    <w:p>
+      <w:r>
+        <w:rPr>
+          <w:rFonts w:ascii="Calibri" w:hAnsi="Calibri" w:eastAsia="Calibri"/>
+          <w:b/>
+          <w:sz w:val="22"/>
+        </w:rPr>
+        <w:t>Fix:</w:t>
+      </w:r>
+    </w:p>
+    <w:p>
+      <w:pPr>
+        <w:pStyle w:val="ListBullet"/>
+      </w:pPr>
+      <w:r>
+        <w:rPr>
+          <w:rFonts w:ascii="Calibri" w:hAnsi="Calibri" w:eastAsia="Calibri"/>
+          <w:b w:val="0"/>
+          <w:sz w:val="22"/>
+        </w:rPr>
+        <w:t>evals/rules_sheet.json: boş/zayıf avoid dolduruldu; [skip:negation|soft_money_plan|hard_money_dead|next_month_as_ca|identity_denial|language_only|bare_didnt_register|agent_cb|phone_alive] etiketleri.</w:t>
+      </w:r>
+    </w:p>
+    <w:p>
+      <w:pPr>
+        <w:pStyle w:val="ListBullet"/>
+      </w:pPr>
+      <w:r>
+        <w:rPr>
+          <w:rFonts w:ascii="Calibri" w:hAnsi="Calibri" w:eastAsia="Calibri"/>
+          <w:b w:val="0"/>
+          <w:sz w:val="22"/>
+        </w:rPr>
+        <w:t>Memory Match sheetAvoidBlocks(): Sheet satırı match olsa bile [skip:] koşulu varsa satır bastırılır (policy tek kaynak olmaktan çıkar).</w:t>
+      </w:r>
+    </w:p>
+    <w:p>
+      <w:pPr>
+        <w:pStyle w:val="ListBullet"/>
+      </w:pPr>
+      <w:r>
+        <w:rPr>
+          <w:rFonts w:ascii="Calibri" w:hAnsi="Calibri" w:eastAsia="Calibri"/>
+          <w:b w:val="0"/>
+          <w:sz w:val="22"/>
+        </w:rPr>
+        <w:t>Build Verify Batches: when_not_to_use snippet 160 karaktere çıkarıldı (etiketler Verifier’a ulaşır).</w:t>
+      </w:r>
+    </w:p>
+    <w:p>
+      <w:pPr>
+        <w:pStyle w:val="ListBullet"/>
+      </w:pPr>
+      <w:r>
+        <w:rPr>
+          <w:rFonts w:ascii="Calibri" w:hAnsi="Calibri" w:eastAsia="Calibri"/>
+          <w:b w:val="0"/>
+          <w:sz w:val="22"/>
+        </w:rPr>
+        <w:t>Canlı Google Sheet: evals/when_not_to_use_conflict_i.csv satırlarını CRM_AI_Rules when_not_to_use kolonuna yapıştır.</w:t>
+      </w:r>
+    </w:p>
+    <w:p>
+      <w:pPr>
+        <w:pStyle w:val="ListBullet"/>
+      </w:pPr>
+      <w:r>
+        <w:rPr>
+          <w:rFonts w:ascii="Calibri" w:hAnsi="Calibri" w:eastAsia="Calibri"/>
+          <w:b w:val="0"/>
+          <w:sz w:val="22"/>
+        </w:rPr>
+        <w:t>Script: python3 scripts/fill_when_not_to_use.py</w:t>
+      </w:r>
+    </w:p>
+    <w:p>
+      <w:pPr>
+        <w:pStyle w:val="ListBullet"/>
+      </w:pPr>
+      <w:r>
+        <w:rPr>
+          <w:rFonts w:ascii="Calibri" w:hAnsi="Calibri" w:eastAsia="Calibri"/>
+          <w:b w:val="0"/>
+          <w:sz w:val="22"/>
+        </w:rPr>
+        <w:t>Harness: ACC-I-LANG-ID / ACC-I-SOFT-NP / ACC-I-NEXT-CA</w:t>
       </w:r>
     </w:p>
     <w:sectPr>

</xml_diff>

<commit_message>
fix(verifier): Conflict J — fragile skipAI Correct never quota-dropped
All Wrong already entered Verifier; now fragile skipAI Correct
(money/callback/identity) is also uncapped. Plain Correct stays at
MAX_OTHER=80. Smart Trace FragileSkipAI flag + quota harness.
Live V2 v464+.

Co-authored-by: ammartas3-png <ammartas3-png@users.noreply.github.com>
</commit_message>
<xml_diff>
--- a/docs/CRM-Status-Rehberi.docx
+++ b/docs/CRM-Status-Rehberi.docx
@@ -1319,6 +1319,125 @@
           <w:sz w:val="22"/>
         </w:rPr>
         <w:t>Harness: ACC-I-LANG-ID / ACC-I-SOFT-NP / ACC-I-NEXT-CA</w:t>
+      </w:r>
+    </w:p>
+    <w:p>
+      <w:pPr>
+        <w:pStyle w:val="Heading1"/>
+      </w:pPr>
+      <w:r>
+        <w:rPr>
+          <w:rFonts w:ascii="Calibri" w:hAnsi="Calibri" w:eastAsia="Calibri"/>
+          <w:b/>
+          <w:color w:val="1A365D"/>
+          <w:sz w:val="32"/>
+        </w:rPr>
+        <w:t>13. Çelişki J — skipAI + eski Verifier kotası</w:t>
+      </w:r>
+    </w:p>
+    <w:p>
+      <w:r>
+        <w:rPr>
+          <w:rFonts w:ascii="Calibri" w:hAnsi="Calibri" w:eastAsia="Calibri"/>
+          <w:b w:val="0"/>
+          <w:sz w:val="22"/>
+        </w:rPr>
+        <w:t>Kural: Policy/Sheet hit → skipAI=true → AI Agent çalışmaz. Doğru sonuç önce Memory Match kalitesine bağlı.</w:t>
+      </w:r>
+    </w:p>
+    <w:p>
+      <w:r>
+        <w:rPr>
+          <w:rFonts w:ascii="Calibri" w:hAnsi="Calibri" w:eastAsia="Calibri"/>
+          <w:b w:val="0"/>
+          <w:sz w:val="22"/>
+        </w:rPr>
+        <w:t>Eski risk: Verifier MAX kotası Wrong no_money satırlarını dışarıda bırakabiliyordu (düzeltildi: tüm Wrong girer).</w:t>
+      </w:r>
+    </w:p>
+    <w:p>
+      <w:r>
+        <w:rPr>
+          <w:rFonts w:ascii="Calibri" w:hAnsi="Calibri" w:eastAsia="Calibri"/>
+          <w:b w:val="0"/>
+          <w:sz w:val="22"/>
+        </w:rPr>
+        <w:t>Kalan risk: Correct ama kırılgan skipAI (money/callback/identity) de kotada düşebilirdi.</w:t>
+      </w:r>
+    </w:p>
+    <w:p>
+      <w:r>
+        <w:rPr>
+          <w:rFonts w:ascii="Calibri" w:hAnsi="Calibri" w:eastAsia="Calibri"/>
+          <w:b/>
+          <w:sz w:val="22"/>
+        </w:rPr>
+        <w:t>Fix:</w:t>
+      </w:r>
+    </w:p>
+    <w:p>
+      <w:pPr>
+        <w:pStyle w:val="ListBullet"/>
+      </w:pPr>
+      <w:r>
+        <w:rPr>
+          <w:rFonts w:ascii="Calibri" w:hAnsi="Calibri" w:eastAsia="Calibri"/>
+          <w:b w:val="0"/>
+          <w:sz w:val="22"/>
+        </w:rPr>
+        <w:t>Build Verify Batches: ALL Wrong + ALL fragile skipAI Correct (money/callback/next_month/identity/DIY/CB REJS/phone_alive) uncapped.</w:t>
+      </w:r>
+    </w:p>
+    <w:p>
+      <w:pPr>
+        <w:pStyle w:val="ListBullet"/>
+      </w:pPr>
+      <w:r>
+        <w:rPr>
+          <w:rFonts w:ascii="Calibri" w:hAnsi="Calibri" w:eastAsia="Calibri"/>
+          <w:b w:val="0"/>
+          <w:sz w:val="22"/>
+        </w:rPr>
+        <w:t>Non-fragile Correct/Manual hâlâ MAX_OTHER=80.</w:t>
+      </w:r>
+    </w:p>
+    <w:p>
+      <w:pPr>
+        <w:pStyle w:val="ListBullet"/>
+      </w:pPr>
+      <w:r>
+        <w:rPr>
+          <w:rFonts w:ascii="Calibri" w:hAnsi="Calibri" w:eastAsia="Calibri"/>
+          <w:b w:val="0"/>
+          <w:sz w:val="22"/>
+        </w:rPr>
+        <w:t>priorityScore: fragile +40.</w:t>
+      </w:r>
+    </w:p>
+    <w:p>
+      <w:pPr>
+        <w:pStyle w:val="ListBullet"/>
+      </w:pPr>
+      <w:r>
+        <w:rPr>
+          <w:rFonts w:ascii="Calibri" w:hAnsi="Calibri" w:eastAsia="Calibri"/>
+          <w:b w:val="0"/>
+          <w:sz w:val="22"/>
+        </w:rPr>
+        <w:t>Harness: scripts/verifier_quota_harness.js</w:t>
+      </w:r>
+    </w:p>
+    <w:p>
+      <w:pPr>
+        <w:pStyle w:val="ListBullet"/>
+      </w:pPr>
+      <w:r>
+        <w:rPr>
+          <w:rFonts w:ascii="Calibri" w:hAnsi="Calibri" w:eastAsia="Calibri"/>
+          <w:b w:val="0"/>
+          <w:sz w:val="22"/>
+        </w:rPr>
+        <w:t>AI Agent yeniden açılmaz — ikinci bakış Verifier + deterministic guards (Conflict H).</w:t>
       </w:r>
     </w:p>
     <w:sectPr>

</xml_diff>

<commit_message>
docs: rewrite CRM status guide as operator training handbook
Replace conflict-log style doc with a practical “ne olunca hangi
status” eğitim kılavuzu: priority tree, status dictionary, confusion
pairs, agent-note rule, pocket card, scenarios. DOCX + Markdown.

Co-authored-by: ammartas3-png <ammartas3-png@users.noreply.github.com>
</commit_message>
<xml_diff>
--- a/docs/CRM-Status-Rehberi.docx
+++ b/docs/CRM-Status-Rehberi.docx
@@ -4,952 +4,242 @@
   <w:body>
     <w:p>
       <w:pPr>
-        <w:pStyle w:val="Heading1"/>
+        <w:jc w:val="center"/>
       </w:pPr>
       <w:r>
-        <w:t>CRM Status Rehberi</w:t>
+        <w:rPr>
+          <w:rFonts w:ascii="Calibri" w:hAnsi="Calibri" w:eastAsia="Calibri"/>
+          <w:b/>
+          <w:i w:val="0"/>
+          <w:color w:val="1A365D"/>
+          <w:sz w:val="44"/>
+        </w:rPr>
+        <w:t>CRM Status Eğitim Kılavuzu</w:t>
       </w:r>
     </w:p>
     <w:p>
+      <w:pPr>
+        <w:jc w:val="center"/>
+      </w:pPr>
       <w:r>
-        <w:t>Bu belge Google Sheet kuralları, Memory Match politikaları, AI Agent / Verifier prompt’ları ve 2026-09 Wrong inceleme düzeltmelerinden derlenmiştir. Amaç: her status’ün ne zaman kullanılacağını sade anlatımla sabitlemek ve çakışmaları görünür kılmak.</w:t>
+        <w:rPr>
+          <w:rFonts w:ascii="Calibri" w:hAnsi="Calibri" w:eastAsia="Calibri"/>
+          <w:b w:val="0"/>
+          <w:i/>
+          <w:color w:val="2C5282"/>
+          <w:sz w:val="26"/>
+        </w:rPr>
+        <w:t>Ne olunca hangi status? — Agent / reviewer el kitabı</w:t>
       </w:r>
     </w:p>
     <w:p>
+      <w:pPr>
+        <w:spacing w:after="120"/>
+      </w:pPr>
       <w:r>
-        <w:t>Kaynaklar: evals/rules_sheet.json (Sheet), n8n Memory Match + AI Agent + Verifier AI, canlı Wrong review (Part 1 / data (1).xlsx).</w:t>
+        <w:rPr>
+          <w:rFonts w:ascii="Calibri" w:hAnsi="Calibri" w:eastAsia="Calibri"/>
+          <w:b w:val="0"/>
+          <w:i w:val="0"/>
+          <w:color w:val="444444"/>
+          <w:sz w:val="22"/>
+        </w:rPr>
+        <w:t>Bu rehber, CRM’e status girerken doğru kararı vermen için yazıldı. Teknik sistem detayı değil; yorum satırını okuyup “bu lead’e ne koyarım?” sorusuna cevap verir.</w:t>
       </w:r>
     </w:p>
     <w:p>
       <w:pPr>
-        <w:pStyle w:val="Heading2"/>
+        <w:spacing w:after="120"/>
       </w:pPr>
       <w:r>
-        <w:t>1. Status sözlüğü (ne için?)</w:t>
+        <w:rPr>
+          <w:rFonts w:ascii="Calibri" w:hAnsi="Calibri" w:eastAsia="Calibri"/>
+          <w:b w:val="0"/>
+          <w:i w:val="0"/>
+          <w:color w:val="444444"/>
+          <w:sz w:val="22"/>
+        </w:rPr>
+        <w:t>Kural: En yeni anlamlı müşteri cümlesine bak. Agent’ın kendi arama notunu (cb:vm, cb na, call again rej) müşteri talebi sanma.</w:t>
       </w:r>
     </w:p>
     <w:p>
       <w:pPr>
-        <w:pStyle w:val="Heading3"/>
+        <w:pStyle w:val="Heading1"/>
       </w:pPr>
       <w:r>
-        <w:t>Call Again</w:t>
+        <w:rPr>
+          <w:rFonts w:ascii="Calibri" w:hAnsi="Calibri" w:eastAsia="Calibri"/>
+          <w:b/>
+          <w:i w:val="0"/>
+          <w:color w:val="1A365D"/>
+          <w:sz w:val="36"/>
+        </w:rPr>
+        <w:t>1. Önce bu sırayla bak (öncelik ağacı)</w:t>
       </w:r>
     </w:p>
     <w:p>
+      <w:pPr>
+        <w:spacing w:after="120"/>
+      </w:pPr>
       <w:r>
-        <w:t>Olumsuz / nihai red yokken müşteri devam niyeti veya net randevu / geri arama verdiyse. Takip edilecek sıcak lead.</w:t>
+        <w:rPr>
+          <w:rFonts w:ascii="Calibri" w:hAnsi="Calibri" w:eastAsia="Calibri"/>
+          <w:b w:val="0"/>
+          <w:i w:val="0"/>
+          <w:color w:val="444444"/>
+          <w:sz w:val="22"/>
+        </w:rPr>
+        <w:t>Aşağıdaki liste yukarıdan aşağıdır. Üstteki durum varsa alttakine bakma.</w:t>
       </w:r>
     </w:p>
     <w:p>
       <w:pPr>
-        <w:pStyle w:val="ListBullet"/>
+        <w:pStyle w:val="ListNumber"/>
+        <w:spacing w:after="40"/>
       </w:pPr>
       <w:r>
-        <w:t>Sheet: call me back, cb, interested, appointment, call later (~205 aktif kural) → genelde Call Again</w:t>
+        <w:rPr>
+          <w:rFonts w:ascii="Calibri" w:hAnsi="Calibri" w:eastAsia="Calibri"/>
+          <w:b w:val="0"/>
+          <w:i w:val="0"/>
+          <w:sz w:val="22"/>
+        </w:rPr>
+        <w:t>Kimlik inkârı var mı? (“ben Ahmad değilim”, “wrong person”, “this is not me”) → Denied Registration</w:t>
       </w:r>
     </w:p>
     <w:p>
       <w:pPr>
-        <w:pStyle w:val="ListBullet"/>
+        <w:pStyle w:val="ListNumber"/>
+        <w:spacing w:after="40"/>
       </w:pPr>
       <w:r>
-        <w:t>MM: callback_in_newest, callback, busy_after_pickup, money_with_funding_plan, no_money_soft_plan_override, np_soft_money_followup</w:t>
+        <w:rPr>
+          <w:rFonts w:ascii="Calibri" w:hAnsi="Calibri" w:eastAsia="Calibri"/>
+          <w:b w:val="0"/>
+          <w:i w:val="0"/>
+          <w:sz w:val="22"/>
+        </w:rPr>
+        <w:t>Dil bariyeri var mı? (Mandarin / Arapça / “hard time to discuss in English”) ve kimlik inkârı YOK → No Language</w:t>
       </w:r>
     </w:p>
     <w:p>
       <w:pPr>
-        <w:pStyle w:val="ListBullet"/>
+        <w:pStyle w:val="ListNumber"/>
+        <w:spacing w:after="40"/>
       </w:pPr>
       <w:r>
-        <w:t>Örnek doğru: “call me at 6pm”, “busy call back later”, “no money till salary day” (soft money + maaş planı)</w:t>
+        <w:rPr>
+          <w:rFonts w:ascii="Calibri" w:hAnsi="Calibri" w:eastAsia="Calibri"/>
+          <w:b w:val="0"/>
+          <w:i w:val="0"/>
+          <w:sz w:val="22"/>
+        </w:rPr>
+        <w:t>18 yaş altı / geçersiz ülke → Under 18 / Invalid Country</w:t>
       </w:r>
     </w:p>
     <w:p>
       <w:pPr>
-        <w:pStyle w:val="ListBullet"/>
+        <w:pStyle w:val="ListNumber"/>
+        <w:spacing w:after="40"/>
       </w:pPr>
       <w:r>
-        <w:t>Örnek yanlış (düzeltildi/ayrılmalı): “next month but not sure” + “does not have the money” → artık No Potential; “i will do it by myself” → callback değil</w:t>
+        <w:rPr>
+          <w:rFonts w:ascii="Calibri" w:hAnsi="Calibri" w:eastAsia="Calibri"/>
+          <w:b w:val="0"/>
+          <w:i w:val="0"/>
+          <w:sz w:val="22"/>
+        </w:rPr>
+        <w:t>Para yok + uzak/belirsiz/çıkış (next month, by October, not serious, discontinue) → No Potential</w:t>
       </w:r>
     </w:p>
     <w:p>
       <w:pPr>
-        <w:pStyle w:val="Heading3"/>
+        <w:pStyle w:val="ListNumber"/>
+        <w:spacing w:after="40"/>
       </w:pPr>
       <w:r>
-        <w:t>Recall</w:t>
+        <w:rPr>
+          <w:rFonts w:ascii="Calibri" w:hAnsi="Calibri" w:eastAsia="Calibri"/>
+          <w:b w:val="0"/>
+          <w:i w:val="0"/>
+          <w:sz w:val="22"/>
+        </w:rPr>
+        <w:t>Para yok AMA yakın plan (maaş yakında, arrange funds, arkadaştan yardım) → Call Again</w:t>
       </w:r>
     </w:p>
     <w:p>
+      <w:pPr>
+        <w:pStyle w:val="ListNumber"/>
+        <w:spacing w:after="40"/>
+      </w:pPr>
       <w:r>
-        <w:t>Yumuşak red, erteleme, güvensizlik veya konuşma kapanışı var ama henüz kalıcı No Interest değil. “Şimdilik istemiyor / erteledi / noncoop”.</w:t>
-      </w:r>
-    </w:p>
-    <w:p>
-      <w:pPr>
-        <w:pStyle w:val="ListBullet"/>
-      </w:pPr>
-      <w:r>
-        <w:t>Sheet: not interested (tek gün), refuse, hangup after pitch, defer (~142 kural)</w:t>
-      </w:r>
-    </w:p>
-    <w:p>
-      <w:pPr>
-        <w:pStyle w:val="ListBullet"/>
-      </w:pPr>
-      <w:r>
-        <w:t>MM: refusal / refusal_in_newest, defer, noncoop_in_newest, third_party (sadece hesap sahibi/kayıt başkasınınsa), recall_kept_after_hangup</w:t>
-      </w:r>
-    </w:p>
-    <w:p>
-      <w:pPr>
-        <w:pStyle w:val="ListBullet"/>
-      </w:pPr>
-      <w:r>
-        <w:t>Örnek doğru: “not interested” (tek gün), “dont need your help”, duymuyor gibi yapıp kapatma (ACC90015)</w:t>
-      </w:r>
-    </w:p>
-    <w:p>
-      <w:pPr>
-        <w:pStyle w:val="ListBullet"/>
-      </w:pPr>
-      <w:r>
-        <w:t>Örnek yanlış: his son çeviri yardımı / kızına kart foto için arama → third_party olmamalı</w:t>
-      </w:r>
-    </w:p>
-    <w:p>
-      <w:pPr>
-        <w:pStyle w:val="Heading3"/>
-      </w:pPr>
-      <w:r>
-        <w:t>No Interest</w:t>
-      </w:r>
-    </w:p>
-    <w:p>
-      <w:r>
-        <w:t>Kalıcı ilgisizlik. İki yol (iş kuralı, review’da netleşti):</w:t>
-      </w:r>
-    </w:p>
-    <w:p>
-      <w:pPr>
-        <w:pStyle w:val="ListBullet"/>
-      </w:pPr>
-      <w:r>
-        <w:t>1) Red / not interested ifadesi iki farklı günde geçiyorsa → No Interest</w:t>
-      </w:r>
-    </w:p>
-    <w:p>
-      <w:pPr>
-        <w:pStyle w:val="ListBullet"/>
-      </w:pPr>
-      <w:r>
-        <w:t>2) Recall iken 3 farklı günde cevap yok (NA) → No Interest (policy:refusal_2_days / recall_3na_after)</w:t>
-      </w:r>
-    </w:p>
-    <w:p>
-      <w:pPr>
-        <w:pStyle w:val="ListBullet"/>
-      </w:pPr>
-      <w:r>
-        <w:t>Sheet’te az kural (4); asıl güç MM politika + CRM agent etiketi</w:t>
-      </w:r>
-    </w:p>
-    <w:p>
-      <w:pPr>
-        <w:pStyle w:val="ListBullet"/>
-      </w:pPr>
-      <w:r>
-        <w:t>Örnek: ACC37244 — iki gün red + delete it → CRM No Interest doğru; motor Recall dememeli</w:t>
-      </w:r>
-    </w:p>
-    <w:p>
-      <w:pPr>
-        <w:pStyle w:val="Heading3"/>
-      </w:pPr>
-      <w:r>
-        <w:t>No Potential</w:t>
-      </w:r>
-    </w:p>
-    <w:p>
-      <w:r>
-        <w:t>Yatırım / ödeme kapasitesi yok veya süreç ölü. Hard money, uzun/belirsiz timing, evraksız engel.</w:t>
-      </w:r>
-    </w:p>
-    <w:p>
-      <w:pPr>
-        <w:pStyle w:val="ListBullet"/>
-      </w:pPr>
-      <w:r>
-        <w:t>Sheet: no money, no funds, no potential (~43)</w:t>
-      </w:r>
-    </w:p>
-    <w:p>
-      <w:pPr>
-        <w:pStyle w:val="ListBullet"/>
-      </w:pPr>
-      <w:r>
-        <w:t>MM: no_money, money_quit, next_month_no_potential, phone_unreachable_email_only, keep_np_no_docs</w:t>
-      </w:r>
-    </w:p>
-    <w:p>
-      <w:pPr>
-        <w:pStyle w:val="ListBullet"/>
-      </w:pPr>
-      <w:r>
-        <w:t>Düzeltme: “next month” artık Call Again değil → No Potential (özellikle money / not sure ile)</w:t>
-      </w:r>
-    </w:p>
-    <w:p>
-      <w:pPr>
-        <w:pStyle w:val="ListBullet"/>
-      </w:pPr>
-      <w:r>
-        <w:t>Örnek doğru: “does not have the money … next month but not sure” (ACC493024)</w:t>
-      </w:r>
-    </w:p>
-    <w:p>
-      <w:pPr>
-        <w:pStyle w:val="ListBullet"/>
-      </w:pPr>
-      <w:r>
-        <w:t>Örnek yanlış: “no money till the salary day” / “call on 10th with salary” → soft money = Call Again (ACC89966 / ACC89974)</w:t>
-      </w:r>
-    </w:p>
-    <w:p>
-      <w:pPr>
-        <w:pStyle w:val="Heading3"/>
-      </w:pPr>
-      <w:r>
-        <w:t>No Potential - no documents</w:t>
-      </w:r>
-    </w:p>
-    <w:p>
-      <w:r>
-        <w:t>Potansiyel değil çünkü kimlik / banka / evrak yok. Genel No Potential’dan daha spesifik; agent veya sheet “no documents / no id / no bank” diyorsa bu aile korunur (keep_np_no_docs / no_money keep_sheet).</w:t>
-      </w:r>
-    </w:p>
-    <w:p>
-      <w:pPr>
-        <w:pStyle w:val="ListBullet"/>
-      </w:pPr>
-      <w:r>
-        <w:t>Örnek: ACC90019 — no id / no bank acc → CRM No Potential - no documents doğru; “didnt register” tek başına Denied Registration yapmaz</w:t>
-      </w:r>
-    </w:p>
-    <w:p>
-      <w:pPr>
-        <w:pStyle w:val="Heading3"/>
-      </w:pPr>
-      <w:r>
-        <w:t>No Answer 1-5</w:t>
-      </w:r>
-    </w:p>
-    <w:p>
-      <w:r>
-        <w:t>Telefon çalışıyor ama cevap yok / VM / dialer (na, vm, dvm, ring, ndt). 1–5 deneme bandı.</w:t>
-      </w:r>
-    </w:p>
-    <w:p>
-      <w:pPr>
-        <w:pStyle w:val="ListBullet"/>
-      </w:pPr>
-      <w:r>
-        <w:t>Sheet: na, vm, dvm, ringing (~160)</w:t>
-      </w:r>
-    </w:p>
-    <w:p>
-      <w:pPr>
-        <w:pStyle w:val="ListBullet"/>
-      </w:pPr>
-      <w:r>
-        <w:t>MM: crm_no_answer_kept (newest dialer-only), no_real_conversation</w:t>
-      </w:r>
-    </w:p>
-    <w:p>
-      <w:pPr>
-        <w:pStyle w:val="ListBullet"/>
-      </w:pPr>
-      <w:r>
-        <w:t>İş kuralı: Invalid email olsa bile telefon ring/NA ise Wrong Number’a çekme — NA kalır (ACC493190)</w:t>
-      </w:r>
-    </w:p>
-    <w:p>
-      <w:pPr>
-        <w:pStyle w:val="Heading3"/>
-      </w:pPr>
-      <w:r>
-        <w:t>No Answer 5 UP</w:t>
-      </w:r>
-    </w:p>
-    <w:p>
-      <w:r>
-        <w:t>5+ ayrı günde cevap yok / uzun NA streak. Mekanik yükseltme (no_answer_5_distinct_days / call_again_5na_days aileleri).</w:t>
-      </w:r>
-    </w:p>
-    <w:p>
-      <w:pPr>
-        <w:pStyle w:val="Heading3"/>
-      </w:pPr>
-      <w:r>
-        <w:t>No Language</w:t>
-      </w:r>
-    </w:p>
-    <w:p>
-      <w:r>
-        <w:t>Görüşme dili tutmuyor; müşteri MY/EN’de ilerleyemiyor, başka dilde fluent, translator lazım.</w:t>
-      </w:r>
-    </w:p>
-    <w:p>
-      <w:pPr>
-        <w:pStyle w:val="ListBullet"/>
-      </w:pPr>
-      <w:r>
-        <w:t>Sheet + MM language_barrier_stated; LANG_RE: no english, fluent in mandarin, hard time to discuss, …</w:t>
-      </w:r>
-    </w:p>
-    <w:p>
-      <w:pPr>
-        <w:pStyle w:val="ListBullet"/>
-      </w:pPr>
-      <w:r>
-        <w:t>Örnek doğru: ACC492878 — Mandarin + hard time MY/EN; oğul çeviri yardımı third_party değil</w:t>
-      </w:r>
-    </w:p>
-    <w:p>
-      <w:pPr>
-        <w:pStyle w:val="ListBullet"/>
-      </w:pPr>
-      <w:r>
-        <w:t>Örnek yanlış: “speak arabic” tek başına, asıl cümle “im not ahmad” ise Denied Registration (ACC90025)</w:t>
-      </w:r>
-    </w:p>
-    <w:p>
-      <w:pPr>
-        <w:pStyle w:val="Heading3"/>
-      </w:pPr>
-      <w:r>
-        <w:t>Denied Registration</w:t>
-      </w:r>
-    </w:p>
-    <w:p>
-      <w:r>
-        <w:t>Kimlik reddi: “o kişi değilim”, isim doğrulanmıyor, kayıt başkasının numarasına yapılmış olabilir — ama sadece “kayıt olmadım / didnt register” yetmez.</w:t>
-      </w:r>
-    </w:p>
-    <w:p>
-      <w:pPr>
-        <w:pStyle w:val="ListBullet"/>
-      </w:pPr>
-      <w:r>
-        <w:t>MM: denied_registration(1x) — şu an hâlâ “didnt register” ile agresif; iş kuralına göre sıkılaştırılmalı</w:t>
-      </w:r>
-    </w:p>
-    <w:p>
-      <w:pPr>
-        <w:pStyle w:val="ListBullet"/>
-      </w:pPr>
-      <w:r>
-        <w:t>Doğru: “im not ahmad” (ACC90025 CRM)</w:t>
-      </w:r>
-    </w:p>
-    <w:p>
-      <w:pPr>
-        <w:pStyle w:val="ListBullet"/>
-      </w:pPr>
-      <w:r>
-        <w:t>Yanlış: “said i didnt register” tek satır (ACC90028) → Recall kalmalı</w:t>
-      </w:r>
-    </w:p>
-    <w:p>
-      <w:pPr>
-        <w:pStyle w:val="Heading3"/>
-      </w:pPr>
-      <w:r>
-        <w:t>Wrong Number or Email</w:t>
-      </w:r>
-    </w:p>
-    <w:p>
-      <w:r>
-        <w:t>Numara/email gerçekten yanlış veya ulaşılamaz kimlik. Telefon çalışıyorsa (NA/ring) invalid email tek başına yetmez.</w:t>
-      </w:r>
-    </w:p>
-    <w:p>
-      <w:pPr>
-        <w:pStyle w:val="ListBullet"/>
-      </w:pPr>
-      <w:r>
-        <w:t>MM: wrong_number, fake_registration</w:t>
-      </w:r>
-    </w:p>
-    <w:p>
-      <w:pPr>
-        <w:pStyle w:val="ListBullet"/>
-      </w:pPr>
-      <w:r>
-        <w:t>Düzeltme kuralı: invalid email + çalışan telefon → No Answer; Wrong Number değil (ACC493190)</w:t>
-      </w:r>
-    </w:p>
-    <w:p>
-      <w:pPr>
-        <w:pStyle w:val="Heading3"/>
-      </w:pPr>
-      <w:r>
-        <w:t>Under 18 / Invalid Country</w:t>
-      </w:r>
-    </w:p>
-    <w:p>
-      <w:r>
-        <w:t>Yaş &lt;18 veya ülke/geçersiz market. Deterministik politikalar (under_18, invalid_country sheet/MM).</w:t>
-      </w:r>
-    </w:p>
-    <w:p>
-      <w:pPr>
-        <w:pStyle w:val="Heading3"/>
-      </w:pPr>
-      <w:r>
-        <w:t>Manual Check / Decline / Duplicate / DNC</w:t>
-      </w:r>
-    </w:p>
-    <w:p>
-      <w:r>
-        <w:t>Ambiguous karışık intent (mixed_intent_manual), operasyonel decline, mükerrer, do-not-call. AI yetersiz yorumda Manual Check önerebilir.</w:t>
-      </w:r>
-    </w:p>
-    <w:p>
-      <w:pPr>
-        <w:pStyle w:val="Heading2"/>
-      </w:pPr>
-      <w:r>
-        <w:t>2. Katmanlar nasıl karar veriyor?</w:t>
-      </w:r>
-    </w:p>
-    <w:p>
-      <w:pPr>
-        <w:pStyle w:val="Heading3"/>
-      </w:pPr>
-      <w:r>
-        <w:t>Google Sheet</w:t>
-      </w:r>
-    </w:p>
-    <w:p>
-      <w:r>
-        <w:t>Trigger phrase → suggested_status. Yüksek hacim Call Again / NA / Recall. when_to_use / when_not_to_use çoğu satırda zayıf veya boş; bu yüzden false positive riski yüksek (ör. interested içinde “not interested”).</w:t>
-      </w:r>
-    </w:p>
-    <w:p>
-      <w:pPr>
-        <w:pStyle w:val="Heading3"/>
-      </w:pPr>
-      <w:r>
-        <w:t>Memory Match (0-token motor)</w:t>
-      </w:r>
-    </w:p>
-    <w:p>
-      <w:r>
-        <w:t>Sheet + politika ağacı. skipAI=true ile AI Agent’ı bypass eder. Öncelik örnekleri: refusal günleri, money vs callback, next_month_no_potential, soft money override, third_party owner vs help, language barrier.</w:t>
-      </w:r>
-    </w:p>
-    <w:p>
-      <w:pPr>
-        <w:pStyle w:val="Heading3"/>
-      </w:pPr>
-      <w:r>
-        <w:t>AI Agent</w:t>
-      </w:r>
-    </w:p>
-    <w:p>
-      <w:r>
-        <w:t>Sadece skipAI=false (belirsiz) lead’ler. Prompt’ta money/callback/refusal ağacı ve ALLOWED status listesi var. Maliyet için batch.</w:t>
-      </w:r>
-    </w:p>
-    <w:p>
-      <w:pPr>
-        <w:pStyle w:val="Heading3"/>
-      </w:pPr>
-      <w:r>
-        <w:t>Appointment AI</w:t>
-      </w:r>
-    </w:p>
-    <w:p>
-      <w:r>
-        <w:t>Gerçek CB/randevu intent’i olanlara Call Again / when-to-call zenginliği. Regex false positive’leri düzeltebilir.</w:t>
-      </w:r>
-    </w:p>
-    <w:p>
-      <w:pPr>
-        <w:pStyle w:val="Heading3"/>
-      </w:pPr>
-      <w:r>
-        <w:t>Verifier AI (Match Context Auditor)</w:t>
-      </w:r>
-    </w:p>
-    <w:p>
-      <w:r>
-        <w:t>Görevi yeniden sınıflandırmak değil: motor keyword’ünü bulup FULL SENTENCE before+[kw]+after ile agree/disagree.</w:t>
-      </w:r>
-    </w:p>
-    <w:p>
-      <w:pPr>
-        <w:pStyle w:val="ListBullet"/>
-      </w:pPr>
-      <w:r>
-        <w:t>agree → status değişmez</w:t>
-      </w:r>
-    </w:p>
-    <w:p>
-      <w:pPr>
-        <w:pStyle w:val="ListBullet"/>
-      </w:pPr>
-      <w:r>
-        <w:t>disagree → correct_status ile override</w:t>
-      </w:r>
-    </w:p>
-    <w:p>
-      <w:pPr>
-        <w:pStyle w:val="ListBullet"/>
-      </w:pPr>
-      <w:r>
-        <w:t>Düzeltme: belirsizlikte agree yok; next month + money → No Potential; Apply’da deterministic next-month zincir koruması</w:t>
-      </w:r>
-    </w:p>
-    <w:p>
-      <w:pPr>
-        <w:pStyle w:val="ListBullet"/>
-      </w:pPr>
-      <w:r>
-        <w:t>Düzeltme: TÜM Wrong satırlar Verifier’a girer (eski MAX 120 kotası Wrong’ları düşürüyordu)</w:t>
-      </w:r>
-    </w:p>
-    <w:p>
-      <w:pPr>
-        <w:pStyle w:val="Heading2"/>
-      </w:pPr>
-      <w:r>
-        <w:t>3. Bu turda eklenen / sıkılaştırılan iş kuralları</w:t>
-      </w:r>
-    </w:p>
-    <w:p>
-      <w:pPr>
-        <w:pStyle w:val="ListBullet"/>
-      </w:pPr>
-      <w:r>
-        <w:t>next month → No Potential (Call Again değil); does not have the money MONEY_RE’de “the” ile eşleşir</w:t>
-      </w:r>
-    </w:p>
-    <w:p>
-      <w:pPr>
-        <w:pStyle w:val="ListBullet"/>
-      </w:pPr>
-      <w:r>
-        <w:t>Soft money + maaş/plan → Call Again (NP değil) — hâlâ regex kaçırabiliyor: salery typo, “call on 10th with salary”</w:t>
-      </w:r>
-    </w:p>
-    <w:p>
-      <w:pPr>
-        <w:pStyle w:val="ListBullet"/>
-      </w:pPr>
-      <w:r>
-        <w:t>Invalid email + telefon canlı → No Answer (Wrong Number değil)</w:t>
-      </w:r>
-    </w:p>
-    <w:p>
-      <w:pPr>
-        <w:pStyle w:val="ListBullet"/>
-      </w:pPr>
-      <w:r>
-        <w:t>Denied Registration için kimlik inkârı şart; didnt register yetmez</w:t>
-      </w:r>
-    </w:p>
-    <w:p>
-      <w:pPr>
-        <w:pStyle w:val="ListBullet"/>
-      </w:pPr>
-      <w:r>
-        <w:t>No Interest: 2 farklı gün red VEYA Recall sonrası 3 NA günü</w:t>
-      </w:r>
-    </w:p>
-    <w:p>
-      <w:pPr>
-        <w:pStyle w:val="ListBullet"/>
-      </w:pPr>
-      <w:r>
-        <w:t>third_party: hesap/kayıt başkasınınsa Recall; aile yardımı (çeviri/kart) tetiklemez</w:t>
-      </w:r>
-    </w:p>
-    <w:p>
-      <w:pPr>
-        <w:pStyle w:val="ListBullet"/>
-      </w:pPr>
-      <w:r>
-        <w:t>No Language: başka dil / hard time discuss / fluent in …</w:t>
-      </w:r>
-    </w:p>
-    <w:p>
-      <w:pPr>
-        <w:pStyle w:val="ListBullet"/>
-      </w:pPr>
-      <w:r>
-        <w:t>Verifier: before/after zorunlu; tüm Wrong’lar audite girer</w:t>
-      </w:r>
-    </w:p>
-    <w:p>
-      <w:pPr>
-        <w:pStyle w:val="ListBullet"/>
-      </w:pPr>
-      <w:r>
-        <w:t>Quality Layer $env crash fix; Merge1 hang hardening</w:t>
-      </w:r>
-    </w:p>
-    <w:p>
-      <w:pPr>
-        <w:pStyle w:val="Heading2"/>
-      </w:pPr>
-      <w:r>
-        <w:t>4. Çakışmalar, karmaşalar, açık riskler</w:t>
-      </w:r>
-    </w:p>
-    <w:p>
-      <w:pPr>
-        <w:pStyle w:val="Heading3"/>
-      </w:pPr>
-      <w:r>
-        <w:t>A) Soft money vs No Potential</w:t>
-      </w:r>
-    </w:p>
-    <w:p>
-      <w:r>
-        <w:t>Aynı cümlede “no money” + “salary / 10th / till salary” geçince Sheet/MM bazen NP, CRM Call Again diyor (ACC89966, ACC89974). Soft override var ama typo (salery) ve “with salary / on 10th” kalıpları kaçabiliyor. Verifier’a Wrong olarak girdiklerinde düzeltilmeli; MM’nin de salary typo + tarihli CB’yi soft sayması lazım.</w:t>
-      </w:r>
-    </w:p>
-    <w:p>
-      <w:pPr>
-        <w:pStyle w:val="Heading3"/>
-      </w:pPr>
-      <w:r>
-        <w:t>B) next month vs funding plan</w:t>
-      </w:r>
-    </w:p>
-    <w:p>
-      <w:r>
-        <w:t>Artık next month → NP. Ama “salary next month” gibi gerçek maaş planı da NP’ye düşebilir (FUNDING_DEAD / next_month policy). Soft money CA ile çatışma riski sürüyor — “next month + concrete salary weekday” istisnası net yazılmalı.</w:t>
-      </w:r>
-    </w:p>
-    <w:p>
-      <w:pPr>
-        <w:pStyle w:val="Heading3"/>
-      </w:pPr>
-      <w:r>
-        <w:t>C) Call Again vs Recall vs No Interest</w:t>
-      </w:r>
-    </w:p>
-    <w:p>
-      <w:r>
-        <w:t>Tek gün “not interested” → Recall; iki gün → No Interest. Motor hâlâ çoğu refusal’ı Recall’a map’liyor; CRM No Interest ile Wrong üretiyor (ACC37244). Sheet “interested” negasyon içinde false positive (ACC493070 DONT THINK IM INTERESTED).</w:t>
-      </w:r>
-    </w:p>
-    <w:p>
-      <w:pPr>
-        <w:pStyle w:val="Heading3"/>
-      </w:pPr>
-      <w:r>
-        <w:t>D) callback keyword’leri</w:t>
-      </w:r>
-    </w:p>
-    <w:p>
-      <w:r>
-        <w:t>“i will do it”, “cb”, “interested”, “next month” callback ailesinde. DIY red (“i will do it by myself”), CB REJS, negated interested, next month+money hâlâ MM’de CA üretebiliyor; Verifier bazen kurtarıyor bazen agree ile bozuyor.</w:t>
-      </w:r>
-    </w:p>
-    <w:p>
-      <w:pPr>
-        <w:pStyle w:val="Heading3"/>
-      </w:pPr>
-      <w:r>
-        <w:t>E) third_party vs No Language vs Call Again</w:t>
-      </w:r>
-    </w:p>
-    <w:p>
-      <w:r>
-        <w:t>Ayrım yapıldı (owner vs help). Hâlâ gri alan: “his son registered but also helping translate” gibi karışık cümleler. LANG_RE “speak arabic” identity denial cümlesinde No Language’e kaçabilirdi (ACC90025) — identity &gt; language önceliği yazılı olmalı.</w:t>
-      </w:r>
-    </w:p>
-    <w:p>
-      <w:pPr>
-        <w:pStyle w:val="Heading3"/>
-      </w:pPr>
-      <w:r>
-        <w:t>F) Denied Registration vs Recall vs NP-no docs</w:t>
-      </w:r>
-    </w:p>
-    <w:p>
-      <w:r>
-        <w:t>denied_registration(1x) “didnt register” ile erken ateşliyor. İş kuralı kimlik inkârı istiyor. “someone else used my number” + no documents (ACC90019) hem Denied hem NP-no docs adayı — öncelik sırası belirsiz.</w:t>
-      </w:r>
-    </w:p>
-    <w:p>
-      <w:pPr>
-        <w:pStyle w:val="Heading3"/>
-      </w:pPr>
-      <w:r>
-        <w:t>G) Wrong Number vs No Answer</w:t>
-      </w:r>
-    </w:p>
-    <w:p>
-      <w:r>
-        <w:t>Kural netleşti (telefon canlıysa NA) ama MM wrong_number hâlâ “invalid email” eski satırdan ateşleyebilir; newest dialer-only guard eksik kalırsa Wrong üretir (ACC493190).</w:t>
-      </w:r>
-    </w:p>
-    <w:p>
-      <w:pPr>
-        <w:pStyle w:val="Heading3"/>
-      </w:pPr>
-      <w:r>
-        <w:t>H) Verifier dar görev vs geniş beklenti</w:t>
-      </w:r>
-    </w:p>
-    <w:p>
-      <w:r>
-        <w:t>Verifier “keyword sense” auditi; rakip politikayı (no money vs next month) her zaman yeniden tartmıyor. Deterministik guard’lar eklendi ama diğer false CA/NP aileleri için benzer guard yok. LLM agree bias’ı azaltilsa da batch’te hâlâ hata çıkabilir.</w:t>
-      </w:r>
-    </w:p>
-    <w:p>
-      <w:pPr>
-        <w:pStyle w:val="Heading3"/>
-      </w:pPr>
-      <w:r>
-        <w:t>I) Sheet when_not_to_use boşluğu</w:t>
-      </w:r>
-    </w:p>
-    <w:p>
-      <w:r>
-        <w:t>Çoğu satırda when_not_to_use boş. Negasyon, soft money, identity vs language ayrımı Sheet’te yok; motor/prompt telafi etmeye çalışıyor → çift kaynaklı karmaşa.</w:t>
-      </w:r>
-    </w:p>
-    <w:p>
-      <w:pPr>
-        <w:pStyle w:val="Heading3"/>
-      </w:pPr>
-      <w:r>
-        <w:t>J) skipAI + eski kota</w:t>
-      </w:r>
-    </w:p>
-    <w:p>
-      <w:r>
-        <w:t>Policy hit → AI Agent yok. Eski Verifier kotası Wrong no_money’leri dışarıda bırakıyordu (düzeltildi: tüm Wrong girer). Doğru sınıflandırma hâlâ önce MM kalitesine bağlı.</w:t>
-      </w:r>
-    </w:p>
-    <w:p>
-      <w:pPr>
-        <w:pStyle w:val="Heading2"/>
-      </w:pPr>
-      <w:r>
-        <w:t>5. Pratik karar özeti (tek bakış)</w:t>
-      </w:r>
-    </w:p>
-    <w:p>
-      <w:pPr>
-        <w:pStyle w:val="ListBullet"/>
-      </w:pPr>
-      <w:r>
-        <w:t>Randevu / net CB + olumsuz yok → Call Again</w:t>
-      </w:r>
-    </w:p>
-    <w:p>
-      <w:pPr>
-        <w:pStyle w:val="ListBullet"/>
-      </w:pPr>
-      <w:r>
-        <w:t>Soft money + somut maaş/plan → Call Again</w:t>
-      </w:r>
-    </w:p>
-    <w:p>
-      <w:pPr>
-        <w:pStyle w:val="ListBullet"/>
-      </w:pPr>
-      <w:r>
-        <w:t>Hard money / next month belirsiz / ölü timing → No Potential</w:t>
-      </w:r>
-    </w:p>
-    <w:p>
-      <w:pPr>
-        <w:pStyle w:val="ListBullet"/>
-      </w:pPr>
-      <w:r>
+        <w:rPr>
+          <w:rFonts w:ascii="Calibri" w:hAnsi="Calibri" w:eastAsia="Calibri"/>
+          <w:b w:val="0"/>
+          <w:i w:val="0"/>
+          <w:sz w:val="22"/>
+        </w:rPr>
         <w:t>Evrak/ID/banka yok → No Potential - no documents</w:t>
       </w:r>
     </w:p>
     <w:p>
       <w:pPr>
-        <w:pStyle w:val="ListBullet"/>
+        <w:pStyle w:val="ListNumber"/>
+        <w:spacing w:after="40"/>
       </w:pPr>
       <w:r>
-        <w:t>Tek gün red → Recall; iki gün red → No Interest; Recall+3 NA gün → No Interest</w:t>
+        <w:rPr>
+          <w:rFonts w:ascii="Calibri" w:hAnsi="Calibri" w:eastAsia="Calibri"/>
+          <w:b w:val="0"/>
+          <w:i w:val="0"/>
+          <w:sz w:val="22"/>
+        </w:rPr>
+        <w:t>En yeni cümlede net red (“not interested”, “dont want”, “scam”) → Recall (1. gün) veya No Interest (2. gün)</w:t>
       </w:r>
     </w:p>
     <w:p>
       <w:pPr>
-        <w:pStyle w:val="ListBullet"/>
+        <w:pStyle w:val="ListNumber"/>
+        <w:spacing w:after="40"/>
       </w:pPr>
       <w:r>
-        <w:t>Dil tutmuyor → No Language (yardım eden aile third_party değil)</w:t>
+        <w:rPr>
+          <w:rFonts w:ascii="Calibri" w:hAnsi="Calibri" w:eastAsia="Calibri"/>
+          <w:b w:val="0"/>
+          <w:i w:val="0"/>
+          <w:sz w:val="22"/>
+        </w:rPr>
+        <w:t>Müşteri net geri arama istedi (“call me at 6”, “call tomorrow”, “I’m busy call later”) → Call Again</w:t>
       </w:r>
     </w:p>
     <w:p>
       <w:pPr>
-        <w:pStyle w:val="ListBullet"/>
+        <w:pStyle w:val="ListNumber"/>
+        <w:spacing w:after="40"/>
       </w:pPr>
       <w:r>
-        <w:t>“Ben değilim / isim yanlış” → Denied Registration; “kayıt olmadım” yetmez</w:t>
+        <w:rPr>
+          <w:rFonts w:ascii="Calibri" w:hAnsi="Calibri" w:eastAsia="Calibri"/>
+          <w:b w:val="0"/>
+          <w:i w:val="0"/>
+          <w:sz w:val="22"/>
+        </w:rPr>
+        <w:t>Sadece çalma / VM / NA / ring / dvm → No Answer 1-5 (5+ ayrı gün → No Answer 5 UP)</w:t>
       </w:r>
     </w:p>
     <w:p>
       <w:pPr>
-        <w:pStyle w:val="ListBullet"/>
+        <w:pStyle w:val="ListNumber"/>
+        <w:spacing w:after="40"/>
       </w:pPr>
       <w:r>
-        <w:t>Telefon ring/NA → No Answer; invalid email tek başına Wrong Number değil</w:t>
-      </w:r>
-    </w:p>
-    <w:p>
-      <w:r>
-        <w:t>—</w:t>
-      </w:r>
-    </w:p>
-    <w:p>
-      <w:r>
-        <w:t>Belge tarihi: 2026-09-07 · Dal: cursor/fix-merge1-hang-1465 · Canlı V2 third_party/next_month/Wrong-verifier düzeltmeleri dahil.</w:t>
-      </w:r>
-    </w:p>
-    <w:p>
-      <w:pPr>
-        <w:pStyle w:val="Heading2"/>
-      </w:pPr>
-      <w:r>
-        <w:t>6. Güncelleme (2026-09-07 — soft money &amp; No Interest)</w:t>
-      </w:r>
-    </w:p>
-    <w:p>
-      <w:r>
-        <w:t>Çakışma 4A kararı: DOĞRU status Call Again. Parası olmasa bile yakın zamanda aranmak / maaş-timed callback istiyorsa Call Again (No Potential değil).</w:t>
-      </w:r>
-    </w:p>
-    <w:p>
-      <w:r>
-        <w:t>No Interest kuralları (net):</w:t>
-      </w:r>
-    </w:p>
-    <w:p>
-      <w:pPr>
-        <w:pStyle w:val="ListBullet"/>
-      </w:pPr>
-      <w:r>
-        <w:t>Doğrudan No Interest: yalnızca küfür/abuse + istemiyorum/not interested birlikteyse.</w:t>
-      </w:r>
-    </w:p>
-    <w:p>
-      <w:pPr>
-        <w:pStyle w:val="ListBullet"/>
-      </w:pPr>
-      <w:r>
-        <w:t>Diğer tüm istemiyorum / not interested / No Interest etiketleri: 1. gün = Recall (agent No Interest yazsa bile); 2. farklı gün = No Interest.</w:t>
-      </w:r>
-    </w:p>
-    <w:p>
-      <w:pPr>
-        <w:pStyle w:val="ListBullet"/>
-      </w:pPr>
-      <w:r>
-        <w:t>Recall sonrası 3 NA günü → No Interest kuralı ayrıca duruyor.</w:t>
-      </w:r>
-    </w:p>
-    <w:p>
-      <w:pPr>
-        <w:pStyle w:val="Heading2"/>
-      </w:pPr>
-      <w:r>
-        <w:t>7. Güncelleme — callback keyword false positive (çakışma D)</w:t>
-      </w:r>
-    </w:p>
-    <w:p>
-      <w:r>
-        <w:t>Sorun: ARRANGE/callback ailesi kör eşleşiyordu.</w:t>
-      </w:r>
-    </w:p>
-    <w:p>
-      <w:pPr>
-        <w:pStyle w:val="ListBullet"/>
-      </w:pPr>
-      <w:r>
-        <w:t>i will do it by myself (DIY red) → Call Again olmamalı → Recall</w:t>
-      </w:r>
-    </w:p>
-    <w:p>
-      <w:pPr>
-        <w:pStyle w:val="ListBullet"/>
-      </w:pPr>
-      <w:r>
-        <w:t>dont think im interested (negation) → Call Again olmamalı; eski call me back newest red’i ezmemeli → Recall</w:t>
-      </w:r>
-    </w:p>
-    <w:p>
-      <w:pPr>
-        <w:pStyle w:val="ListBullet"/>
-      </w:pPr>
-      <w:r>
-        <w:t>CB REJS → Call Again olmamalı; Recall de değil → No Answer / CRM NA</w:t>
-      </w:r>
-    </w:p>
-    <w:p>
-      <w:pPr>
-        <w:pStyle w:val="ListBullet"/>
-      </w:pPr>
-      <w:r>
-        <w:t>next month (+ money) → No Potential (önceki düzeltme)</w:t>
-      </w:r>
-    </w:p>
-    <w:p>
-      <w:r>
-        <w:t>Verifier deterministic guard’lar aynı aile için eklendi.</w:t>
-      </w:r>
-    </w:p>
-    <w:p>
-      <w:pPr>
-        <w:pStyle w:val="Heading2"/>
-      </w:pPr>
-      <w:r>
-        <w:t>8. Güncelleme — identity &gt; language (çakışma E)</w:t>
-      </w:r>
-    </w:p>
-    <w:p>
-      <w:r>
-        <w:t>Öncelik sırası: kimlik inkârı (im not Ahmad / wrong person) &gt; dil bariyeri (speak arabic / Mandarin). Aynı cümlede ikisi varsa Denied Registration.</w:t>
-      </w:r>
-    </w:p>
-    <w:p>
-      <w:pPr>
-        <w:pStyle w:val="ListBullet"/>
-      </w:pPr>
-      <w:r>
-        <w:t>third_party: yalnızca açık owner-transfer (registered by / someone else registered / this is his sons account). Help+translate+language → third_party yok; No Language veya Call Again kalır.</w:t>
-      </w:r>
-    </w:p>
-    <w:p>
-      <w:pPr>
-        <w:pStyle w:val="Heading2"/>
-      </w:pPr>
-      <w:r>
-        <w:t>9. Güncelleme — Denied vs Recall vs NP-no docs (çakışma F)</w:t>
-      </w:r>
-    </w:p>
-    <w:p>
-      <w:r>
-        <w:t>Öncelik: (1) no id/no documents/no bank → No Potential - no documents; (2) kimlik inkârı (im not &lt;name&gt;, not me, wrong person) → Denied Registration; (3) sadece didnt register → Recall.</w:t>
-      </w:r>
-    </w:p>
-    <w:p>
-      <w:r>
-        <w:t>denied_registration(1x) artık didnt register ile ateşlemez.</w:t>
+        <w:rPr>
+          <w:rFonts w:ascii="Calibri" w:hAnsi="Calibri" w:eastAsia="Calibri"/>
+          <w:b w:val="0"/>
+          <w:i w:val="0"/>
+          <w:sz w:val="22"/>
+        </w:rPr>
+        <w:t>Karışık / anlaşılmaz → Manual Check</w:t>
       </w:r>
     </w:p>
     <w:p>
@@ -960,489 +250,3136 @@
         <w:rPr>
           <w:rFonts w:ascii="Calibri" w:hAnsi="Calibri" w:eastAsia="Calibri"/>
           <w:b/>
+          <w:i w:val="0"/>
           <w:color w:val="1A365D"/>
-          <w:sz w:val="32"/>
+          <w:sz w:val="36"/>
         </w:rPr>
-        <w:t>10. Çelişki G — Wrong Number vs No Answer (telefon canlı)</w:t>
+        <w:t>2. Status sözlüğü — ne demek, ne zaman?</w:t>
       </w:r>
     </w:p>
     <w:p>
+      <w:pPr>
+        <w:pStyle w:val="Heading2"/>
+      </w:pPr>
+      <w:r>
+        <w:rPr>
+          <w:rFonts w:ascii="Calibri" w:hAnsi="Calibri" w:eastAsia="Calibri"/>
+          <w:b/>
+          <w:i w:val="0"/>
+          <w:color w:val="2C5282"/>
+          <w:sz w:val="28"/>
+        </w:rPr>
+        <w:t>2.1 Call Again — “Takip et, henüz ölmedi”</w:t>
+      </w:r>
+    </w:p>
+    <w:p>
+      <w:pPr>
+        <w:spacing w:after="120"/>
+      </w:pPr>
       <w:r>
         <w:rPr>
           <w:rFonts w:ascii="Calibri" w:hAnsi="Calibri" w:eastAsia="Calibri"/>
           <w:b w:val="0"/>
+          <w:i w:val="0"/>
+          <w:color w:val="444444"/>
           <w:sz w:val="22"/>
         </w:rPr>
-        <w:t>Kural (net): newest dialer satırı telefonun canlı olduğunu gösteriyorsa (ring / no answer / voice mail / DVM / unreachable) → Wrong Number üretme. Status No Answer kalır.</w:t>
+        <w:t>Müşteri kapıyı kapatmadı. Net bir devam / randevu / kısa vadeli para planı var.</w:t>
       </w:r>
     </w:p>
     <w:p>
+      <w:pPr>
+        <w:spacing w:after="120"/>
+      </w:pPr>
+      <w:r>
+        <w:rPr>
+          <w:rFonts w:ascii="Calibri" w:hAnsi="Calibri" w:eastAsia="Calibri"/>
+          <w:b/>
+          <w:i w:val="0"/>
+          <w:color w:val="1A365D"/>
+          <w:sz w:val="22"/>
+        </w:rPr>
+        <w:t>Koy:</w:t>
+      </w:r>
+    </w:p>
+    <w:p>
+      <w:pPr>
+        <w:pStyle w:val="ListBullet"/>
+        <w:spacing w:after="40"/>
+      </w:pPr>
       <w:r>
         <w:rPr>
           <w:rFonts w:ascii="Calibri" w:hAnsi="Calibri" w:eastAsia="Calibri"/>
           <w:b w:val="0"/>
+          <w:i w:val="0"/>
           <w:sz w:val="22"/>
         </w:rPr>
-        <w:t>Neden Wrong üretildi (ACC493190):</w:t>
+        <w:t>✓ call me later / call me tomorrow / call at 6pm / I’m busy, call back</w:t>
       </w:r>
     </w:p>
     <w:p>
       <w:pPr>
         <w:pStyle w:val="ListBullet"/>
+        <w:spacing w:after="40"/>
       </w:pPr>
       <w:r>
         <w:rPr>
           <w:rFonts w:ascii="Calibri" w:hAnsi="Calibri" w:eastAsia="Calibri"/>
           <w:b w:val="0"/>
+          <w:i w:val="0"/>
           <w:sz w:val="22"/>
         </w:rPr>
-        <w:t>Eski satır: Invalid email - CRM (techConfirmed yanlışlıkla tetiklenirdi — CRM kelimesi tek başına yetiyordu).</w:t>
+        <w:t>✓ no money NOW ama “until salary”, “will arrange funds”, “ask my friends”, “will get help and deposit”</w:t>
       </w:r>
     </w:p>
     <w:p>
       <w:pPr>
         <w:pStyle w:val="ListBullet"/>
+        <w:spacing w:after="40"/>
       </w:pPr>
       <w:r>
         <w:rPr>
           <w:rFonts w:ascii="Calibri" w:hAnsi="Calibri" w:eastAsia="Calibri"/>
           <w:b w:val="0"/>
+          <w:i w:val="0"/>
           <w:sz w:val="22"/>
         </w:rPr>
-        <w:t>Newest: No Answer 30s / rings → phoneAlive.</w:t>
+        <w:t>✓ pu said to call him later / still busy call later</w:t>
       </w:r>
     </w:p>
     <w:p>
       <w:pPr>
+        <w:spacing w:after="120"/>
+      </w:pPr>
+      <w:r>
+        <w:rPr>
+          <w:rFonts w:ascii="Calibri" w:hAnsi="Calibri" w:eastAsia="Calibri"/>
+          <w:b/>
+          <w:i w:val="0"/>
+          <w:color w:val="1A365D"/>
+          <w:sz w:val="22"/>
+        </w:rPr>
+        <w:t>Koyma:</w:t>
+      </w:r>
+    </w:p>
+    <w:p>
+      <w:pPr>
         <w:pStyle w:val="ListBullet"/>
+        <w:spacing w:after="40"/>
       </w:pPr>
       <w:r>
         <w:rPr>
           <w:rFonts w:ascii="Calibri" w:hAnsi="Calibri" w:eastAsia="Calibri"/>
           <w:b w:val="0"/>
+          <w:i w:val="0"/>
           <w:sz w:val="22"/>
         </w:rPr>
-        <w:t>Eski Memory Match: techConfirmed + softMoney yok → Wrong Number. Newest dialer-only koruması yoktu.</w:t>
+        <w:t>✗ next month / by October / in 4 months / don’t know when → bu No Potential</w:t>
       </w:r>
     </w:p>
     <w:p>
+      <w:pPr>
+        <w:pStyle w:val="ListBullet"/>
+        <w:spacing w:after="40"/>
+      </w:pPr>
       <w:r>
         <w:rPr>
           <w:rFonts w:ascii="Calibri" w:hAnsi="Calibri" w:eastAsia="Calibri"/>
           <w:b w:val="0"/>
+          <w:i w:val="0"/>
           <w:sz w:val="22"/>
         </w:rPr>
-        <w:t>Fix (deployed):</w:t>
+        <w:t>✗ cb:vm, cb na, call again rej, CALLED BACK PUHU → bunlar agent’ın kendi araması, müşteri CB değil</w:t>
       </w:r>
     </w:p>
     <w:p>
       <w:pPr>
         <w:pStyle w:val="ListBullet"/>
+        <w:spacing w:after="40"/>
       </w:pPr>
       <w:r>
         <w:rPr>
           <w:rFonts w:ascii="Calibri" w:hAnsi="Calibri" w:eastAsia="Calibri"/>
           <w:b w:val="0"/>
+          <w:i w:val="0"/>
           <w:sz w:val="22"/>
         </w:rPr>
-        <w:t>techConfirmed: bare crm / email/mail/gmail kaldırıldı; sadece gerçek tech sinyalleri (disconnected, out of service, wrong number, invalid number, …).</w:t>
+        <w:t>✗ i will do it by myself / dont think I’m interested → Recall</w:t>
       </w:r>
     </w:p>
     <w:p>
       <w:pPr>
         <w:pStyle w:val="ListBullet"/>
+        <w:spacing w:after="40"/>
       </w:pPr>
       <w:r>
         <w:rPr>
           <w:rFonts w:ascii="Calibri" w:hAnsi="Calibri" w:eastAsia="Calibri"/>
           <w:b w:val="0"/>
+          <w:i w:val="0"/>
           <w:sz w:val="22"/>
         </w:rPr>
-        <w:t>phoneAliveNewest: ring / no answer / voice mail / DVM / unreachable.</w:t>
+        <w:t>✗ CB REJS / cb reject → genelde No Answer kalır</w:t>
       </w:r>
     </w:p>
     <w:p>
       <w:pPr>
-        <w:pStyle w:val="ListBullet"/>
+        <w:pStyle w:val="Heading2"/>
+      </w:pPr>
+      <w:r>
+        <w:rPr>
+          <w:rFonts w:ascii="Calibri" w:hAnsi="Calibri" w:eastAsia="Calibri"/>
+          <w:b/>
+          <w:i w:val="0"/>
+          <w:color w:val="2C5282"/>
+          <w:sz w:val="28"/>
+        </w:rPr>
+        <w:t>2.2 Recall — “Bugün red / soğuk, yarın bir daha dene”</w:t>
+      </w:r>
+    </w:p>
+    <w:p>
+      <w:pPr>
+        <w:spacing w:after="120"/>
       </w:pPr>
       <w:r>
         <w:rPr>
           <w:rFonts w:ascii="Calibri" w:hAnsi="Calibri" w:eastAsia="Calibri"/>
           <w:b w:val="0"/>
+          <w:i w:val="0"/>
+          <w:color w:val="444444"/>
           <w:sz w:val="22"/>
         </w:rPr>
-        <w:t>Guard: phoneAliveNewest &amp;&amp; !hardWrong → Wrong Number adayı olsa bile No Answer'a düş.</w:t>
+        <w:t>Tek günde yumuşak veya net red var; henüz kalıcı No Interest değil.</w:t>
       </w:r>
     </w:p>
     <w:p>
       <w:pPr>
+        <w:spacing w:after="120"/>
+      </w:pPr>
+      <w:r>
+        <w:rPr>
+          <w:rFonts w:ascii="Calibri" w:hAnsi="Calibri" w:eastAsia="Calibri"/>
+          <w:b/>
+          <w:i w:val="0"/>
+          <w:color w:val="1A365D"/>
+          <w:sz w:val="22"/>
+        </w:rPr>
+        <w:t>Koy:</w:t>
+      </w:r>
+    </w:p>
+    <w:p>
+      <w:pPr>
         <w:pStyle w:val="ListBullet"/>
+        <w:spacing w:after="40"/>
       </w:pPr>
       <w:r>
         <w:rPr>
           <w:rFonts w:ascii="Calibri" w:hAnsi="Calibri" w:eastAsia="Calibri"/>
           <w:b w:val="0"/>
+          <w:i w:val="0"/>
           <w:sz w:val="22"/>
         </w:rPr>
-        <w:t>Harness: ACC493190 + Invalid email - CRM (No Answer).</w:t>
+        <w:t>✓ not interested (ilk gün) / doesnt want to proceed / leave me alone</w:t>
       </w:r>
     </w:p>
     <w:p>
       <w:pPr>
-        <w:pStyle w:val="Heading1"/>
+        <w:pStyle w:val="ListBullet"/>
+        <w:spacing w:after="40"/>
+      </w:pPr>
+      <w:r>
+        <w:rPr>
+          <w:rFonts w:ascii="Calibri" w:hAnsi="Calibri" w:eastAsia="Calibri"/>
+          <w:b w:val="0"/>
+          <w:i w:val="0"/>
+          <w:sz w:val="22"/>
+        </w:rPr>
+        <w:t>✓ dont need your help / i will do it by myself</w:t>
+      </w:r>
+    </w:p>
+    <w:p>
+      <w:pPr>
+        <w:pStyle w:val="ListBullet"/>
+        <w:spacing w:after="40"/>
+      </w:pPr>
+      <w:r>
+        <w:rPr>
+          <w:rFonts w:ascii="Calibri" w:hAnsi="Calibri" w:eastAsia="Calibri"/>
+          <w:b w:val="0"/>
+          <w:i w:val="0"/>
+          <w:sz w:val="22"/>
+        </w:rPr>
+        <w:t>✓ hung up after intro + red kokusu; “playing games”, “not serious” (tek gün)</w:t>
+      </w:r>
+    </w:p>
+    <w:p>
+      <w:pPr>
+        <w:pStyle w:val="ListBullet"/>
+        <w:spacing w:after="40"/>
+      </w:pPr>
+      <w:r>
+        <w:rPr>
+          <w:rFonts w:ascii="Calibri" w:hAnsi="Calibri" w:eastAsia="Calibri"/>
+          <w:b w:val="0"/>
+          <w:i w:val="0"/>
+          <w:sz w:val="22"/>
+        </w:rPr>
+        <w:t>✓ kayıt “ben yapmadım” ama “ben o kişi değilim” demiyor → Recall (Denied değil)</w:t>
+      </w:r>
+    </w:p>
+    <w:p>
+      <w:pPr>
+        <w:spacing w:after="120"/>
       </w:pPr>
       <w:r>
         <w:rPr>
           <w:rFonts w:ascii="Calibri" w:hAnsi="Calibri" w:eastAsia="Calibri"/>
           <w:b/>
+          <w:i w:val="0"/>
           <w:color w:val="1A365D"/>
-          <w:sz w:val="32"/>
+          <w:sz w:val="22"/>
         </w:rPr>
-        <w:t>11. Çelişki H — Verifier dar görev vs geniş beklenti</w:t>
+        <w:t>Koyma:</w:t>
       </w:r>
     </w:p>
     <w:p>
+      <w:pPr>
+        <w:pStyle w:val="ListBullet"/>
+        <w:spacing w:after="40"/>
+      </w:pPr>
       <w:r>
         <w:rPr>
           <w:rFonts w:ascii="Calibri" w:hAnsi="Calibri" w:eastAsia="Calibri"/>
           <w:b w:val="0"/>
+          <w:i w:val="0"/>
           <w:sz w:val="22"/>
         </w:rPr>
-        <w:t>Kural: Verifier yalnızca eşleşen keyword’ün cümle içinde doğru anlamda olup olmadığını denetler. Soft money vs hard money / Call Again vs No Potential politika savaşını yeniden tartmaz.</w:t>
+        <w:t>✗ İki ayrı günde red → No Interest</w:t>
       </w:r>
     </w:p>
     <w:p>
+      <w:pPr>
+        <w:pStyle w:val="ListBullet"/>
+        <w:spacing w:after="40"/>
+      </w:pPr>
       <w:r>
         <w:rPr>
           <w:rFonts w:ascii="Calibri" w:hAnsi="Calibri" w:eastAsia="Calibri"/>
           <w:b w:val="0"/>
+          <w:i w:val="0"/>
           <w:sz w:val="22"/>
         </w:rPr>
-        <w:t>Risk:</w:t>
+        <w:t>✗ Küfür + istemiyorum net kalıcı red → No Interest (doğrudan)</w:t>
       </w:r>
     </w:p>
     <w:p>
       <w:pPr>
         <w:pStyle w:val="ListBullet"/>
+        <w:spacing w:after="40"/>
       </w:pPr>
       <w:r>
         <w:rPr>
           <w:rFonts w:ascii="Calibri" w:hAnsi="Calibri" w:eastAsia="Calibri"/>
           <w:b w:val="0"/>
+          <w:i w:val="0"/>
           <w:sz w:val="22"/>
         </w:rPr>
-        <w:t>LLM agree bias: false CA (next month, hard money) üzerinde agree kalabilir.</w:t>
+        <w:t>✗ Aile yardım ediyor (oğul çeviri, kız kart foto) → third_party / Recall zorlaması yok; asıl cümleye bak</w:t>
       </w:r>
     </w:p>
     <w:p>
       <w:pPr>
-        <w:pStyle w:val="ListBullet"/>
+        <w:pStyle w:val="Heading2"/>
+      </w:pPr>
+      <w:r>
+        <w:rPr>
+          <w:rFonts w:ascii="Calibri" w:hAnsi="Calibri" w:eastAsia="Calibri"/>
+          <w:b/>
+          <w:i w:val="0"/>
+          <w:color w:val="2C5282"/>
+          <w:sz w:val="28"/>
+        </w:rPr>
+        <w:t>2.3 No Interest — “Kalıcı ilgisiz”</w:t>
+      </w:r>
+    </w:p>
+    <w:p>
+      <w:pPr>
+        <w:spacing w:after="120"/>
       </w:pPr>
       <w:r>
         <w:rPr>
           <w:rFonts w:ascii="Calibri" w:hAnsi="Calibri" w:eastAsia="Calibri"/>
           <w:b w:val="0"/>
+          <w:i w:val="0"/>
+          <w:color w:val="444444"/>
           <w:sz w:val="22"/>
         </w:rPr>
-        <w:t>LLM overreach: soft money CA’yi No Potential’a çevirebilir.</w:t>
+        <w:t>İki yoldan biri:</w:t>
       </w:r>
     </w:p>
     <w:p>
+      <w:pPr>
+        <w:pStyle w:val="ListNumber"/>
+        <w:spacing w:after="40"/>
+      </w:pPr>
       <w:r>
         <w:rPr>
           <w:rFonts w:ascii="Calibri" w:hAnsi="Calibri" w:eastAsia="Calibri"/>
           <w:b w:val="0"/>
+          <w:i w:val="0"/>
           <w:sz w:val="22"/>
         </w:rPr>
-        <w:t>Fix:</w:t>
+        <w:t>Red / not interested ifadesi iki farklı günde</w:t>
       </w:r>
     </w:p>
     <w:p>
       <w:pPr>
-        <w:pStyle w:val="ListBullet"/>
+        <w:pStyle w:val="ListNumber"/>
+        <w:spacing w:after="40"/>
       </w:pPr>
       <w:r>
         <w:rPr>
           <w:rFonts w:ascii="Calibri" w:hAnsi="Calibri" w:eastAsia="Calibri"/>
           <w:b w:val="0"/>
+          <w:i w:val="0"/>
           <w:sz w:val="22"/>
         </w:rPr>
-        <w:t>Prompt: “NOT a second status engine”; soft money + salary/arrange → AGREE if keyword not negated.</w:t>
+        <w:t>Küfür + açık “istemiyorum / ilgilenmiyorum” (doğrudan No Interest)</w:t>
       </w:r>
     </w:p>
     <w:p>
       <w:pPr>
-        <w:pStyle w:val="ListBullet"/>
+        <w:pStyle w:val="ListNumber"/>
+        <w:spacing w:after="40"/>
       </w:pPr>
       <w:r>
         <w:rPr>
           <w:rFonts w:ascii="Calibri" w:hAnsi="Calibri" w:eastAsia="Calibri"/>
           <w:b w:val="0"/>
+          <w:i w:val="0"/>
           <w:sz w:val="22"/>
         </w:rPr>
-        <w:t>Deterministic guards: next_month, hard_money_dead, soft_money_protect, negated/DIY/CB REJS.</w:t>
+        <w:t>Recall sonrası 3 ayrı günde hiç cevap yok (NA streak) → No Interest’e yükselt</w:t>
       </w:r>
     </w:p>
     <w:p>
       <w:pPr>
+        <w:spacing w:after="120"/>
+      </w:pPr>
+      <w:r>
+        <w:rPr>
+          <w:rFonts w:ascii="Calibri" w:hAnsi="Calibri" w:eastAsia="Calibri"/>
+          <w:b/>
+          <w:i w:val="0"/>
+          <w:color w:val="1A365D"/>
+          <w:sz w:val="22"/>
+        </w:rPr>
+        <w:t>Koyma:</w:t>
+      </w:r>
+    </w:p>
+    <w:p>
+      <w:pPr>
         <w:pStyle w:val="ListBullet"/>
+        <w:spacing w:after="40"/>
       </w:pPr>
       <w:r>
         <w:rPr>
           <w:rFonts w:ascii="Calibri" w:hAnsi="Calibri" w:eastAsia="Calibri"/>
           <w:b w:val="0"/>
+          <w:i w:val="0"/>
           <w:sz w:val="22"/>
         </w:rPr>
-        <w:t>Override block: blocked_soft_money_protect / blocked_hard_money_protect / blocked_false_callback_protect.</w:t>
+        <w:t>✗ Tek günde bir kez “not interested” → bu Recall</w:t>
       </w:r>
     </w:p>
     <w:p>
       <w:pPr>
         <w:pStyle w:val="ListBullet"/>
+        <w:spacing w:after="40"/>
       </w:pPr>
       <w:r>
         <w:rPr>
           <w:rFonts w:ascii="Calibri" w:hAnsi="Calibri" w:eastAsia="Calibri"/>
           <w:b w:val="0"/>
+          <w:i w:val="0"/>
           <w:sz w:val="22"/>
         </w:rPr>
-        <w:t>Harness: scripts/verifier_guard_harness.js (13 cases).</w:t>
+        <w:t>✗ Sadece hang-up (hu) → tek başına red sayılmaz</w:t>
       </w:r>
     </w:p>
     <w:p>
       <w:pPr>
-        <w:pStyle w:val="Heading1"/>
+        <w:pStyle w:val="Heading2"/>
       </w:pPr>
       <w:r>
         <w:rPr>
           <w:rFonts w:ascii="Calibri" w:hAnsi="Calibri" w:eastAsia="Calibri"/>
           <w:b/>
-          <w:color w:val="1A365D"/>
-          <w:sz w:val="32"/>
+          <w:i w:val="0"/>
+          <w:color w:val="2C5282"/>
+          <w:sz w:val="28"/>
         </w:rPr>
-        <w:t>12. Çelişki I — Sheet when_not_to_use boşluğu</w:t>
+        <w:t>2.4 No Potential — “Para/kapasite yolu kapalı”</w:t>
       </w:r>
     </w:p>
     <w:p>
+      <w:pPr>
+        <w:spacing w:after="120"/>
+      </w:pPr>
       <w:r>
         <w:rPr>
           <w:rFonts w:ascii="Calibri" w:hAnsi="Calibri" w:eastAsia="Calibri"/>
           <w:b w:val="0"/>
+          <w:i w:val="0"/>
+          <w:color w:val="444444"/>
           <w:sz w:val="22"/>
         </w:rPr>
-        <w:t>Sorun: Çoğu satırda when_not_to_use boş veya jenerik; negation / soft money / identity vs language Sheet’te yoktu. Motor+prompt telafi ediyordu → çift kaynaklı karmaşa.</w:t>
+        <w:t>Yatırım için para yok ve geri dönüş yolu yok (uzak, belirsiz veya vazgeçmiş).</w:t>
       </w:r>
     </w:p>
     <w:p>
+      <w:pPr>
+        <w:spacing w:after="120"/>
+      </w:pPr>
       <w:r>
         <w:rPr>
           <w:rFonts w:ascii="Calibri" w:hAnsi="Calibri" w:eastAsia="Calibri"/>
           <w:b/>
+          <w:i w:val="0"/>
+          <w:color w:val="1A365D"/>
           <w:sz w:val="22"/>
         </w:rPr>
-        <w:t>Fix:</w:t>
+        <w:t>Koy:</w:t>
       </w:r>
     </w:p>
     <w:p>
       <w:pPr>
         <w:pStyle w:val="ListBullet"/>
+        <w:spacing w:after="40"/>
       </w:pPr>
       <w:r>
         <w:rPr>
           <w:rFonts w:ascii="Calibri" w:hAnsi="Calibri" w:eastAsia="Calibri"/>
           <w:b w:val="0"/>
+          <w:i w:val="0"/>
           <w:sz w:val="22"/>
         </w:rPr>
-        <w:t>evals/rules_sheet.json: boş/zayıf avoid dolduruldu; [skip:negation|soft_money_plan|hard_money_dead|next_month_as_ca|identity_denial|language_only|bare_didnt_register|agent_cb|phone_alive] etiketleri.</w:t>
+        <w:t>✓ does not have the money / cant afford + next month / by October / in 4 months</w:t>
       </w:r>
     </w:p>
     <w:p>
       <w:pPr>
         <w:pStyle w:val="ListBullet"/>
+        <w:spacing w:after="40"/>
       </w:pPr>
       <w:r>
         <w:rPr>
           <w:rFonts w:ascii="Calibri" w:hAnsi="Calibri" w:eastAsia="Calibri"/>
           <w:b w:val="0"/>
+          <w:i w:val="0"/>
           <w:sz w:val="22"/>
         </w:rPr>
-        <w:t>Memory Match sheetAvoidBlocks(): Sheet satırı match olsa bile [skip:] koşulu varsa satır bastırılır (policy tek kaynak olmaktan çıkar).</w:t>
+        <w:t>✓ no starting capital + doesn’t know when / reply when ready</w:t>
       </w:r>
     </w:p>
     <w:p>
       <w:pPr>
         <w:pStyle w:val="ListBullet"/>
+        <w:spacing w:after="40"/>
       </w:pPr>
       <w:r>
         <w:rPr>
           <w:rFonts w:ascii="Calibri" w:hAnsi="Calibri" w:eastAsia="Calibri"/>
           <w:b w:val="0"/>
+          <w:i w:val="0"/>
           <w:sz w:val="22"/>
         </w:rPr>
-        <w:t>Build Verify Batches: when_not_to_use snippet 160 karaktere çıkarıldı (etiketler Verifier’a ulaşır).</w:t>
+        <w:t>✓ not serious / didn’t mean to invest / discontinue + no money</w:t>
       </w:r>
     </w:p>
     <w:p>
       <w:pPr>
         <w:pStyle w:val="ListBullet"/>
+        <w:spacing w:after="40"/>
       </w:pPr>
       <w:r>
         <w:rPr>
           <w:rFonts w:ascii="Calibri" w:hAnsi="Calibri" w:eastAsia="Calibri"/>
           <w:b w:val="0"/>
+          <w:i w:val="0"/>
           <w:sz w:val="22"/>
         </w:rPr>
-        <w:t>Canlı Google Sheet: evals/when_not_to_use_conflict_i.csv satırlarını CRM_AI_Rules when_not_to_use kolonuna yapıştır.</w:t>
+        <w:t>✓ capital affordable? no + hung up</w:t>
       </w:r>
     </w:p>
     <w:p>
       <w:pPr>
         <w:pStyle w:val="ListBullet"/>
+        <w:spacing w:after="40"/>
       </w:pPr>
       <w:r>
         <w:rPr>
           <w:rFonts w:ascii="Calibri" w:hAnsi="Calibri" w:eastAsia="Calibri"/>
           <w:b w:val="0"/>
+          <w:i w:val="0"/>
           <w:sz w:val="22"/>
         </w:rPr>
-        <w:t>Script: python3 scripts/fill_when_not_to_use.py</w:t>
+        <w:t>✓ telefon hiç açılmıyor, sadece email ile iletişim istiyor</w:t>
       </w:r>
     </w:p>
     <w:p>
       <w:pPr>
+        <w:spacing w:after="120"/>
+      </w:pPr>
+      <w:r>
+        <w:rPr>
+          <w:rFonts w:ascii="Calibri" w:hAnsi="Calibri" w:eastAsia="Calibri"/>
+          <w:b/>
+          <w:i w:val="0"/>
+          <w:color w:val="1A365D"/>
+          <w:sz w:val="22"/>
+        </w:rPr>
+        <w:t>Koyma (bunlar Call Again):</w:t>
+      </w:r>
+    </w:p>
+    <w:p>
+      <w:pPr>
         <w:pStyle w:val="ListBullet"/>
+        <w:spacing w:after="40"/>
       </w:pPr>
       <w:r>
         <w:rPr>
           <w:rFonts w:ascii="Calibri" w:hAnsi="Calibri" w:eastAsia="Calibri"/>
           <w:b w:val="0"/>
+          <w:i w:val="0"/>
           <w:sz w:val="22"/>
         </w:rPr>
-        <w:t>Harness: ACC-I-LANG-ID / ACC-I-SOFT-NP / ACC-I-NEXT-CA</w:t>
+        <w:t>✗ no money until salary in a few days / will start after salary</w:t>
       </w:r>
     </w:p>
     <w:p>
       <w:pPr>
-        <w:pStyle w:val="Heading1"/>
+        <w:pStyle w:val="ListBullet"/>
+        <w:spacing w:after="40"/>
+      </w:pPr>
+      <w:r>
+        <w:rPr>
+          <w:rFonts w:ascii="Calibri" w:hAnsi="Calibri" w:eastAsia="Calibri"/>
+          <w:b w:val="0"/>
+          <w:i w:val="0"/>
+          <w:sz w:val="22"/>
+        </w:rPr>
+        <w:t>✗ cant afford now but will get help and deposit</w:t>
+      </w:r>
+    </w:p>
+    <w:p>
+      <w:pPr>
+        <w:pStyle w:val="ListBullet"/>
+        <w:spacing w:after="40"/>
+      </w:pPr>
+      <w:r>
+        <w:rPr>
+          <w:rFonts w:ascii="Calibri" w:hAnsi="Calibri" w:eastAsia="Calibri"/>
+          <w:b w:val="0"/>
+          <w:i w:val="0"/>
+          <w:sz w:val="22"/>
+        </w:rPr>
+        <w:t>✗ dont have funds — give me time to source</w:t>
+      </w:r>
+    </w:p>
+    <w:p>
+      <w:pPr>
+        <w:pStyle w:val="Heading2"/>
       </w:pPr>
       <w:r>
         <w:rPr>
           <w:rFonts w:ascii="Calibri" w:hAnsi="Calibri" w:eastAsia="Calibri"/>
           <w:b/>
-          <w:color w:val="1A365D"/>
-          <w:sz w:val="32"/>
+          <w:i w:val="0"/>
+          <w:color w:val="2C5282"/>
+          <w:sz w:val="28"/>
         </w:rPr>
-        <w:t>13. Çelişki J — skipAI + eski Verifier kotası</w:t>
+        <w:t>2.5 No Potential - no documents — “Evrak engeli”</w:t>
       </w:r>
     </w:p>
     <w:p>
+      <w:pPr>
+        <w:spacing w:after="120"/>
+      </w:pPr>
       <w:r>
         <w:rPr>
           <w:rFonts w:ascii="Calibri" w:hAnsi="Calibri" w:eastAsia="Calibri"/>
           <w:b w:val="0"/>
+          <w:i w:val="0"/>
+          <w:color w:val="444444"/>
           <w:sz w:val="22"/>
         </w:rPr>
-        <w:t>Kural: Policy/Sheet hit → skipAI=true → AI Agent çalışmaz. Doğru sonuç önce Memory Match kalitesine bağlı.</w:t>
+        <w:t>Potansiyel yok çünkü ID / banka / POR yok. Genel No Potential’dan daha spesifik; varsa bunu seç.</w:t>
       </w:r>
     </w:p>
     <w:p>
+      <w:pPr>
+        <w:pStyle w:val="ListBullet"/>
+        <w:spacing w:after="40"/>
+      </w:pPr>
       <w:r>
         <w:rPr>
           <w:rFonts w:ascii="Calibri" w:hAnsi="Calibri" w:eastAsia="Calibri"/>
           <w:b w:val="0"/>
+          <w:i w:val="0"/>
           <w:sz w:val="22"/>
         </w:rPr>
-        <w:t>Eski risk: Verifier MAX kotası Wrong no_money satırlarını dışarıda bırakabiliyordu (düzeltildi: tüm Wrong girer).</w:t>
+        <w:t>✓ no id / no documents / no bank account / no POR</w:t>
       </w:r>
     </w:p>
     <w:p>
+      <w:pPr>
+        <w:pStyle w:val="ListBullet"/>
+        <w:spacing w:after="40"/>
+      </w:pPr>
       <w:r>
         <w:rPr>
           <w:rFonts w:ascii="Calibri" w:hAnsi="Calibri" w:eastAsia="Calibri"/>
           <w:b w:val="0"/>
+          <w:i w:val="0"/>
           <w:sz w:val="22"/>
         </w:rPr>
-        <w:t>Kalan risk: Correct ama kırılgan skipAI (money/callback/identity) de kotada düşebilirdi.</w:t>
+        <w:t>✗ Sadece “didnt register” → bu Recall; evrak değil</w:t>
       </w:r>
     </w:p>
     <w:p>
+      <w:pPr>
+        <w:pStyle w:val="Heading2"/>
+      </w:pPr>
       <w:r>
         <w:rPr>
           <w:rFonts w:ascii="Calibri" w:hAnsi="Calibri" w:eastAsia="Calibri"/>
           <w:b/>
-          <w:sz w:val="22"/>
+          <w:i w:val="0"/>
+          <w:color w:val="2C5282"/>
+          <w:sz w:val="28"/>
         </w:rPr>
-        <w:t>Fix:</w:t>
+        <w:t>2.6 No Answer 1-5 — “Telefon canlı, kimse yok”</w:t>
       </w:r>
     </w:p>
     <w:p>
       <w:pPr>
-        <w:pStyle w:val="ListBullet"/>
+        <w:spacing w:after="120"/>
       </w:pPr>
       <w:r>
         <w:rPr>
           <w:rFonts w:ascii="Calibri" w:hAnsi="Calibri" w:eastAsia="Calibri"/>
           <w:b w:val="0"/>
+          <w:i w:val="0"/>
+          <w:color w:val="444444"/>
           <w:sz w:val="22"/>
         </w:rPr>
-        <w:t>Build Verify Batches: ALL Wrong + ALL fragile skipAI Correct (money/callback/next_month/identity/DIY/CB REJS/phone_alive) uncapped.</w:t>
+        <w:t>Numara çalışıyor; ring / NA / VM / DVM / ndt / db. 1–5 deneme bandı.</w:t>
       </w:r>
     </w:p>
     <w:p>
       <w:pPr>
         <w:pStyle w:val="ListBullet"/>
+        <w:spacing w:after="40"/>
       </w:pPr>
       <w:r>
         <w:rPr>
           <w:rFonts w:ascii="Calibri" w:hAnsi="Calibri" w:eastAsia="Calibri"/>
           <w:b w:val="0"/>
+          <w:i w:val="0"/>
           <w:sz w:val="22"/>
         </w:rPr>
-        <w:t>Non-fragile Correct/Manual hâlâ MAX_OTHER=80.</w:t>
+        <w:t>✓ na, vm, dvm, ring, ndt, cnbr, currently busy (konuşma yoksa)</w:t>
       </w:r>
     </w:p>
     <w:p>
       <w:pPr>
         <w:pStyle w:val="ListBullet"/>
+        <w:spacing w:after="40"/>
       </w:pPr>
       <w:r>
         <w:rPr>
           <w:rFonts w:ascii="Calibri" w:hAnsi="Calibri" w:eastAsia="Calibri"/>
           <w:b w:val="0"/>
+          <w:i w:val="0"/>
           <w:sz w:val="22"/>
         </w:rPr>
-        <w:t>priorityScore: fragile +40.</w:t>
+        <w:t>✓ Invalid email olsa bile newest satır ring/NA/DVM ise → No Answer kalır (Wrong Number’a çekme)</w:t>
       </w:r>
     </w:p>
     <w:p>
       <w:pPr>
         <w:pStyle w:val="ListBullet"/>
+        <w:spacing w:after="40"/>
       </w:pPr>
       <w:r>
         <w:rPr>
           <w:rFonts w:ascii="Calibri" w:hAnsi="Calibri" w:eastAsia="Calibri"/>
           <w:b w:val="0"/>
+          <w:i w:val="0"/>
           <w:sz w:val="22"/>
         </w:rPr>
-        <w:t>Harness: scripts/verifier_quota_harness.js</w:t>
+        <w:t>✗ Müşteri “call me later” dediyse → Call Again</w:t>
       </w:r>
     </w:p>
     <w:p>
       <w:pPr>
         <w:pStyle w:val="ListBullet"/>
+        <w:spacing w:after="40"/>
       </w:pPr>
       <w:r>
         <w:rPr>
           <w:rFonts w:ascii="Calibri" w:hAnsi="Calibri" w:eastAsia="Calibri"/>
           <w:b w:val="0"/>
+          <w:i w:val="0"/>
           <w:sz w:val="22"/>
         </w:rPr>
-        <w:t>AI Agent yeniden açılmaz — ikinci bakış Verifier + deterministic guards (Conflict H).</w:t>
+        <w:t>✗ 5+ ayrı günde hep NA → No Answer 5 UP</w:t>
+      </w:r>
+    </w:p>
+    <w:p>
+      <w:pPr>
+        <w:pStyle w:val="Heading2"/>
+      </w:pPr>
+      <w:r>
+        <w:rPr>
+          <w:rFonts w:ascii="Calibri" w:hAnsi="Calibri" w:eastAsia="Calibri"/>
+          <w:b/>
+          <w:i w:val="0"/>
+          <w:color w:val="2C5282"/>
+          <w:sz w:val="28"/>
+        </w:rPr>
+        <w:t>2.7 No Answer 5 UP</w:t>
+      </w:r>
+    </w:p>
+    <w:p>
+      <w:pPr>
+        <w:spacing w:after="120"/>
+      </w:pPr>
+      <w:r>
+        <w:rPr>
+          <w:rFonts w:ascii="Calibri" w:hAnsi="Calibri" w:eastAsia="Calibri"/>
+          <w:b w:val="0"/>
+          <w:i w:val="0"/>
+          <w:color w:val="444444"/>
+          <w:sz w:val="22"/>
+        </w:rPr>
+        <w:t>5 veya daha fazla ayrı günde cevap yok. Mekanik yükseltme; Call Again’i de bu streak’te keser.</w:t>
+      </w:r>
+    </w:p>
+    <w:p>
+      <w:pPr>
+        <w:pStyle w:val="Heading2"/>
+      </w:pPr>
+      <w:r>
+        <w:rPr>
+          <w:rFonts w:ascii="Calibri" w:hAnsi="Calibri" w:eastAsia="Calibri"/>
+          <w:b/>
+          <w:i w:val="0"/>
+          <w:color w:val="2C5282"/>
+          <w:sz w:val="28"/>
+        </w:rPr>
+        <w:t>2.8 No Language — “Dil tutmuyor”</w:t>
+      </w:r>
+    </w:p>
+    <w:p>
+      <w:pPr>
+        <w:pStyle w:val="ListBullet"/>
+        <w:spacing w:after="40"/>
+      </w:pPr>
+      <w:r>
+        <w:rPr>
+          <w:rFonts w:ascii="Calibri" w:hAnsi="Calibri" w:eastAsia="Calibri"/>
+          <w:b w:val="0"/>
+          <w:i w:val="0"/>
+          <w:sz w:val="22"/>
+        </w:rPr>
+        <w:t>✓ Mandarin / Tamil / Arapça speaker, hard time to discuss in English/MY, translator lazım</w:t>
+      </w:r>
+    </w:p>
+    <w:p>
+      <w:pPr>
+        <w:pStyle w:val="ListBullet"/>
+        <w:spacing w:after="40"/>
+      </w:pPr>
+      <w:r>
+        <w:rPr>
+          <w:rFonts w:ascii="Calibri" w:hAnsi="Calibri" w:eastAsia="Calibri"/>
+          <w:b w:val="0"/>
+          <w:i w:val="0"/>
+          <w:sz w:val="22"/>
+        </w:rPr>
+        <w:t>✗ Aynı cümlede “im not Ahmad … speak Arabic” → önce kimlik: Denied Registration (identity &gt; language)</w:t>
+      </w:r>
+    </w:p>
+    <w:p>
+      <w:pPr>
+        <w:pStyle w:val="Heading2"/>
+      </w:pPr>
+      <w:r>
+        <w:rPr>
+          <w:rFonts w:ascii="Calibri" w:hAnsi="Calibri" w:eastAsia="Calibri"/>
+          <w:b/>
+          <w:i w:val="0"/>
+          <w:color w:val="2C5282"/>
+          <w:sz w:val="28"/>
+        </w:rPr>
+        <w:t>2.9 Denied Registration — “Ben kayıtlı kişi değilim”</w:t>
+      </w:r>
+    </w:p>
+    <w:p>
+      <w:pPr>
+        <w:spacing w:after="120"/>
+      </w:pPr>
+      <w:r>
+        <w:rPr>
+          <w:rFonts w:ascii="Calibri" w:hAnsi="Calibri" w:eastAsia="Calibri"/>
+          <w:b w:val="0"/>
+          <w:i w:val="0"/>
+          <w:color w:val="444444"/>
+          <w:sz w:val="22"/>
+        </w:rPr>
+        <w:t>Kimlik inkârı şart. Tek gün → Denied Registration. İkinci gün tekrar → Wrong Number or Email.</w:t>
+      </w:r>
+    </w:p>
+    <w:p>
+      <w:pPr>
+        <w:pStyle w:val="ListBullet"/>
+        <w:spacing w:after="40"/>
+      </w:pPr>
+      <w:r>
+        <w:rPr>
+          <w:rFonts w:ascii="Calibri" w:hAnsi="Calibri" w:eastAsia="Calibri"/>
+          <w:b w:val="0"/>
+          <w:i w:val="0"/>
+          <w:sz w:val="22"/>
+        </w:rPr>
+        <w:t>✓ im not Ahmad / this is not me / wrong person / someone registered with my number + kimlik reddi</w:t>
+      </w:r>
+    </w:p>
+    <w:p>
+      <w:pPr>
+        <w:pStyle w:val="ListBullet"/>
+        <w:spacing w:after="40"/>
+      </w:pPr>
+      <w:r>
+        <w:rPr>
+          <w:rFonts w:ascii="Calibri" w:hAnsi="Calibri" w:eastAsia="Calibri"/>
+          <w:b w:val="0"/>
+          <w:i w:val="0"/>
+          <w:sz w:val="22"/>
+        </w:rPr>
+        <w:t>✗ said I didnt register (kimlik yok) → Recall</w:t>
+      </w:r>
+    </w:p>
+    <w:p>
+      <w:pPr>
+        <w:pStyle w:val="ListBullet"/>
+        <w:spacing w:after="40"/>
+      </w:pPr>
+      <w:r>
+        <w:rPr>
+          <w:rFonts w:ascii="Calibri" w:hAnsi="Calibri" w:eastAsia="Calibri"/>
+          <w:b w:val="0"/>
+          <w:i w:val="0"/>
+          <w:sz w:val="22"/>
+        </w:rPr>
+        <w:t>✗ no id / no bank → No Potential - no documents</w:t>
+      </w:r>
+    </w:p>
+    <w:p>
+      <w:pPr>
+        <w:pStyle w:val="Heading2"/>
+      </w:pPr>
+      <w:r>
+        <w:rPr>
+          <w:rFonts w:ascii="Calibri" w:hAnsi="Calibri" w:eastAsia="Calibri"/>
+          <w:b/>
+          <w:i w:val="0"/>
+          <w:color w:val="2C5282"/>
+          <w:sz w:val="28"/>
+        </w:rPr>
+        <w:t>2.10 Wrong Number or Email — “Numara/email gerçekten yanlış”</w:t>
+      </w:r>
+    </w:p>
+    <w:p>
+      <w:pPr>
+        <w:pStyle w:val="ListBullet"/>
+        <w:spacing w:after="40"/>
+      </w:pPr>
+      <w:r>
+        <w:rPr>
+          <w:rFonts w:ascii="Calibri" w:hAnsi="Calibri" w:eastAsia="Calibri"/>
+          <w:b w:val="0"/>
+          <w:i w:val="0"/>
+          <w:sz w:val="22"/>
+        </w:rPr>
+        <w:t>✓ wrong number confirmed / number not in service / invalid number (telefon ölü)</w:t>
+      </w:r>
+    </w:p>
+    <w:p>
+      <w:pPr>
+        <w:pStyle w:val="ListBullet"/>
+        <w:spacing w:after="40"/>
+      </w:pPr>
+      <w:r>
+        <w:rPr>
+          <w:rFonts w:ascii="Calibri" w:hAnsi="Calibri" w:eastAsia="Calibri"/>
+          <w:b w:val="0"/>
+          <w:i w:val="0"/>
+          <w:sz w:val="22"/>
+        </w:rPr>
+        <w:t>✓ Kimlik inkârının ikinci günü</w:t>
+      </w:r>
+    </w:p>
+    <w:p>
+      <w:pPr>
+        <w:pStyle w:val="ListBullet"/>
+        <w:spacing w:after="40"/>
+      </w:pPr>
+      <w:r>
+        <w:rPr>
+          <w:rFonts w:ascii="Calibri" w:hAnsi="Calibri" w:eastAsia="Calibri"/>
+          <w:b w:val="0"/>
+          <w:i w:val="0"/>
+          <w:sz w:val="22"/>
+        </w:rPr>
+        <w:t>✗ Invalid email - CRM + newest ring/NA → No Answer (telefon canlı)</w:t>
+      </w:r>
+    </w:p>
+    <w:p>
+      <w:pPr>
+        <w:pStyle w:val="ListBullet"/>
+        <w:spacing w:after="40"/>
+      </w:pPr>
+      <w:r>
+        <w:rPr>
+          <w:rFonts w:ascii="Calibri" w:hAnsi="Calibri" w:eastAsia="Calibri"/>
+          <w:b w:val="0"/>
+          <w:i w:val="0"/>
+          <w:sz w:val="22"/>
+        </w:rPr>
+        <w:t>✗ Tek başına “CRM” kelimesi Wrong üretmez</w:t>
+      </w:r>
+    </w:p>
+    <w:p>
+      <w:pPr>
+        <w:pStyle w:val="Heading2"/>
+      </w:pPr>
+      <w:r>
+        <w:rPr>
+          <w:rFonts w:ascii="Calibri" w:hAnsi="Calibri" w:eastAsia="Calibri"/>
+          <w:b/>
+          <w:i w:val="0"/>
+          <w:color w:val="2C5282"/>
+          <w:sz w:val="28"/>
+        </w:rPr>
+        <w:t>2.11 Under 18 / Invalid Country</w:t>
+      </w:r>
+    </w:p>
+    <w:p>
+      <w:pPr>
+        <w:spacing w:after="120"/>
+      </w:pPr>
+      <w:r>
+        <w:rPr>
+          <w:rFonts w:ascii="Calibri" w:hAnsi="Calibri" w:eastAsia="Calibri"/>
+          <w:b w:val="0"/>
+          <w:i w:val="0"/>
+          <w:color w:val="444444"/>
+          <w:sz w:val="22"/>
+        </w:rPr>
+        <w:t>Yaş &lt;18 veya ülke/pazar geçersiz. Net sinyal varsa koy; tahmin etme.</w:t>
+      </w:r>
+    </w:p>
+    <w:p>
+      <w:pPr>
+        <w:pStyle w:val="Heading2"/>
+      </w:pPr>
+      <w:r>
+        <w:rPr>
+          <w:rFonts w:ascii="Calibri" w:hAnsi="Calibri" w:eastAsia="Calibri"/>
+          <w:b/>
+          <w:i w:val="0"/>
+          <w:color w:val="2C5282"/>
+          <w:sz w:val="28"/>
+        </w:rPr>
+        <w:t>2.12 Manual Check / Decline / Duplicate / DNC</w:t>
+      </w:r>
+    </w:p>
+    <w:p>
+      <w:pPr>
+        <w:spacing w:after="120"/>
+      </w:pPr>
+      <w:r>
+        <w:rPr>
+          <w:rFonts w:ascii="Calibri" w:hAnsi="Calibri" w:eastAsia="Calibri"/>
+          <w:b w:val="0"/>
+          <w:i w:val="0"/>
+          <w:color w:val="444444"/>
+          <w:sz w:val="22"/>
+        </w:rPr>
+        <w:t>Manual Check: karışık intent, hem kayıt hem red, net karar yok → insan baksın.</w:t>
+      </w:r>
+    </w:p>
+    <w:p>
+      <w:pPr>
+        <w:spacing w:after="120"/>
+      </w:pPr>
+      <w:r>
+        <w:rPr>
+          <w:rFonts w:ascii="Calibri" w:hAnsi="Calibri" w:eastAsia="Calibri"/>
+          <w:b w:val="0"/>
+          <w:i w:val="0"/>
+          <w:color w:val="444444"/>
+          <w:sz w:val="22"/>
+        </w:rPr>
+        <w:t>Decline / Duplicate / DNC: operasyonel; yorumdan otomatik uydurma. CRM’de bu status varsa Manual Check bandında bırak.</w:t>
+      </w:r>
+    </w:p>
+    <w:p>
+      <w:pPr>
+        <w:pStyle w:val="Heading1"/>
+      </w:pPr>
+      <w:r>
+        <w:rPr>
+          <w:rFonts w:ascii="Calibri" w:hAnsi="Calibri" w:eastAsia="Calibri"/>
+          <w:b/>
+          <w:i w:val="0"/>
+          <w:color w:val="1A365D"/>
+          <w:sz w:val="36"/>
+        </w:rPr>
+        <w:t>3. En çok karışan durumlar</w:t>
+      </w:r>
+    </w:p>
+    <w:p>
+      <w:pPr>
+        <w:pStyle w:val="Heading2"/>
+      </w:pPr>
+      <w:r>
+        <w:rPr>
+          <w:rFonts w:ascii="Calibri" w:hAnsi="Calibri" w:eastAsia="Calibri"/>
+          <w:b/>
+          <w:i w:val="0"/>
+          <w:color w:val="2C5282"/>
+          <w:sz w:val="28"/>
+        </w:rPr>
+        <w:t>3.1 Call Again mı, No Potential mı? (para)</w:t>
+      </w:r>
+    </w:p>
+    <w:p>
+      <w:pPr>
+        <w:spacing w:after="120"/>
+      </w:pPr>
+      <w:r>
+        <w:rPr>
+          <w:rFonts w:ascii="Calibri" w:hAnsi="Calibri" w:eastAsia="Calibri"/>
+          <w:b w:val="0"/>
+          <w:i w:val="0"/>
+          <w:color w:val="444444"/>
+          <w:sz w:val="22"/>
+        </w:rPr>
+        <w:t>Soru: “Parası yok — ama yakında bir yol var mı?”</w:t>
+      </w:r>
+    </w:p>
+    <w:p>
+      <w:pPr>
+        <w:pStyle w:val="ListBullet"/>
+        <w:spacing w:after="40"/>
+      </w:pPr>
+      <w:r>
+        <w:rPr>
+          <w:rFonts w:ascii="Calibri" w:hAnsi="Calibri" w:eastAsia="Calibri"/>
+          <w:b w:val="0"/>
+          <w:i w:val="0"/>
+          <w:sz w:val="22"/>
+        </w:rPr>
+        <w:t>Yakın plan (maaş günü, arrange, friends, will deposit soon) → Call Again</w:t>
+      </w:r>
+    </w:p>
+    <w:p>
+      <w:pPr>
+        <w:pStyle w:val="ListBullet"/>
+        <w:spacing w:after="40"/>
+      </w:pPr>
+      <w:r>
+        <w:rPr>
+          <w:rFonts w:ascii="Calibri" w:hAnsi="Calibri" w:eastAsia="Calibri"/>
+          <w:b w:val="0"/>
+          <w:i w:val="0"/>
+          <w:sz w:val="22"/>
+        </w:rPr>
+        <w:t>Uzak / belirsiz / vazgeçmiş (next month, October, not sure when, not serious) → No Potential</w:t>
+      </w:r>
+    </w:p>
+    <w:p>
+      <w:pPr>
+        <w:spacing w:after="120"/>
+      </w:pPr>
+      <w:r>
+        <w:rPr>
+          <w:rFonts w:ascii="Calibri" w:hAnsi="Calibri" w:eastAsia="Calibri"/>
+          <w:b w:val="0"/>
+          <w:i w:val="0"/>
+          <w:color w:val="444444"/>
+          <w:sz w:val="22"/>
+        </w:rPr>
+        <w:t>Örnek:</w:t>
+      </w:r>
+    </w:p>
+    <w:p>
+      <w:pPr>
+        <w:pStyle w:val="ListBullet"/>
+        <w:spacing w:after="40"/>
+      </w:pPr>
+      <w:r>
+        <w:rPr>
+          <w:rFonts w:ascii="Calibri" w:hAnsi="Calibri" w:eastAsia="Calibri"/>
+          <w:b w:val="0"/>
+          <w:i w:val="0"/>
+          <w:sz w:val="22"/>
+        </w:rPr>
+        <w:t>✓ “no money until salary then will start” → Call Again</w:t>
+      </w:r>
+    </w:p>
+    <w:p>
+      <w:pPr>
+        <w:pStyle w:val="ListBullet"/>
+        <w:spacing w:after="40"/>
+      </w:pPr>
+      <w:r>
+        <w:rPr>
+          <w:rFonts w:ascii="Calibri" w:hAnsi="Calibri" w:eastAsia="Calibri"/>
+          <w:b w:val="0"/>
+          <w:i w:val="0"/>
+          <w:sz w:val="22"/>
+        </w:rPr>
+        <w:t>✗ “does not have the money next month not sure” → No Potential</w:t>
+      </w:r>
+    </w:p>
+    <w:p>
+      <w:pPr>
+        <w:pStyle w:val="Heading2"/>
+      </w:pPr>
+      <w:r>
+        <w:rPr>
+          <w:rFonts w:ascii="Calibri" w:hAnsi="Calibri" w:eastAsia="Calibri"/>
+          <w:b/>
+          <w:i w:val="0"/>
+          <w:color w:val="2C5282"/>
+          <w:sz w:val="28"/>
+        </w:rPr>
+        <w:t>3.2 Call Again mı, Recall mı?</w:t>
+      </w:r>
+    </w:p>
+    <w:p>
+      <w:pPr>
+        <w:pStyle w:val="ListBullet"/>
+        <w:spacing w:after="40"/>
+      </w:pPr>
+      <w:r>
+        <w:rPr>
+          <w:rFonts w:ascii="Calibri" w:hAnsi="Calibri" w:eastAsia="Calibri"/>
+          <w:b w:val="0"/>
+          <w:i w:val="0"/>
+          <w:sz w:val="22"/>
+        </w:rPr>
+        <w:t>Müşteri “beni ara” / meşgul ama açık kapı → Call Again</w:t>
+      </w:r>
+    </w:p>
+    <w:p>
+      <w:pPr>
+        <w:pStyle w:val="ListBullet"/>
+        <w:spacing w:after="40"/>
+      </w:pPr>
+      <w:r>
+        <w:rPr>
+          <w:rFonts w:ascii="Calibri" w:hAnsi="Calibri" w:eastAsia="Calibri"/>
+          <w:b w:val="0"/>
+          <w:i w:val="0"/>
+          <w:sz w:val="22"/>
+        </w:rPr>
+        <w:t>Müşteri “istemiyorum / kendim yaparım / ilgilenmiyorum” → Recall</w:t>
+      </w:r>
+    </w:p>
+    <w:p>
+      <w:pPr>
+        <w:pStyle w:val="ListBullet"/>
+        <w:spacing w:after="40"/>
+      </w:pPr>
+      <w:r>
+        <w:rPr>
+          <w:rFonts w:ascii="Calibri" w:hAnsi="Calibri" w:eastAsia="Calibri"/>
+          <w:b w:val="0"/>
+          <w:i w:val="0"/>
+          <w:sz w:val="22"/>
+        </w:rPr>
+        <w:t>Agent cb:vm yazmış ama müşteri red demiş → Recall (agent notu Call Again yapmaz)</w:t>
+      </w:r>
+    </w:p>
+    <w:p>
+      <w:pPr>
+        <w:pStyle w:val="Heading2"/>
+      </w:pPr>
+      <w:r>
+        <w:rPr>
+          <w:rFonts w:ascii="Calibri" w:hAnsi="Calibri" w:eastAsia="Calibri"/>
+          <w:b/>
+          <w:i w:val="0"/>
+          <w:color w:val="2C5282"/>
+          <w:sz w:val="28"/>
+        </w:rPr>
+        <w:t>3.3 Recall mı, No Interest mı?</w:t>
+      </w:r>
+    </w:p>
+    <w:p>
+      <w:pPr>
+        <w:pStyle w:val="ListBullet"/>
+        <w:spacing w:after="40"/>
+      </w:pPr>
+      <w:r>
+        <w:rPr>
+          <w:rFonts w:ascii="Calibri" w:hAnsi="Calibri" w:eastAsia="Calibri"/>
+          <w:b w:val="0"/>
+          <w:i w:val="0"/>
+          <w:sz w:val="22"/>
+        </w:rPr>
+        <w:t>1. red günü → Recall</w:t>
+      </w:r>
+    </w:p>
+    <w:p>
+      <w:pPr>
+        <w:pStyle w:val="ListBullet"/>
+        <w:spacing w:after="40"/>
+      </w:pPr>
+      <w:r>
+        <w:rPr>
+          <w:rFonts w:ascii="Calibri" w:hAnsi="Calibri" w:eastAsia="Calibri"/>
+          <w:b w:val="0"/>
+          <w:i w:val="0"/>
+          <w:sz w:val="22"/>
+        </w:rPr>
+        <w:t>2. red günü (veya küfür+istemiyorum) → No Interest</w:t>
+      </w:r>
+    </w:p>
+    <w:p>
+      <w:pPr>
+        <w:pStyle w:val="Heading2"/>
+      </w:pPr>
+      <w:r>
+        <w:rPr>
+          <w:rFonts w:ascii="Calibri" w:hAnsi="Calibri" w:eastAsia="Calibri"/>
+          <w:b/>
+          <w:i w:val="0"/>
+          <w:color w:val="2C5282"/>
+          <w:sz w:val="28"/>
+        </w:rPr>
+        <w:t>3.4 No Answer mı, Wrong Number mı?</w:t>
+      </w:r>
+    </w:p>
+    <w:p>
+      <w:pPr>
+        <w:pStyle w:val="ListBullet"/>
+        <w:spacing w:after="40"/>
+      </w:pPr>
+      <w:r>
+        <w:rPr>
+          <w:rFonts w:ascii="Calibri" w:hAnsi="Calibri" w:eastAsia="Calibri"/>
+          <w:b w:val="0"/>
+          <w:i w:val="0"/>
+          <w:sz w:val="22"/>
+        </w:rPr>
+        <w:t>Telefon çalıyor / VM / NA → No Answer</w:t>
+      </w:r>
+    </w:p>
+    <w:p>
+      <w:pPr>
+        <w:pStyle w:val="ListBullet"/>
+        <w:spacing w:after="40"/>
+      </w:pPr>
+      <w:r>
+        <w:rPr>
+          <w:rFonts w:ascii="Calibri" w:hAnsi="Calibri" w:eastAsia="Calibri"/>
+          <w:b w:val="0"/>
+          <w:i w:val="0"/>
+          <w:sz w:val="22"/>
+        </w:rPr>
+        <w:t>Numara geçersiz / servis dışı / ikinci kimlik inkârı günü → Wrong Number</w:t>
+      </w:r>
+    </w:p>
+    <w:p>
+      <w:pPr>
+        <w:pStyle w:val="ListBullet"/>
+        <w:spacing w:after="40"/>
+      </w:pPr>
+      <w:r>
+        <w:rPr>
+          <w:rFonts w:ascii="Calibri" w:hAnsi="Calibri" w:eastAsia="Calibri"/>
+          <w:b w:val="0"/>
+          <w:i w:val="0"/>
+          <w:sz w:val="22"/>
+        </w:rPr>
+        <w:t>Eski satırda Invalid email, yenide ring → No Answer</w:t>
+      </w:r>
+    </w:p>
+    <w:p>
+      <w:pPr>
+        <w:pStyle w:val="Heading2"/>
+      </w:pPr>
+      <w:r>
+        <w:rPr>
+          <w:rFonts w:ascii="Calibri" w:hAnsi="Calibri" w:eastAsia="Calibri"/>
+          <w:b/>
+          <w:i w:val="0"/>
+          <w:color w:val="2C5282"/>
+          <w:sz w:val="28"/>
+        </w:rPr>
+        <w:t>3.5 No Language mı, Denied Registration mı?</w:t>
+      </w:r>
+    </w:p>
+    <w:p>
+      <w:pPr>
+        <w:pStyle w:val="ListBullet"/>
+        <w:spacing w:after="40"/>
+      </w:pPr>
+      <w:r>
+        <w:rPr>
+          <w:rFonts w:ascii="Calibri" w:hAnsi="Calibri" w:eastAsia="Calibri"/>
+          <w:b w:val="0"/>
+          <w:i w:val="0"/>
+          <w:sz w:val="22"/>
+        </w:rPr>
+        <w:t>Sadece dil → No Language</w:t>
+      </w:r>
+    </w:p>
+    <w:p>
+      <w:pPr>
+        <w:pStyle w:val="ListBullet"/>
+        <w:spacing w:after="40"/>
+      </w:pPr>
+      <w:r>
+        <w:rPr>
+          <w:rFonts w:ascii="Calibri" w:hAnsi="Calibri" w:eastAsia="Calibri"/>
+          <w:b w:val="0"/>
+          <w:i w:val="0"/>
+          <w:sz w:val="22"/>
+        </w:rPr>
+        <w:t>“Ben o değilim” (+ dil olsa bile) → Denied Registration</w:t>
+      </w:r>
+    </w:p>
+    <w:p>
+      <w:pPr>
+        <w:pStyle w:val="Heading2"/>
+      </w:pPr>
+      <w:r>
+        <w:rPr>
+          <w:rFonts w:ascii="Calibri" w:hAnsi="Calibri" w:eastAsia="Calibri"/>
+          <w:b/>
+          <w:i w:val="0"/>
+          <w:color w:val="2C5282"/>
+          <w:sz w:val="28"/>
+        </w:rPr>
+        <w:t>3.6 Denied Registration mı, Recall mı, NP-docs mı?</w:t>
+      </w:r>
+    </w:p>
+    <w:p>
+      <w:pPr>
+        <w:pStyle w:val="ListBullet"/>
+        <w:spacing w:after="40"/>
+      </w:pPr>
+      <w:r>
+        <w:rPr>
+          <w:rFonts w:ascii="Calibri" w:hAnsi="Calibri" w:eastAsia="Calibri"/>
+          <w:b w:val="0"/>
+          <w:i w:val="0"/>
+          <w:sz w:val="22"/>
+        </w:rPr>
+        <w:t>Kimlik inkârı → Denied</w:t>
+      </w:r>
+    </w:p>
+    <w:p>
+      <w:pPr>
+        <w:pStyle w:val="ListBullet"/>
+        <w:spacing w:after="40"/>
+      </w:pPr>
+      <w:r>
+        <w:rPr>
+          <w:rFonts w:ascii="Calibri" w:hAnsi="Calibri" w:eastAsia="Calibri"/>
+          <w:b w:val="0"/>
+          <w:i w:val="0"/>
+          <w:sz w:val="22"/>
+        </w:rPr>
+        <w:t>Bare “didnt register” → Recall</w:t>
+      </w:r>
+    </w:p>
+    <w:p>
+      <w:pPr>
+        <w:pStyle w:val="ListBullet"/>
+        <w:spacing w:after="40"/>
+      </w:pPr>
+      <w:r>
+        <w:rPr>
+          <w:rFonts w:ascii="Calibri" w:hAnsi="Calibri" w:eastAsia="Calibri"/>
+          <w:b w:val="0"/>
+          <w:i w:val="0"/>
+          <w:sz w:val="22"/>
+        </w:rPr>
+        <w:t>no id / no documents / no bank → No Potential - no documents</w:t>
+      </w:r>
+    </w:p>
+    <w:p>
+      <w:pPr>
+        <w:pStyle w:val="Heading1"/>
+      </w:pPr>
+      <w:r>
+        <w:rPr>
+          <w:rFonts w:ascii="Calibri" w:hAnsi="Calibri" w:eastAsia="Calibri"/>
+          <w:b/>
+          <w:i w:val="0"/>
+          <w:color w:val="1A365D"/>
+          <w:sz w:val="36"/>
+        </w:rPr>
+        <w:t>4. Agent notu ≠ müşteri sözü</w:t>
+      </w:r>
+    </w:p>
+    <w:p>
+      <w:pPr>
+        <w:spacing w:after="120"/>
+      </w:pPr>
+      <w:r>
+        <w:rPr>
+          <w:rFonts w:ascii="Calibri" w:hAnsi="Calibri" w:eastAsia="Calibri"/>
+          <w:b w:val="0"/>
+          <w:i w:val="0"/>
+          <w:color w:val="444444"/>
+          <w:sz w:val="22"/>
+        </w:rPr>
+        <w:t>Şunlar agent’ın kendi arama kaydıdır. Müşteri “beni ara” demiş sayılmaz:</w:t>
+      </w:r>
+    </w:p>
+    <w:p>
+      <w:pPr>
+        <w:pStyle w:val="ListBullet"/>
+        <w:spacing w:after="40"/>
+      </w:pPr>
+      <w:r>
+        <w:rPr>
+          <w:rFonts w:ascii="Calibri" w:hAnsi="Calibri" w:eastAsia="Calibri"/>
+          <w:b w:val="0"/>
+          <w:i w:val="0"/>
+          <w:sz w:val="22"/>
+        </w:rPr>
+        <w:t>cb : vm  /  cb na  /  cb ndt  /  cb rej  /  call again rej</w:t>
+      </w:r>
+    </w:p>
+    <w:p>
+      <w:pPr>
+        <w:pStyle w:val="ListBullet"/>
+        <w:spacing w:after="40"/>
+      </w:pPr>
+      <w:r>
+        <w:rPr>
+          <w:rFonts w:ascii="Calibri" w:hAnsi="Calibri" w:eastAsia="Calibri"/>
+          <w:b w:val="0"/>
+          <w:i w:val="0"/>
+          <w:sz w:val="22"/>
+        </w:rPr>
+        <w:t>CALLED BACK PUHU  /  when I tried to cb she rejected</w:t>
+      </w:r>
+    </w:p>
+    <w:p>
+      <w:pPr>
+        <w:pStyle w:val="ListBullet"/>
+        <w:spacing w:after="40"/>
+      </w:pPr>
+      <w:r>
+        <w:rPr>
+          <w:rFonts w:ascii="Calibri" w:hAnsi="Calibri" w:eastAsia="Calibri"/>
+          <w:b w:val="0"/>
+          <w:i w:val="0"/>
+          <w:sz w:val="22"/>
+        </w:rPr>
+        <w:t>I said I would hang up and call back</w:t>
+      </w:r>
+    </w:p>
+    <w:p>
+      <w:pPr>
+        <w:spacing w:after="120"/>
+      </w:pPr>
+      <w:r>
+        <w:rPr>
+          <w:rFonts w:ascii="Calibri" w:hAnsi="Calibri" w:eastAsia="Calibri"/>
+          <w:b w:val="0"/>
+          <w:i w:val="0"/>
+          <w:color w:val="444444"/>
+          <w:sz w:val="22"/>
+        </w:rPr>
+        <w:t>Ne yapmalısın? Bu notları silip düşün: geriye müşteri ne demiş? O cümle status’u belirler.</w:t>
+      </w:r>
+    </w:p>
+    <w:p>
+      <w:pPr>
+        <w:pStyle w:val="Heading1"/>
+      </w:pPr>
+      <w:r>
+        <w:rPr>
+          <w:rFonts w:ascii="Calibri" w:hAnsi="Calibri" w:eastAsia="Calibri"/>
+          <w:b/>
+          <w:i w:val="0"/>
+          <w:color w:val="1A365D"/>
+          <w:sz w:val="36"/>
+        </w:rPr>
+        <w:t>5. Yorum okuma alışkanlığı</w:t>
+      </w:r>
+    </w:p>
+    <w:p>
+      <w:pPr>
+        <w:pStyle w:val="ListNumber"/>
+        <w:spacing w:after="40"/>
+      </w:pPr>
+      <w:r>
+        <w:rPr>
+          <w:rFonts w:ascii="Calibri" w:hAnsi="Calibri" w:eastAsia="Calibri"/>
+          <w:b w:val="0"/>
+          <w:i w:val="0"/>
+          <w:sz w:val="22"/>
+        </w:rPr>
+        <w:t>En yeni anlamlı satırı bul (email subject / In Progress / tek başına status etiketi değil).</w:t>
+      </w:r>
+    </w:p>
+    <w:p>
+      <w:pPr>
+        <w:pStyle w:val="ListNumber"/>
+        <w:spacing w:after="40"/>
+      </w:pPr>
+      <w:r>
+        <w:rPr>
+          <w:rFonts w:ascii="Calibri" w:hAnsi="Calibri" w:eastAsia="Calibri"/>
+          <w:b w:val="0"/>
+          <w:i w:val="0"/>
+          <w:sz w:val="22"/>
+        </w:rPr>
+        <w:t>Agent dial notunu ayıkla.</w:t>
+      </w:r>
+    </w:p>
+    <w:p>
+      <w:pPr>
+        <w:pStyle w:val="ListNumber"/>
+        <w:spacing w:after="40"/>
+      </w:pPr>
+      <w:r>
+        <w:rPr>
+          <w:rFonts w:ascii="Calibri" w:hAnsi="Calibri" w:eastAsia="Calibri"/>
+          <w:b w:val="0"/>
+          <w:i w:val="0"/>
+          <w:sz w:val="22"/>
+        </w:rPr>
+        <w:t>Öncelik ağacını uygula (bölüm 1).</w:t>
+      </w:r>
+    </w:p>
+    <w:p>
+      <w:pPr>
+        <w:pStyle w:val="ListNumber"/>
+        <w:spacing w:after="40"/>
+      </w:pPr>
+      <w:r>
+        <w:rPr>
+          <w:rFonts w:ascii="Calibri" w:hAnsi="Calibri" w:eastAsia="Calibri"/>
+          <w:b w:val="0"/>
+          <w:i w:val="0"/>
+          <w:sz w:val="22"/>
+        </w:rPr>
+        <w:t>Şüphen varsa: Manual Check — uydurma status koyma.</w:t>
+      </w:r>
+    </w:p>
+    <w:p>
+      <w:pPr>
+        <w:pStyle w:val="ListNumber"/>
+        <w:spacing w:after="40"/>
+      </w:pPr>
+      <w:r>
+        <w:rPr>
+          <w:rFonts w:ascii="Calibri" w:hAnsi="Calibri" w:eastAsia="Calibri"/>
+          <w:b w:val="0"/>
+          <w:i w:val="0"/>
+          <w:sz w:val="22"/>
+        </w:rPr>
+        <w:t>CRM’de zaten doğru bir nihai status varsa ve yeni yorum çelişmiyorsa değiştirme.</w:t>
+      </w:r>
+    </w:p>
+    <w:p>
+      <w:pPr>
+        <w:pStyle w:val="Heading1"/>
+      </w:pPr>
+      <w:r>
+        <w:rPr>
+          <w:rFonts w:ascii="Calibri" w:hAnsi="Calibri" w:eastAsia="Calibri"/>
+          <w:b/>
+          <w:i w:val="0"/>
+          <w:color w:val="1A365D"/>
+          <w:sz w:val="36"/>
+        </w:rPr>
+        <w:t>6. Cep kartı (özet tablo)</w:t>
+      </w:r>
+    </w:p>
+    <w:tbl>
+      <w:tblPr>
+        <w:tblStyle w:val="TableGrid"/>
+        <w:tblW w:type="auto" w:w="0"/>
+        <w:tblLook w:firstColumn="1" w:firstRow="1" w:lastColumn="0" w:lastRow="0" w:noHBand="0" w:noVBand="1" w:val="04A0"/>
+      </w:tblPr>
+      <w:tblGrid>
+        <w:gridCol w:w="3324"/>
+        <w:gridCol w:w="3324"/>
+        <w:gridCol w:w="3324"/>
+      </w:tblGrid>
+      <w:tr>
+        <w:tc>
+          <w:tcPr>
+            <w:tcW w:type="dxa" w:w="3324"/>
+          </w:tcPr>
+          <w:p>
+            <w:r>
+              <w:rPr>
+                <w:rFonts w:ascii="Calibri" w:hAnsi="Calibri" w:eastAsia="Calibri"/>
+                <w:b/>
+                <w:i w:val="0"/>
+                <w:color w:val="1A365D"/>
+                <w:sz w:val="20"/>
+              </w:rPr>
+              <w:t>Gördüğün sinyal</w:t>
+            </w:r>
+          </w:p>
+        </w:tc>
+        <w:tc>
+          <w:tcPr>
+            <w:tcW w:type="dxa" w:w="3324"/>
+          </w:tcPr>
+          <w:p>
+            <w:r>
+              <w:rPr>
+                <w:rFonts w:ascii="Calibri" w:hAnsi="Calibri" w:eastAsia="Calibri"/>
+                <w:b/>
+                <w:i w:val="0"/>
+                <w:color w:val="1A365D"/>
+                <w:sz w:val="20"/>
+              </w:rPr>
+              <w:t>Status</w:t>
+            </w:r>
+          </w:p>
+        </w:tc>
+        <w:tc>
+          <w:tcPr>
+            <w:tcW w:type="dxa" w:w="3324"/>
+          </w:tcPr>
+          <w:p>
+            <w:r>
+              <w:rPr>
+                <w:rFonts w:ascii="Calibri" w:hAnsi="Calibri" w:eastAsia="Calibri"/>
+                <w:b/>
+                <w:i w:val="0"/>
+                <w:color w:val="1A365D"/>
+                <w:sz w:val="20"/>
+              </w:rPr>
+              <w:t>Dikkat</w:t>
+            </w:r>
+          </w:p>
+        </w:tc>
+      </w:tr>
+      <w:tr>
+        <w:tc>
+          <w:tcPr>
+            <w:tcW w:type="dxa" w:w="3324"/>
+          </w:tcPr>
+          <w:p>
+            <w:r>
+              <w:rPr>
+                <w:rFonts w:ascii="Calibri" w:hAnsi="Calibri" w:eastAsia="Calibri"/>
+                <w:b w:val="0"/>
+                <w:i w:val="0"/>
+                <w:sz w:val="18"/>
+              </w:rPr>
+              <w:t>call me later / busy call back</w:t>
+            </w:r>
+          </w:p>
+        </w:tc>
+        <w:tc>
+          <w:tcPr>
+            <w:tcW w:type="dxa" w:w="3324"/>
+          </w:tcPr>
+          <w:p>
+            <w:r>
+              <w:rPr>
+                <w:rFonts w:ascii="Calibri" w:hAnsi="Calibri" w:eastAsia="Calibri"/>
+                <w:b w:val="0"/>
+                <w:i w:val="0"/>
+                <w:sz w:val="18"/>
+              </w:rPr>
+              <w:t>Call Again</w:t>
+            </w:r>
+          </w:p>
+        </w:tc>
+        <w:tc>
+          <w:tcPr>
+            <w:tcW w:type="dxa" w:w="3324"/>
+          </w:tcPr>
+          <w:p>
+            <w:r>
+              <w:rPr>
+                <w:rFonts w:ascii="Calibri" w:hAnsi="Calibri" w:eastAsia="Calibri"/>
+                <w:b w:val="0"/>
+                <w:i w:val="0"/>
+                <w:sz w:val="18"/>
+              </w:rPr>
+              <w:t>Agent cb:vm değil</w:t>
+            </w:r>
+          </w:p>
+        </w:tc>
+      </w:tr>
+      <w:tr>
+        <w:tc>
+          <w:tcPr>
+            <w:tcW w:type="dxa" w:w="3324"/>
+          </w:tcPr>
+          <w:p>
+            <w:r>
+              <w:rPr>
+                <w:rFonts w:ascii="Calibri" w:hAnsi="Calibri" w:eastAsia="Calibri"/>
+                <w:b w:val="0"/>
+                <w:i w:val="0"/>
+                <w:sz w:val="18"/>
+              </w:rPr>
+              <w:t>no money + salary soon / arrange</w:t>
+            </w:r>
+          </w:p>
+        </w:tc>
+        <w:tc>
+          <w:tcPr>
+            <w:tcW w:type="dxa" w:w="3324"/>
+          </w:tcPr>
+          <w:p>
+            <w:r>
+              <w:rPr>
+                <w:rFonts w:ascii="Calibri" w:hAnsi="Calibri" w:eastAsia="Calibri"/>
+                <w:b w:val="0"/>
+                <w:i w:val="0"/>
+                <w:sz w:val="18"/>
+              </w:rPr>
+              <w:t>Call Again</w:t>
+            </w:r>
+          </w:p>
+        </w:tc>
+        <w:tc>
+          <w:tcPr>
+            <w:tcW w:type="dxa" w:w="3324"/>
+          </w:tcPr>
+          <w:p>
+            <w:r>
+              <w:rPr>
+                <w:rFonts w:ascii="Calibri" w:hAnsi="Calibri" w:eastAsia="Calibri"/>
+                <w:b w:val="0"/>
+                <w:i w:val="0"/>
+                <w:sz w:val="18"/>
+              </w:rPr>
+              <w:t>Soft money</w:t>
+            </w:r>
+          </w:p>
+        </w:tc>
+      </w:tr>
+      <w:tr>
+        <w:tc>
+          <w:tcPr>
+            <w:tcW w:type="dxa" w:w="3324"/>
+          </w:tcPr>
+          <w:p>
+            <w:r>
+              <w:rPr>
+                <w:rFonts w:ascii="Calibri" w:hAnsi="Calibri" w:eastAsia="Calibri"/>
+                <w:b w:val="0"/>
+                <w:i w:val="0"/>
+                <w:sz w:val="18"/>
+              </w:rPr>
+              <w:t>no money + next month / October</w:t>
+            </w:r>
+          </w:p>
+        </w:tc>
+        <w:tc>
+          <w:tcPr>
+            <w:tcW w:type="dxa" w:w="3324"/>
+          </w:tcPr>
+          <w:p>
+            <w:r>
+              <w:rPr>
+                <w:rFonts w:ascii="Calibri" w:hAnsi="Calibri" w:eastAsia="Calibri"/>
+                <w:b w:val="0"/>
+                <w:i w:val="0"/>
+                <w:sz w:val="18"/>
+              </w:rPr>
+              <w:t>No Potential</w:t>
+            </w:r>
+          </w:p>
+        </w:tc>
+        <w:tc>
+          <w:tcPr>
+            <w:tcW w:type="dxa" w:w="3324"/>
+          </w:tcPr>
+          <w:p>
+            <w:r>
+              <w:rPr>
+                <w:rFonts w:ascii="Calibri" w:hAnsi="Calibri" w:eastAsia="Calibri"/>
+                <w:b w:val="0"/>
+                <w:i w:val="0"/>
+                <w:sz w:val="18"/>
+              </w:rPr>
+              <w:t>Hard / distant</w:t>
+            </w:r>
+          </w:p>
+        </w:tc>
+      </w:tr>
+      <w:tr>
+        <w:tc>
+          <w:tcPr>
+            <w:tcW w:type="dxa" w:w="3324"/>
+          </w:tcPr>
+          <w:p>
+            <w:r>
+              <w:rPr>
+                <w:rFonts w:ascii="Calibri" w:hAnsi="Calibri" w:eastAsia="Calibri"/>
+                <w:b w:val="0"/>
+                <w:i w:val="0"/>
+                <w:sz w:val="18"/>
+              </w:rPr>
+              <w:t>not interested (1. gün)</w:t>
+            </w:r>
+          </w:p>
+        </w:tc>
+        <w:tc>
+          <w:tcPr>
+            <w:tcW w:type="dxa" w:w="3324"/>
+          </w:tcPr>
+          <w:p>
+            <w:r>
+              <w:rPr>
+                <w:rFonts w:ascii="Calibri" w:hAnsi="Calibri" w:eastAsia="Calibri"/>
+                <w:b w:val="0"/>
+                <w:i w:val="0"/>
+                <w:sz w:val="18"/>
+              </w:rPr>
+              <w:t>Recall</w:t>
+            </w:r>
+          </w:p>
+        </w:tc>
+        <w:tc>
+          <w:tcPr>
+            <w:tcW w:type="dxa" w:w="3324"/>
+          </w:tcPr>
+          <w:p>
+            <w:r>
+              <w:rPr>
+                <w:rFonts w:ascii="Calibri" w:hAnsi="Calibri" w:eastAsia="Calibri"/>
+                <w:b w:val="0"/>
+                <w:i w:val="0"/>
+                <w:sz w:val="18"/>
+              </w:rPr>
+              <w:t>2. gün → No Interest</w:t>
+            </w:r>
+          </w:p>
+        </w:tc>
+      </w:tr>
+      <w:tr>
+        <w:tc>
+          <w:tcPr>
+            <w:tcW w:type="dxa" w:w="3324"/>
+          </w:tcPr>
+          <w:p>
+            <w:r>
+              <w:rPr>
+                <w:rFonts w:ascii="Calibri" w:hAnsi="Calibri" w:eastAsia="Calibri"/>
+                <w:b w:val="0"/>
+                <w:i w:val="0"/>
+                <w:sz w:val="18"/>
+              </w:rPr>
+              <w:t>curse + istemiyorum</w:t>
+            </w:r>
+          </w:p>
+        </w:tc>
+        <w:tc>
+          <w:tcPr>
+            <w:tcW w:type="dxa" w:w="3324"/>
+          </w:tcPr>
+          <w:p>
+            <w:r>
+              <w:rPr>
+                <w:rFonts w:ascii="Calibri" w:hAnsi="Calibri" w:eastAsia="Calibri"/>
+                <w:b w:val="0"/>
+                <w:i w:val="0"/>
+                <w:sz w:val="18"/>
+              </w:rPr>
+              <w:t>No Interest</w:t>
+            </w:r>
+          </w:p>
+        </w:tc>
+        <w:tc>
+          <w:tcPr>
+            <w:tcW w:type="dxa" w:w="3324"/>
+          </w:tcPr>
+          <w:p>
+            <w:r>
+              <w:rPr>
+                <w:rFonts w:ascii="Calibri" w:hAnsi="Calibri" w:eastAsia="Calibri"/>
+                <w:b w:val="0"/>
+                <w:i w:val="0"/>
+                <w:sz w:val="18"/>
+              </w:rPr>
+              <w:t>Doğrudan</w:t>
+            </w:r>
+          </w:p>
+        </w:tc>
+      </w:tr>
+      <w:tr>
+        <w:tc>
+          <w:tcPr>
+            <w:tcW w:type="dxa" w:w="3324"/>
+          </w:tcPr>
+          <w:p>
+            <w:r>
+              <w:rPr>
+                <w:rFonts w:ascii="Calibri" w:hAnsi="Calibri" w:eastAsia="Calibri"/>
+                <w:b w:val="0"/>
+                <w:i w:val="0"/>
+                <w:sz w:val="18"/>
+              </w:rPr>
+              <w:t>im not [name] / wrong person</w:t>
+            </w:r>
+          </w:p>
+        </w:tc>
+        <w:tc>
+          <w:tcPr>
+            <w:tcW w:type="dxa" w:w="3324"/>
+          </w:tcPr>
+          <w:p>
+            <w:r>
+              <w:rPr>
+                <w:rFonts w:ascii="Calibri" w:hAnsi="Calibri" w:eastAsia="Calibri"/>
+                <w:b w:val="0"/>
+                <w:i w:val="0"/>
+                <w:sz w:val="18"/>
+              </w:rPr>
+              <w:t>Denied Registration</w:t>
+            </w:r>
+          </w:p>
+        </w:tc>
+        <w:tc>
+          <w:tcPr>
+            <w:tcW w:type="dxa" w:w="3324"/>
+          </w:tcPr>
+          <w:p>
+            <w:r>
+              <w:rPr>
+                <w:rFonts w:ascii="Calibri" w:hAnsi="Calibri" w:eastAsia="Calibri"/>
+                <w:b w:val="0"/>
+                <w:i w:val="0"/>
+                <w:sz w:val="18"/>
+              </w:rPr>
+              <w:t>Dil olsa bile</w:t>
+            </w:r>
+          </w:p>
+        </w:tc>
+      </w:tr>
+      <w:tr>
+        <w:tc>
+          <w:tcPr>
+            <w:tcW w:type="dxa" w:w="3324"/>
+          </w:tcPr>
+          <w:p>
+            <w:r>
+              <w:rPr>
+                <w:rFonts w:ascii="Calibri" w:hAnsi="Calibri" w:eastAsia="Calibri"/>
+                <w:b w:val="0"/>
+                <w:i w:val="0"/>
+                <w:sz w:val="18"/>
+              </w:rPr>
+              <w:t>Mandarin / no English (kimlik yok)</w:t>
+            </w:r>
+          </w:p>
+        </w:tc>
+        <w:tc>
+          <w:tcPr>
+            <w:tcW w:type="dxa" w:w="3324"/>
+          </w:tcPr>
+          <w:p>
+            <w:r>
+              <w:rPr>
+                <w:rFonts w:ascii="Calibri" w:hAnsi="Calibri" w:eastAsia="Calibri"/>
+                <w:b w:val="0"/>
+                <w:i w:val="0"/>
+                <w:sz w:val="18"/>
+              </w:rPr>
+              <w:t>No Language</w:t>
+            </w:r>
+          </w:p>
+        </w:tc>
+        <w:tc>
+          <w:tcPr>
+            <w:tcW w:type="dxa" w:w="3324"/>
+          </w:tcPr>
+          <w:p>
+            <w:r>
+              <w:rPr>
+                <w:rFonts w:ascii="Calibri" w:hAnsi="Calibri" w:eastAsia="Calibri"/>
+                <w:b w:val="0"/>
+                <w:i w:val="0"/>
+                <w:sz w:val="18"/>
+              </w:rPr>
+              <w:t>identity &gt; language</w:t>
+            </w:r>
+          </w:p>
+        </w:tc>
+      </w:tr>
+      <w:tr>
+        <w:tc>
+          <w:tcPr>
+            <w:tcW w:type="dxa" w:w="3324"/>
+          </w:tcPr>
+          <w:p>
+            <w:r>
+              <w:rPr>
+                <w:rFonts w:ascii="Calibri" w:hAnsi="Calibri" w:eastAsia="Calibri"/>
+                <w:b w:val="0"/>
+                <w:i w:val="0"/>
+                <w:sz w:val="18"/>
+              </w:rPr>
+              <w:t>didnt register (kimlik yok)</w:t>
+            </w:r>
+          </w:p>
+        </w:tc>
+        <w:tc>
+          <w:tcPr>
+            <w:tcW w:type="dxa" w:w="3324"/>
+          </w:tcPr>
+          <w:p>
+            <w:r>
+              <w:rPr>
+                <w:rFonts w:ascii="Calibri" w:hAnsi="Calibri" w:eastAsia="Calibri"/>
+                <w:b w:val="0"/>
+                <w:i w:val="0"/>
+                <w:sz w:val="18"/>
+              </w:rPr>
+              <w:t>Recall</w:t>
+            </w:r>
+          </w:p>
+        </w:tc>
+        <w:tc>
+          <w:tcPr>
+            <w:tcW w:type="dxa" w:w="3324"/>
+          </w:tcPr>
+          <w:p>
+            <w:r>
+              <w:rPr>
+                <w:rFonts w:ascii="Calibri" w:hAnsi="Calibri" w:eastAsia="Calibri"/>
+                <w:b w:val="0"/>
+                <w:i w:val="0"/>
+                <w:sz w:val="18"/>
+              </w:rPr>
+              <w:t>Denied değil</w:t>
+            </w:r>
+          </w:p>
+        </w:tc>
+      </w:tr>
+      <w:tr>
+        <w:tc>
+          <w:tcPr>
+            <w:tcW w:type="dxa" w:w="3324"/>
+          </w:tcPr>
+          <w:p>
+            <w:r>
+              <w:rPr>
+                <w:rFonts w:ascii="Calibri" w:hAnsi="Calibri" w:eastAsia="Calibri"/>
+                <w:b w:val="0"/>
+                <w:i w:val="0"/>
+                <w:sz w:val="18"/>
+              </w:rPr>
+              <w:t>no id / no bank / no POR</w:t>
+            </w:r>
+          </w:p>
+        </w:tc>
+        <w:tc>
+          <w:tcPr>
+            <w:tcW w:type="dxa" w:w="3324"/>
+          </w:tcPr>
+          <w:p>
+            <w:r>
+              <w:rPr>
+                <w:rFonts w:ascii="Calibri" w:hAnsi="Calibri" w:eastAsia="Calibri"/>
+                <w:b w:val="0"/>
+                <w:i w:val="0"/>
+                <w:sz w:val="18"/>
+              </w:rPr>
+              <w:t>No Potential - no documents</w:t>
+            </w:r>
+          </w:p>
+        </w:tc>
+        <w:tc>
+          <w:tcPr>
+            <w:tcW w:type="dxa" w:w="3324"/>
+          </w:tcPr>
+          <w:p>
+            <w:r>
+              <w:rPr>
+                <w:rFonts w:ascii="Calibri" w:hAnsi="Calibri" w:eastAsia="Calibri"/>
+                <w:b w:val="0"/>
+                <w:i w:val="0"/>
+                <w:sz w:val="18"/>
+              </w:rPr>
+            </w:r>
+          </w:p>
+        </w:tc>
+      </w:tr>
+      <w:tr>
+        <w:tc>
+          <w:tcPr>
+            <w:tcW w:type="dxa" w:w="3324"/>
+          </w:tcPr>
+          <w:p>
+            <w:r>
+              <w:rPr>
+                <w:rFonts w:ascii="Calibri" w:hAnsi="Calibri" w:eastAsia="Calibri"/>
+                <w:b w:val="0"/>
+                <w:i w:val="0"/>
+                <w:sz w:val="18"/>
+              </w:rPr>
+              <w:t>na / vm / dvm / ring</w:t>
+            </w:r>
+          </w:p>
+        </w:tc>
+        <w:tc>
+          <w:tcPr>
+            <w:tcW w:type="dxa" w:w="3324"/>
+          </w:tcPr>
+          <w:p>
+            <w:r>
+              <w:rPr>
+                <w:rFonts w:ascii="Calibri" w:hAnsi="Calibri" w:eastAsia="Calibri"/>
+                <w:b w:val="0"/>
+                <w:i w:val="0"/>
+                <w:sz w:val="18"/>
+              </w:rPr>
+              <w:t>No Answer 1-5</w:t>
+            </w:r>
+          </w:p>
+        </w:tc>
+        <w:tc>
+          <w:tcPr>
+            <w:tcW w:type="dxa" w:w="3324"/>
+          </w:tcPr>
+          <w:p>
+            <w:r>
+              <w:rPr>
+                <w:rFonts w:ascii="Calibri" w:hAnsi="Calibri" w:eastAsia="Calibri"/>
+                <w:b w:val="0"/>
+                <w:i w:val="0"/>
+                <w:sz w:val="18"/>
+              </w:rPr>
+              <w:t>5+ gün → 5 UP</w:t>
+            </w:r>
+          </w:p>
+        </w:tc>
+      </w:tr>
+      <w:tr>
+        <w:tc>
+          <w:tcPr>
+            <w:tcW w:type="dxa" w:w="3324"/>
+          </w:tcPr>
+          <w:p>
+            <w:r>
+              <w:rPr>
+                <w:rFonts w:ascii="Calibri" w:hAnsi="Calibri" w:eastAsia="Calibri"/>
+                <w:b w:val="0"/>
+                <w:i w:val="0"/>
+                <w:sz w:val="18"/>
+              </w:rPr>
+              <w:t>invalid email + ring/NA</w:t>
+            </w:r>
+          </w:p>
+        </w:tc>
+        <w:tc>
+          <w:tcPr>
+            <w:tcW w:type="dxa" w:w="3324"/>
+          </w:tcPr>
+          <w:p>
+            <w:r>
+              <w:rPr>
+                <w:rFonts w:ascii="Calibri" w:hAnsi="Calibri" w:eastAsia="Calibri"/>
+                <w:b w:val="0"/>
+                <w:i w:val="0"/>
+                <w:sz w:val="18"/>
+              </w:rPr>
+              <w:t>No Answer 1-5</w:t>
+            </w:r>
+          </w:p>
+        </w:tc>
+        <w:tc>
+          <w:tcPr>
+            <w:tcW w:type="dxa" w:w="3324"/>
+          </w:tcPr>
+          <w:p>
+            <w:r>
+              <w:rPr>
+                <w:rFonts w:ascii="Calibri" w:hAnsi="Calibri" w:eastAsia="Calibri"/>
+                <w:b w:val="0"/>
+                <w:i w:val="0"/>
+                <w:sz w:val="18"/>
+              </w:rPr>
+              <w:t>Wrong Number değil</w:t>
+            </w:r>
+          </w:p>
+        </w:tc>
+      </w:tr>
+      <w:tr>
+        <w:tc>
+          <w:tcPr>
+            <w:tcW w:type="dxa" w:w="3324"/>
+          </w:tcPr>
+          <w:p>
+            <w:r>
+              <w:rPr>
+                <w:rFonts w:ascii="Calibri" w:hAnsi="Calibri" w:eastAsia="Calibri"/>
+                <w:b w:val="0"/>
+                <w:i w:val="0"/>
+                <w:sz w:val="18"/>
+              </w:rPr>
+              <w:t>i will do it by myself</w:t>
+            </w:r>
+          </w:p>
+        </w:tc>
+        <w:tc>
+          <w:tcPr>
+            <w:tcW w:type="dxa" w:w="3324"/>
+          </w:tcPr>
+          <w:p>
+            <w:r>
+              <w:rPr>
+                <w:rFonts w:ascii="Calibri" w:hAnsi="Calibri" w:eastAsia="Calibri"/>
+                <w:b w:val="0"/>
+                <w:i w:val="0"/>
+                <w:sz w:val="18"/>
+              </w:rPr>
+              <w:t>Recall</w:t>
+            </w:r>
+          </w:p>
+        </w:tc>
+        <w:tc>
+          <w:tcPr>
+            <w:tcW w:type="dxa" w:w="3324"/>
+          </w:tcPr>
+          <w:p>
+            <w:r>
+              <w:rPr>
+                <w:rFonts w:ascii="Calibri" w:hAnsi="Calibri" w:eastAsia="Calibri"/>
+                <w:b w:val="0"/>
+                <w:i w:val="0"/>
+                <w:sz w:val="18"/>
+              </w:rPr>
+              <w:t>Call Again değil</w:t>
+            </w:r>
+          </w:p>
+        </w:tc>
+      </w:tr>
+      <w:tr>
+        <w:tc>
+          <w:tcPr>
+            <w:tcW w:type="dxa" w:w="3324"/>
+          </w:tcPr>
+          <w:p>
+            <w:r>
+              <w:rPr>
+                <w:rFonts w:ascii="Calibri" w:hAnsi="Calibri" w:eastAsia="Calibri"/>
+                <w:b w:val="0"/>
+                <w:i w:val="0"/>
+                <w:sz w:val="18"/>
+              </w:rPr>
+              <w:t>CB REJS</w:t>
+            </w:r>
+          </w:p>
+        </w:tc>
+        <w:tc>
+          <w:tcPr>
+            <w:tcW w:type="dxa" w:w="3324"/>
+          </w:tcPr>
+          <w:p>
+            <w:r>
+              <w:rPr>
+                <w:rFonts w:ascii="Calibri" w:hAnsi="Calibri" w:eastAsia="Calibri"/>
+                <w:b w:val="0"/>
+                <w:i w:val="0"/>
+                <w:sz w:val="18"/>
+              </w:rPr>
+              <w:t>No Answer (genelde)</w:t>
+            </w:r>
+          </w:p>
+        </w:tc>
+        <w:tc>
+          <w:tcPr>
+            <w:tcW w:type="dxa" w:w="3324"/>
+          </w:tcPr>
+          <w:p>
+            <w:r>
+              <w:rPr>
+                <w:rFonts w:ascii="Calibri" w:hAnsi="Calibri" w:eastAsia="Calibri"/>
+                <w:b w:val="0"/>
+                <w:i w:val="0"/>
+                <w:sz w:val="18"/>
+              </w:rPr>
+              <w:t>Callback değil</w:t>
+            </w:r>
+          </w:p>
+        </w:tc>
+      </w:tr>
+      <w:tr>
+        <w:tc>
+          <w:tcPr>
+            <w:tcW w:type="dxa" w:w="3324"/>
+          </w:tcPr>
+          <w:p>
+            <w:r>
+              <w:rPr>
+                <w:rFonts w:ascii="Calibri" w:hAnsi="Calibri" w:eastAsia="Calibri"/>
+                <w:b w:val="0"/>
+                <w:i w:val="0"/>
+                <w:sz w:val="18"/>
+              </w:rPr>
+              <w:t>karışık / emin değilim</w:t>
+            </w:r>
+          </w:p>
+        </w:tc>
+        <w:tc>
+          <w:tcPr>
+            <w:tcW w:type="dxa" w:w="3324"/>
+          </w:tcPr>
+          <w:p>
+            <w:r>
+              <w:rPr>
+                <w:rFonts w:ascii="Calibri" w:hAnsi="Calibri" w:eastAsia="Calibri"/>
+                <w:b w:val="0"/>
+                <w:i w:val="0"/>
+                <w:sz w:val="18"/>
+              </w:rPr>
+              <w:t>Manual Check</w:t>
+            </w:r>
+          </w:p>
+        </w:tc>
+        <w:tc>
+          <w:tcPr>
+            <w:tcW w:type="dxa" w:w="3324"/>
+          </w:tcPr>
+          <w:p>
+            <w:r>
+              <w:rPr>
+                <w:rFonts w:ascii="Calibri" w:hAnsi="Calibri" w:eastAsia="Calibri"/>
+                <w:b w:val="0"/>
+                <w:i w:val="0"/>
+                <w:sz w:val="18"/>
+              </w:rPr>
+              <w:t>Uydurma</w:t>
+            </w:r>
+          </w:p>
+        </w:tc>
+      </w:tr>
+    </w:tbl>
+    <w:p/>
+    <w:p>
+      <w:pPr>
+        <w:pStyle w:val="Heading1"/>
+      </w:pPr>
+      <w:r>
+        <w:rPr>
+          <w:rFonts w:ascii="Calibri" w:hAnsi="Calibri" w:eastAsia="Calibri"/>
+          <w:b/>
+          <w:i w:val="0"/>
+          <w:color w:val="1A365D"/>
+          <w:sz w:val="36"/>
+        </w:rPr>
+        <w:t>7. Mini senaryolar (alıştırma)</w:t>
+      </w:r>
+    </w:p>
+    <w:p>
+      <w:pPr>
+        <w:spacing w:after="120"/>
+      </w:pPr>
+      <w:r>
+        <w:rPr>
+          <w:rFonts w:ascii="Calibri" w:hAnsi="Calibri" w:eastAsia="Calibri"/>
+          <w:b/>
+          <w:i w:val="0"/>
+          <w:color w:val="1A365D"/>
+          <w:sz w:val="22"/>
+        </w:rPr>
+        <w:t>Senaryo A</w:t>
+      </w:r>
+    </w:p>
+    <w:p>
+      <w:pPr>
+        <w:spacing w:after="120"/>
+      </w:pPr>
+      <w:r>
+        <w:rPr>
+          <w:rFonts w:ascii="Calibri" w:hAnsi="Calibri" w:eastAsia="Calibri"/>
+          <w:b w:val="0"/>
+          <w:i/>
+          <w:color w:val="444444"/>
+          <w:sz w:val="22"/>
+        </w:rPr>
+        <w:t>Yorum: “pu said to call him later hu”</w:t>
+      </w:r>
+    </w:p>
+    <w:p>
+      <w:pPr>
+        <w:spacing w:after="120"/>
+      </w:pPr>
+      <w:r>
+        <w:rPr>
+          <w:rFonts w:ascii="Calibri" w:hAnsi="Calibri" w:eastAsia="Calibri"/>
+          <w:b w:val="0"/>
+          <w:i w:val="0"/>
+          <w:color w:val="444444"/>
+          <w:sz w:val="22"/>
+        </w:rPr>
+        <w:t>Cevap: Call Again — Müşteri net CB istedi.</w:t>
+      </w:r>
+    </w:p>
+    <w:p>
+      <w:pPr>
+        <w:spacing w:after="120"/>
+      </w:pPr>
+      <w:r>
+        <w:rPr>
+          <w:rFonts w:ascii="Calibri" w:hAnsi="Calibri" w:eastAsia="Calibri"/>
+          <w:b/>
+          <w:i w:val="0"/>
+          <w:color w:val="1A365D"/>
+          <w:sz w:val="22"/>
+        </w:rPr>
+        <w:t>Senaryo B</w:t>
+      </w:r>
+    </w:p>
+    <w:p>
+      <w:pPr>
+        <w:spacing w:after="120"/>
+      </w:pPr>
+      <w:r>
+        <w:rPr>
+          <w:rFonts w:ascii="Calibri" w:hAnsi="Calibri" w:eastAsia="Calibri"/>
+          <w:b w:val="0"/>
+          <w:i/>
+          <w:color w:val="444444"/>
+          <w:sz w:val="22"/>
+        </w:rPr>
+        <w:t>Yorum: “does not have the money next month not sure”</w:t>
+      </w:r>
+    </w:p>
+    <w:p>
+      <w:pPr>
+        <w:spacing w:after="120"/>
+      </w:pPr>
+      <w:r>
+        <w:rPr>
+          <w:rFonts w:ascii="Calibri" w:hAnsi="Calibri" w:eastAsia="Calibri"/>
+          <w:b w:val="0"/>
+          <w:i w:val="0"/>
+          <w:color w:val="444444"/>
+          <w:sz w:val="22"/>
+        </w:rPr>
+        <w:t>Cevap: No Potential — Uzak + belirsiz para.</w:t>
+      </w:r>
+    </w:p>
+    <w:p>
+      <w:pPr>
+        <w:spacing w:after="120"/>
+      </w:pPr>
+      <w:r>
+        <w:rPr>
+          <w:rFonts w:ascii="Calibri" w:hAnsi="Calibri" w:eastAsia="Calibri"/>
+          <w:b/>
+          <w:i w:val="0"/>
+          <w:color w:val="1A365D"/>
+          <w:sz w:val="22"/>
+        </w:rPr>
+        <w:t>Senaryo C</w:t>
+      </w:r>
+    </w:p>
+    <w:p>
+      <w:pPr>
+        <w:spacing w:after="120"/>
+      </w:pPr>
+      <w:r>
+        <w:rPr>
+          <w:rFonts w:ascii="Calibri" w:hAnsi="Calibri" w:eastAsia="Calibri"/>
+          <w:b w:val="0"/>
+          <w:i/>
+          <w:color w:val="444444"/>
+          <w:sz w:val="22"/>
+        </w:rPr>
+        <w:t>Yorum: “no money until salary in a few days then will start”</w:t>
+      </w:r>
+    </w:p>
+    <w:p>
+      <w:pPr>
+        <w:spacing w:after="120"/>
+      </w:pPr>
+      <w:r>
+        <w:rPr>
+          <w:rFonts w:ascii="Calibri" w:hAnsi="Calibri" w:eastAsia="Calibri"/>
+          <w:b w:val="0"/>
+          <w:i w:val="0"/>
+          <w:color w:val="444444"/>
+          <w:sz w:val="22"/>
+        </w:rPr>
+        <w:t>Cevap: Call Again — Soft money + maaş planı.</w:t>
+      </w:r>
+    </w:p>
+    <w:p>
+      <w:pPr>
+        <w:spacing w:after="120"/>
+      </w:pPr>
+      <w:r>
+        <w:rPr>
+          <w:rFonts w:ascii="Calibri" w:hAnsi="Calibri" w:eastAsia="Calibri"/>
+          <w:b/>
+          <w:i w:val="0"/>
+          <w:color w:val="1A365D"/>
+          <w:sz w:val="22"/>
+        </w:rPr>
+        <w:t>Senaryo D</w:t>
+      </w:r>
+    </w:p>
+    <w:p>
+      <w:pPr>
+        <w:spacing w:after="120"/>
+      </w:pPr>
+      <w:r>
+        <w:rPr>
+          <w:rFonts w:ascii="Calibri" w:hAnsi="Calibri" w:eastAsia="Calibri"/>
+          <w:b w:val="0"/>
+          <w:i/>
+          <w:color w:val="444444"/>
+          <w:sz w:val="22"/>
+        </w:rPr>
+        <w:t>Yorum: “not interested (bugün ilk kez)”</w:t>
+      </w:r>
+    </w:p>
+    <w:p>
+      <w:pPr>
+        <w:spacing w:after="120"/>
+      </w:pPr>
+      <w:r>
+        <w:rPr>
+          <w:rFonts w:ascii="Calibri" w:hAnsi="Calibri" w:eastAsia="Calibri"/>
+          <w:b w:val="0"/>
+          <w:i w:val="0"/>
+          <w:color w:val="444444"/>
+          <w:sz w:val="22"/>
+        </w:rPr>
+        <w:t>Cevap: Recall — Tek gün red.</w:t>
+      </w:r>
+    </w:p>
+    <w:p>
+      <w:pPr>
+        <w:spacing w:after="120"/>
+      </w:pPr>
+      <w:r>
+        <w:rPr>
+          <w:rFonts w:ascii="Calibri" w:hAnsi="Calibri" w:eastAsia="Calibri"/>
+          <w:b/>
+          <w:i w:val="0"/>
+          <w:color w:val="1A365D"/>
+          <w:sz w:val="22"/>
+        </w:rPr>
+        <w:t>Senaryo E</w:t>
+      </w:r>
+    </w:p>
+    <w:p>
+      <w:pPr>
+        <w:spacing w:after="120"/>
+      </w:pPr>
+      <w:r>
+        <w:rPr>
+          <w:rFonts w:ascii="Calibri" w:hAnsi="Calibri" w:eastAsia="Calibri"/>
+          <w:b w:val="0"/>
+          <w:i/>
+          <w:color w:val="444444"/>
+          <w:sz w:val="22"/>
+        </w:rPr>
+        <w:t>Yorum: “im not Ahmad please speak Arabic”</w:t>
+      </w:r>
+    </w:p>
+    <w:p>
+      <w:pPr>
+        <w:spacing w:after="120"/>
+      </w:pPr>
+      <w:r>
+        <w:rPr>
+          <w:rFonts w:ascii="Calibri" w:hAnsi="Calibri" w:eastAsia="Calibri"/>
+          <w:b w:val="0"/>
+          <w:i w:val="0"/>
+          <w:color w:val="444444"/>
+          <w:sz w:val="22"/>
+        </w:rPr>
+        <w:t>Cevap: Denied Registration — Kimlik &gt; dil.</w:t>
+      </w:r>
+    </w:p>
+    <w:p>
+      <w:pPr>
+        <w:spacing w:after="120"/>
+      </w:pPr>
+      <w:r>
+        <w:rPr>
+          <w:rFonts w:ascii="Calibri" w:hAnsi="Calibri" w:eastAsia="Calibri"/>
+          <w:b/>
+          <w:i w:val="0"/>
+          <w:color w:val="1A365D"/>
+          <w:sz w:val="22"/>
+        </w:rPr>
+        <w:t>Senaryo F</w:t>
+      </w:r>
+    </w:p>
+    <w:p>
+      <w:pPr>
+        <w:spacing w:after="120"/>
+      </w:pPr>
+      <w:r>
+        <w:rPr>
+          <w:rFonts w:ascii="Calibri" w:hAnsi="Calibri" w:eastAsia="Calibri"/>
+          <w:b w:val="0"/>
+          <w:i/>
+          <w:color w:val="444444"/>
+          <w:sz w:val="22"/>
+        </w:rPr>
+        <w:t>Yorum: “said i didnt register”</w:t>
+      </w:r>
+    </w:p>
+    <w:p>
+      <w:pPr>
+        <w:spacing w:after="120"/>
+      </w:pPr>
+      <w:r>
+        <w:rPr>
+          <w:rFonts w:ascii="Calibri" w:hAnsi="Calibri" w:eastAsia="Calibri"/>
+          <w:b w:val="0"/>
+          <w:i w:val="0"/>
+          <w:color w:val="444444"/>
+          <w:sz w:val="22"/>
+        </w:rPr>
+        <w:t>Cevap: Recall — Kimlik inkârı yok.</w:t>
+      </w:r>
+    </w:p>
+    <w:p>
+      <w:pPr>
+        <w:spacing w:after="120"/>
+      </w:pPr>
+      <w:r>
+        <w:rPr>
+          <w:rFonts w:ascii="Calibri" w:hAnsi="Calibri" w:eastAsia="Calibri"/>
+          <w:b/>
+          <w:i w:val="0"/>
+          <w:color w:val="1A365D"/>
+          <w:sz w:val="22"/>
+        </w:rPr>
+        <w:t>Senaryo G</w:t>
+      </w:r>
+    </w:p>
+    <w:p>
+      <w:pPr>
+        <w:spacing w:after="120"/>
+      </w:pPr>
+      <w:r>
+        <w:rPr>
+          <w:rFonts w:ascii="Calibri" w:hAnsi="Calibri" w:eastAsia="Calibri"/>
+          <w:b w:val="0"/>
+          <w:i/>
+          <w:color w:val="444444"/>
+          <w:sz w:val="22"/>
+        </w:rPr>
+        <w:t>Yorum: “Invalid email - CRM  …  (yeni) ring, dvm”</w:t>
+      </w:r>
+    </w:p>
+    <w:p>
+      <w:pPr>
+        <w:spacing w:after="120"/>
+      </w:pPr>
+      <w:r>
+        <w:rPr>
+          <w:rFonts w:ascii="Calibri" w:hAnsi="Calibri" w:eastAsia="Calibri"/>
+          <w:b w:val="0"/>
+          <w:i w:val="0"/>
+          <w:color w:val="444444"/>
+          <w:sz w:val="22"/>
+        </w:rPr>
+        <w:t>Cevap: No Answer 1-5 — Telefon canlı.</w:t>
+      </w:r>
+    </w:p>
+    <w:p>
+      <w:pPr>
+        <w:spacing w:after="120"/>
+      </w:pPr>
+      <w:r>
+        <w:rPr>
+          <w:rFonts w:ascii="Calibri" w:hAnsi="Calibri" w:eastAsia="Calibri"/>
+          <w:b/>
+          <w:i w:val="0"/>
+          <w:color w:val="1A365D"/>
+          <w:sz w:val="22"/>
+        </w:rPr>
+        <w:t>Senaryo H</w:t>
+      </w:r>
+    </w:p>
+    <w:p>
+      <w:pPr>
+        <w:spacing w:after="120"/>
+      </w:pPr>
+      <w:r>
+        <w:rPr>
+          <w:rFonts w:ascii="Calibri" w:hAnsi="Calibri" w:eastAsia="Calibri"/>
+          <w:b w:val="0"/>
+          <w:i/>
+          <w:color w:val="444444"/>
+          <w:sz w:val="22"/>
+        </w:rPr>
+        <w:t>Yorum: “i will do it by myself”</w:t>
+      </w:r>
+    </w:p>
+    <w:p>
+      <w:pPr>
+        <w:spacing w:after="120"/>
+      </w:pPr>
+      <w:r>
+        <w:rPr>
+          <w:rFonts w:ascii="Calibri" w:hAnsi="Calibri" w:eastAsia="Calibri"/>
+          <w:b w:val="0"/>
+          <w:i w:val="0"/>
+          <w:color w:val="444444"/>
+          <w:sz w:val="22"/>
+        </w:rPr>
+        <w:t>Cevap: Recall — DIY ≠ callback.</w:t>
+      </w:r>
+    </w:p>
+    <w:p>
+      <w:pPr>
+        <w:spacing w:after="120"/>
+      </w:pPr>
+      <w:r>
+        <w:rPr>
+          <w:rFonts w:ascii="Calibri" w:hAnsi="Calibri" w:eastAsia="Calibri"/>
+          <w:b/>
+          <w:i w:val="0"/>
+          <w:color w:val="1A365D"/>
+          <w:sz w:val="22"/>
+        </w:rPr>
+        <w:t>Senaryo I</w:t>
+      </w:r>
+    </w:p>
+    <w:p>
+      <w:pPr>
+        <w:spacing w:after="120"/>
+      </w:pPr>
+      <w:r>
+        <w:rPr>
+          <w:rFonts w:ascii="Calibri" w:hAnsi="Calibri" w:eastAsia="Calibri"/>
+          <w:b w:val="0"/>
+          <w:i/>
+          <w:color w:val="444444"/>
+          <w:sz w:val="22"/>
+        </w:rPr>
+        <w:t>Yorum: “cb : vm   +   never reg and hung up”</w:t>
+      </w:r>
+    </w:p>
+    <w:p>
+      <w:pPr>
+        <w:spacing w:after="120"/>
+      </w:pPr>
+      <w:r>
+        <w:rPr>
+          <w:rFonts w:ascii="Calibri" w:hAnsi="Calibri" w:eastAsia="Calibri"/>
+          <w:b w:val="0"/>
+          <w:i w:val="0"/>
+          <w:color w:val="444444"/>
+          <w:sz w:val="22"/>
+        </w:rPr>
+        <w:t>Cevap: Recall — Agent cb yok sayılır.</w:t>
+      </w:r>
+    </w:p>
+    <w:p>
+      <w:pPr>
+        <w:spacing w:after="120"/>
+      </w:pPr>
+      <w:r>
+        <w:rPr>
+          <w:rFonts w:ascii="Calibri" w:hAnsi="Calibri" w:eastAsia="Calibri"/>
+          <w:b/>
+          <w:i w:val="0"/>
+          <w:color w:val="1A365D"/>
+          <w:sz w:val="22"/>
+        </w:rPr>
+        <w:t>Senaryo J</w:t>
+      </w:r>
+    </w:p>
+    <w:p>
+      <w:pPr>
+        <w:spacing w:after="120"/>
+      </w:pPr>
+      <w:r>
+        <w:rPr>
+          <w:rFonts w:ascii="Calibri" w:hAnsi="Calibri" w:eastAsia="Calibri"/>
+          <w:b w:val="0"/>
+          <w:i/>
+          <w:color w:val="444444"/>
+          <w:sz w:val="22"/>
+        </w:rPr>
+        <w:t>Yorum: “cant afford now but will get help and deposit”</w:t>
+      </w:r>
+    </w:p>
+    <w:p>
+      <w:pPr>
+        <w:spacing w:after="120"/>
+      </w:pPr>
+      <w:r>
+        <w:rPr>
+          <w:rFonts w:ascii="Calibri" w:hAnsi="Calibri" w:eastAsia="Calibri"/>
+          <w:b w:val="0"/>
+          <w:i w:val="0"/>
+          <w:color w:val="444444"/>
+          <w:sz w:val="22"/>
+        </w:rPr>
+        <w:t>Cevap: Call Again — Yakın yardım planı.</w:t>
+      </w:r>
+    </w:p>
+    <w:p>
+      <w:pPr>
+        <w:pStyle w:val="Heading1"/>
+      </w:pPr>
+      <w:r>
+        <w:rPr>
+          <w:rFonts w:ascii="Calibri" w:hAnsi="Calibri" w:eastAsia="Calibri"/>
+          <w:b/>
+          <w:i w:val="0"/>
+          <w:color w:val="1A365D"/>
+          <w:sz w:val="36"/>
+        </w:rPr>
+        <w:t>8. Sık yapılan hatalar</w:t>
+      </w:r>
+    </w:p>
+    <w:p>
+      <w:pPr>
+        <w:pStyle w:val="ListBullet"/>
+        <w:spacing w:after="40"/>
+      </w:pPr>
+      <w:r>
+        <w:rPr>
+          <w:rFonts w:ascii="Calibri" w:hAnsi="Calibri" w:eastAsia="Calibri"/>
+          <w:b w:val="0"/>
+          <w:i w:val="0"/>
+          <w:sz w:val="22"/>
+        </w:rPr>
+        <w:t>✗ next month’u Call Again yapmak</w:t>
+      </w:r>
+    </w:p>
+    <w:p>
+      <w:pPr>
+        <w:pStyle w:val="ListBullet"/>
+        <w:spacing w:after="40"/>
+      </w:pPr>
+      <w:r>
+        <w:rPr>
+          <w:rFonts w:ascii="Calibri" w:hAnsi="Calibri" w:eastAsia="Calibri"/>
+          <w:b w:val="0"/>
+          <w:i w:val="0"/>
+          <w:sz w:val="22"/>
+        </w:rPr>
+        <w:t>✗ Agent cb:vm görünce Call Again yapmak</w:t>
+      </w:r>
+    </w:p>
+    <w:p>
+      <w:pPr>
+        <w:pStyle w:val="ListBullet"/>
+        <w:spacing w:after="40"/>
+      </w:pPr>
+      <w:r>
+        <w:rPr>
+          <w:rFonts w:ascii="Calibri" w:hAnsi="Calibri" w:eastAsia="Calibri"/>
+          <w:b w:val="0"/>
+          <w:i w:val="0"/>
+          <w:sz w:val="22"/>
+        </w:rPr>
+        <w:t>✗ Tek “not interested” ile No Interest basmak</w:t>
+      </w:r>
+    </w:p>
+    <w:p>
+      <w:pPr>
+        <w:pStyle w:val="ListBullet"/>
+        <w:spacing w:after="40"/>
+      </w:pPr>
+      <w:r>
+        <w:rPr>
+          <w:rFonts w:ascii="Calibri" w:hAnsi="Calibri" w:eastAsia="Calibri"/>
+          <w:b w:val="0"/>
+          <w:i w:val="0"/>
+          <w:sz w:val="22"/>
+        </w:rPr>
+        <w:t>✗ didnt register = Denied Registration sanmak</w:t>
+      </w:r>
+    </w:p>
+    <w:p>
+      <w:pPr>
+        <w:pStyle w:val="ListBullet"/>
+        <w:spacing w:after="40"/>
+      </w:pPr>
+      <w:r>
+        <w:rPr>
+          <w:rFonts w:ascii="Calibri" w:hAnsi="Calibri" w:eastAsia="Calibri"/>
+          <w:b w:val="0"/>
+          <w:i w:val="0"/>
+          <w:sz w:val="22"/>
+        </w:rPr>
+        <w:t>✗ Invalid email = Wrong Number (telefon ring iken)</w:t>
+      </w:r>
+    </w:p>
+    <w:p>
+      <w:pPr>
+        <w:pStyle w:val="ListBullet"/>
+        <w:spacing w:after="40"/>
+      </w:pPr>
+      <w:r>
+        <w:rPr>
+          <w:rFonts w:ascii="Calibri" w:hAnsi="Calibri" w:eastAsia="Calibri"/>
+          <w:b w:val="0"/>
+          <w:i w:val="0"/>
+          <w:sz w:val="22"/>
+        </w:rPr>
+        <w:t>✗ Aile çeviri/kart yardımını third_party / Wrong saymak</w:t>
+      </w:r>
+    </w:p>
+    <w:p>
+      <w:pPr>
+        <w:pStyle w:val="ListBullet"/>
+        <w:spacing w:after="40"/>
+      </w:pPr>
+      <w:r>
+        <w:rPr>
+          <w:rFonts w:ascii="Calibri" w:hAnsi="Calibri" w:eastAsia="Calibri"/>
+          <w:b w:val="0"/>
+          <w:i w:val="0"/>
+          <w:sz w:val="22"/>
+        </w:rPr>
+        <w:t>✗ Soft money + maaş planını No Potential yapmak</w:t>
+      </w:r>
+    </w:p>
+    <w:p>
+      <w:pPr>
+        <w:pStyle w:val="ListBullet"/>
+        <w:spacing w:after="40"/>
+      </w:pPr>
+      <w:r>
+        <w:rPr>
+          <w:rFonts w:ascii="Calibri" w:hAnsi="Calibri" w:eastAsia="Calibri"/>
+          <w:b w:val="0"/>
+          <w:i w:val="0"/>
+          <w:sz w:val="22"/>
+        </w:rPr>
+        <w:t>✗ Emin değilken rastgele status uydurmak (Manual Check kullan)</w:t>
+      </w:r>
+    </w:p>
+    <w:p>
+      <w:pPr>
+        <w:pStyle w:val="Heading1"/>
+      </w:pPr>
+      <w:r>
+        <w:rPr>
+          <w:rFonts w:ascii="Calibri" w:hAnsi="Calibri" w:eastAsia="Calibri"/>
+          <w:b/>
+          <w:i w:val="0"/>
+          <w:color w:val="1A365D"/>
+          <w:sz w:val="36"/>
+        </w:rPr>
+        <w:t>9. Kısa sistem notu (bilmen yeterli)</w:t>
+      </w:r>
+    </w:p>
+    <w:p>
+      <w:pPr>
+        <w:spacing w:after="120"/>
+      </w:pPr>
+      <w:r>
+        <w:rPr>
+          <w:rFonts w:ascii="Calibri" w:hAnsi="Calibri" w:eastAsia="Calibri"/>
+          <w:b w:val="0"/>
+          <w:i w:val="0"/>
+          <w:color w:val="444444"/>
+          <w:sz w:val="22"/>
+        </w:rPr>
+        <w:t>Telegram’a Excel atınca sistem öneri status üretir; sen Excel’i kontrol edip CRM’e elle girersin. Sistem CRM’e yazmaz.</w:t>
+      </w:r>
+    </w:p>
+    <w:p>
+      <w:pPr>
+        <w:pStyle w:val="ListBullet"/>
+        <w:spacing w:after="40"/>
+      </w:pPr>
+      <w:r>
+        <w:rPr>
+          <w:rFonts w:ascii="Calibri" w:hAnsi="Calibri" w:eastAsia="Calibri"/>
+          <w:b w:val="0"/>
+          <w:i w:val="0"/>
+          <w:sz w:val="22"/>
+        </w:rPr>
+        <w:t>Öneri çoğunlukla Memory Match kurallarından gelir (Sheet + politika).</w:t>
+      </w:r>
+    </w:p>
+    <w:p>
+      <w:pPr>
+        <w:pStyle w:val="ListBullet"/>
+        <w:spacing w:after="40"/>
+      </w:pPr>
+      <w:r>
+        <w:rPr>
+          <w:rFonts w:ascii="Calibri" w:hAnsi="Calibri" w:eastAsia="Calibri"/>
+          <w:b w:val="0"/>
+          <w:i w:val="0"/>
+          <w:sz w:val="22"/>
+        </w:rPr>
+        <w:t>Belirsiz kalanlar AI’ya gider; Verifier cümle bağlamını kontrol eder.</w:t>
+      </w:r>
+    </w:p>
+    <w:p>
+      <w:pPr>
+        <w:pStyle w:val="ListBullet"/>
+        <w:spacing w:after="40"/>
+      </w:pPr>
+      <w:r>
+        <w:rPr>
+          <w:rFonts w:ascii="Calibri" w:hAnsi="Calibri" w:eastAsia="Calibri"/>
+          <w:b w:val="0"/>
+          <w:i w:val="0"/>
+          <w:sz w:val="22"/>
+        </w:rPr>
+        <w:t>Senin işin: öneriyi bu kılavuza göre doğrula; Wrong görünenleri özellikle para / CB / kimlik ailelerinde oku.</w:t>
+      </w:r>
+    </w:p>
+    <w:p>
+      <w:pPr>
+        <w:spacing w:after="120"/>
+      </w:pPr>
+      <w:r>
+        <w:rPr>
+          <w:rFonts w:ascii="Calibri" w:hAnsi="Calibri" w:eastAsia="Calibri"/>
+          <w:b w:val="0"/>
+          <w:i/>
+          <w:color w:val="444444"/>
+          <w:sz w:val="18"/>
+        </w:rPr>
+        <w:t>Son güncelleme: Eylül 2026 — Call Again / Recall / No Potential / No Answer / Denied / Language kuralları güncel iş kararlarıyla hizalı.</w:t>
       </w:r>
     </w:p>
     <w:sectPr>
       <w:pgSz w:w="12240" w:h="15840"/>
-      <w:pgMar w:top="1440" w:right="1800" w:bottom="1440" w:left="1800" w:header="720" w:footer="720" w:gutter="0"/>
+      <w:pgMar w:top="1020" w:right="1134" w:bottom="1020" w:left="1134" w:header="720" w:footer="720" w:gutter="0"/>
       <w:cols w:space="720"/>
       <w:docGrid w:linePitch="360"/>
     </w:sectPr>
@@ -1813,10 +3750,6 @@
     <w:name w:val="Normal"/>
     <w:qFormat/>
     <w:rsid w:val="00FC693F"/>
-    <w:rPr>
-      <w:rFonts w:ascii="Calibri" w:hAnsi="Calibri"/>
-      <w:sz w:val="22"/>
-    </w:rPr>
   </w:style>
   <w:style w:type="paragraph" w:styleId="Header">
     <w:name w:val="header"/>

</xml_diff>

<commit_message>
fix(mm): DIY / dont need your help → Call Again (self-serve)
Client may still want to invest; rejecting agent help/calls is not a
soft refusal. Hard refuse (not interested/scam) still Recall. Harness
ACC90015 + DIY cases; Verifier guard + training guide updated.

Co-authored-by: ammartas3-png <ammartas3-png@users.noreply.github.com>
</commit_message>
<xml_diff>
--- a/docs/CRM-Status-Rehberi.docx
+++ b/docs/CRM-Status-Rehberi.docx
@@ -333,6 +333,17 @@
       </w:r>
     </w:p>
     <w:p>
+      <w:r>
+        <w:rPr>
+          <w:rFonts w:ascii="Calibri" w:hAnsi="Calibri" w:eastAsia="Calibri"/>
+          <w:b w:val="0"/>
+          <w:i w:val="0"/>
+          <w:sz w:val="22"/>
+        </w:rPr>
+        <w:t>✓ dont need your help / i will do it by myself (red yok) — kendi yatıracak, yardım istemiyor → Call Again</w:t>
+      </w:r>
+    </w:p>
+    <w:p>
       <w:pPr>
         <w:pStyle w:val="ListBullet"/>
         <w:spacing w:after="40"/>
@@ -404,7 +415,7 @@
           <w:i w:val="0"/>
           <w:sz w:val="22"/>
         </w:rPr>
-        <w:t>✗ i will do it by myself / dont think I’m interested → Recall</w:t>
+        <w:t>✗ dont think I’m interested → Recall (DIY değil)</w:t>
       </w:r>
     </w:p>
     <w:p>
@@ -494,7 +505,7 @@
           <w:i w:val="0"/>
           <w:sz w:val="22"/>
         </w:rPr>
-        <w:t>✓ dont need your help / i will do it by myself</w:t>
+        <w:t>✓ not interested (ilk gün) / doesnt want to proceed / leave me alone</w:t>
       </w:r>
     </w:p>
     <w:p>

</xml_diff>

<commit_message>
docs: DIY scenario → Call Again in training guide
Co-authored-by: ammartas3-png <ammartas3-png@users.noreply.github.com>
</commit_message>
<xml_diff>
--- a/docs/CRM-Status-Rehberi.docx
+++ b/docs/CRM-Status-Rehberi.docx
@@ -3065,12 +3065,9 @@
       <w:r>
         <w:rPr>
           <w:rFonts w:ascii="Calibri" w:hAnsi="Calibri" w:eastAsia="Calibri"/>
-          <w:b w:val="0"/>
-          <w:i w:val="0"/>
-          <w:color w:val="444444"/>
           <w:sz w:val="22"/>
         </w:rPr>
-        <w:t>Cevap: Recall — DIY ≠ callback.</w:t>
+        <w:t>Cevap: Call Again — kendi yatırmak istiyor, yardım/aranmak istemiyor.</w:t>
       </w:r>
     </w:p>
     <w:p>

</xml_diff>

<commit_message>
fix(mm): Arabic language desk → Call Again (transfer), not No Language
If report markets have Arabic-speaking agents, arabic speaker / fluent
in arabic transfers to that desk (Call Again). arabic not available and
unsupported languages (e.g. Mandarin) stay No Language. Guide + harness.

Co-authored-by: ammartas3-png <ammartas3-png@users.noreply.github.com>
</commit_message>
<xml_diff>
--- a/docs/CRM-Status-Rehberi.docx
+++ b/docs/CRM-Status-Rehberi.docx
@@ -1085,12 +1085,10 @@
       <w:r>
         <w:rPr>
           <w:rFonts w:ascii="Calibri" w:hAnsi="Calibri" w:eastAsia="Calibri"/>
-          <w:b/>
-          <w:i w:val="0"/>
-          <w:color w:val="2C5282"/>
-          <w:sz w:val="28"/>
+          <w:b w:val="0"/>
+          <w:sz w:val="22"/>
         </w:rPr>
-        <w:t>2.8 No Language — “Dil tutmuyor”</w:t>
+        <w:t>Dil tutmuyor ve o dilde masa/çalışan yoksa No Language. Arapça gibi raporda masası olan dilde müşteri o agent’a aktarılır → Call Again.</w:t>
       </w:r>
     </w:p>
     <w:p>
@@ -1102,10 +1100,19 @@
         <w:rPr>
           <w:rFonts w:ascii="Calibri" w:hAnsi="Calibri" w:eastAsia="Calibri"/>
           <w:b w:val="0"/>
-          <w:i w:val="0"/>
           <w:sz w:val="22"/>
         </w:rPr>
-        <w:t>✓ Mandarin / Tamil / Arapça speaker, hard time to discuss in English/MY, translator lazım</w:t>
+        <w:t>✓ Mandarin / Tamil / hard time English (aktarım masası yok) → No Language</w:t>
+      </w:r>
+    </w:p>
+    <w:p>
+      <w:r>
+        <w:rPr>
+          <w:rFonts w:ascii="Calibri" w:hAnsi="Calibri" w:eastAsia="Calibri"/>
+          <w:b w:val="0"/>
+          <w:sz w:val="22"/>
+        </w:rPr>
+        <w:t>✓ arabic speaker / fluent in arabic (Arap ülkeleri masası var) → Call Again (aktarım)</w:t>
       </w:r>
     </w:p>
     <w:p>

</xml_diff>

<commit_message>
docs: rewrite status handbook in official “Statuses and Rules” format
Same section style as the company rule sheet, content aligned to our
system (CA/NP money split, DIY→CA, Arabic transfer, Denied/NA guards).

Co-authored-by: ammartas3-png <ammartas3-png@users.noreply.github.com>
</commit_message>
<xml_diff>
--- a/docs/CRM-Status-Rehberi.docx
+++ b/docs/CRM-Status-Rehberi.docx
@@ -14,7 +14,7 @@
           <w:color w:val="1A365D"/>
           <w:sz w:val="44"/>
         </w:rPr>
-        <w:t>CRM Status Eğitim Kılavuzu</w:t>
+        <w:t>Statuses and Rules</w:t>
       </w:r>
     </w:p>
     <w:p>
@@ -27,234 +27,24 @@
           <w:b w:val="0"/>
           <w:i/>
           <w:color w:val="2C5282"/>
-          <w:sz w:val="26"/>
+          <w:sz w:val="24"/>
         </w:rPr>
-        <w:t>Ne olunca hangi status? — Agent / reviewer el kitabı</w:t>
+        <w:t>CRM Lead Status Handbook — Our System Rules</w:t>
       </w:r>
     </w:p>
     <w:p>
       <w:pPr>
-        <w:spacing w:after="120"/>
+        <w:spacing w:after="80"/>
       </w:pPr>
       <w:r>
         <w:rPr>
           <w:rFonts w:ascii="Calibri" w:hAnsi="Calibri" w:eastAsia="Calibri"/>
           <w:b w:val="0"/>
           <w:i w:val="0"/>
-          <w:color w:val="444444"/>
+          <w:color w:val="333333"/>
           <w:sz w:val="22"/>
         </w:rPr>
-        <w:t>Bu rehber, CRM’e status girerken doğru kararı vermen için yazıldı. Teknik sistem detayı değil; yorum satırını okuyup “bu lead’e ne koyarım?” sorusuna cevap verir.</w:t>
-      </w:r>
-    </w:p>
-    <w:p>
-      <w:pPr>
-        <w:spacing w:after="120"/>
-      </w:pPr>
-      <w:r>
-        <w:rPr>
-          <w:rFonts w:ascii="Calibri" w:hAnsi="Calibri" w:eastAsia="Calibri"/>
-          <w:b w:val="0"/>
-          <w:i w:val="0"/>
-          <w:color w:val="444444"/>
-          <w:sz w:val="22"/>
-        </w:rPr>
-        <w:t>Kural: En yeni anlamlı müşteri cümlesine bak. Agent’ın kendi arama notunu (cb:vm, cb na, call again rej) müşteri talebi sanma.</w:t>
-      </w:r>
-    </w:p>
-    <w:p>
-      <w:pPr>
-        <w:pStyle w:val="Heading1"/>
-      </w:pPr>
-      <w:r>
-        <w:rPr>
-          <w:rFonts w:ascii="Calibri" w:hAnsi="Calibri" w:eastAsia="Calibri"/>
-          <w:b/>
-          <w:i w:val="0"/>
-          <w:color w:val="1A365D"/>
-          <w:sz w:val="36"/>
-        </w:rPr>
-        <w:t>1. Önce bu sırayla bak (öncelik ağacı)</w:t>
-      </w:r>
-    </w:p>
-    <w:p>
-      <w:pPr>
-        <w:spacing w:after="120"/>
-      </w:pPr>
-      <w:r>
-        <w:rPr>
-          <w:rFonts w:ascii="Calibri" w:hAnsi="Calibri" w:eastAsia="Calibri"/>
-          <w:b w:val="0"/>
-          <w:i w:val="0"/>
-          <w:color w:val="444444"/>
-          <w:sz w:val="22"/>
-        </w:rPr>
-        <w:t>Aşağıdaki liste yukarıdan aşağıdır. Üstteki durum varsa alttakine bakma.</w:t>
-      </w:r>
-    </w:p>
-    <w:p>
-      <w:pPr>
-        <w:pStyle w:val="ListNumber"/>
-        <w:spacing w:after="40"/>
-      </w:pPr>
-      <w:r>
-        <w:rPr>
-          <w:rFonts w:ascii="Calibri" w:hAnsi="Calibri" w:eastAsia="Calibri"/>
-          <w:b w:val="0"/>
-          <w:i w:val="0"/>
-          <w:sz w:val="22"/>
-        </w:rPr>
-        <w:t>Kimlik inkârı var mı? (“ben Ahmad değilim”, “wrong person”, “this is not me”) → Denied Registration</w:t>
-      </w:r>
-    </w:p>
-    <w:p>
-      <w:pPr>
-        <w:pStyle w:val="ListNumber"/>
-        <w:spacing w:after="40"/>
-      </w:pPr>
-      <w:r>
-        <w:rPr>
-          <w:rFonts w:ascii="Calibri" w:hAnsi="Calibri" w:eastAsia="Calibri"/>
-          <w:b w:val="0"/>
-          <w:i w:val="0"/>
-          <w:sz w:val="22"/>
-        </w:rPr>
-        <w:t>Dil bariyeri var mı? (Mandarin / Arapça / “hard time to discuss in English”) ve kimlik inkârı YOK → No Language</w:t>
-      </w:r>
-    </w:p>
-    <w:p>
-      <w:pPr>
-        <w:pStyle w:val="ListNumber"/>
-        <w:spacing w:after="40"/>
-      </w:pPr>
-      <w:r>
-        <w:rPr>
-          <w:rFonts w:ascii="Calibri" w:hAnsi="Calibri" w:eastAsia="Calibri"/>
-          <w:b w:val="0"/>
-          <w:i w:val="0"/>
-          <w:sz w:val="22"/>
-        </w:rPr>
-        <w:t>18 yaş altı / geçersiz ülke → Under 18 / Invalid Country</w:t>
-      </w:r>
-    </w:p>
-    <w:p>
-      <w:pPr>
-        <w:pStyle w:val="ListNumber"/>
-        <w:spacing w:after="40"/>
-      </w:pPr>
-      <w:r>
-        <w:rPr>
-          <w:rFonts w:ascii="Calibri" w:hAnsi="Calibri" w:eastAsia="Calibri"/>
-          <w:b w:val="0"/>
-          <w:i w:val="0"/>
-          <w:sz w:val="22"/>
-        </w:rPr>
-        <w:t>Para yok + uzak/belirsiz/çıkış (next month, by October, not serious, discontinue) → No Potential</w:t>
-      </w:r>
-    </w:p>
-    <w:p>
-      <w:pPr>
-        <w:pStyle w:val="ListNumber"/>
-        <w:spacing w:after="40"/>
-      </w:pPr>
-      <w:r>
-        <w:rPr>
-          <w:rFonts w:ascii="Calibri" w:hAnsi="Calibri" w:eastAsia="Calibri"/>
-          <w:b w:val="0"/>
-          <w:i w:val="0"/>
-          <w:sz w:val="22"/>
-        </w:rPr>
-        <w:t>Para yok AMA yakın plan (maaş yakında, arrange funds, arkadaştan yardım) → Call Again</w:t>
-      </w:r>
-    </w:p>
-    <w:p>
-      <w:pPr>
-        <w:pStyle w:val="ListNumber"/>
-        <w:spacing w:after="40"/>
-      </w:pPr>
-      <w:r>
-        <w:rPr>
-          <w:rFonts w:ascii="Calibri" w:hAnsi="Calibri" w:eastAsia="Calibri"/>
-          <w:b w:val="0"/>
-          <w:i w:val="0"/>
-          <w:sz w:val="22"/>
-        </w:rPr>
-        <w:t>Evrak/ID/banka yok → No Potential - no documents</w:t>
-      </w:r>
-    </w:p>
-    <w:p>
-      <w:pPr>
-        <w:pStyle w:val="ListNumber"/>
-        <w:spacing w:after="40"/>
-      </w:pPr>
-      <w:r>
-        <w:rPr>
-          <w:rFonts w:ascii="Calibri" w:hAnsi="Calibri" w:eastAsia="Calibri"/>
-          <w:b w:val="0"/>
-          <w:i w:val="0"/>
-          <w:sz w:val="22"/>
-        </w:rPr>
-        <w:t>En yeni cümlede net red (“not interested”, “dont want”, “scam”) → Recall (1. gün) veya No Interest (2. gün)</w:t>
-      </w:r>
-    </w:p>
-    <w:p>
-      <w:pPr>
-        <w:pStyle w:val="ListNumber"/>
-        <w:spacing w:after="40"/>
-      </w:pPr>
-      <w:r>
-        <w:rPr>
-          <w:rFonts w:ascii="Calibri" w:hAnsi="Calibri" w:eastAsia="Calibri"/>
-          <w:b w:val="0"/>
-          <w:i w:val="0"/>
-          <w:sz w:val="22"/>
-        </w:rPr>
-        <w:t>Müşteri net geri arama istedi (“call me at 6”, “call tomorrow”, “I’m busy call later”) → Call Again</w:t>
-      </w:r>
-    </w:p>
-    <w:p>
-      <w:pPr>
-        <w:pStyle w:val="ListNumber"/>
-        <w:spacing w:after="40"/>
-      </w:pPr>
-      <w:r>
-        <w:rPr>
-          <w:rFonts w:ascii="Calibri" w:hAnsi="Calibri" w:eastAsia="Calibri"/>
-          <w:b w:val="0"/>
-          <w:i w:val="0"/>
-          <w:sz w:val="22"/>
-        </w:rPr>
-        <w:t>Sadece çalma / VM / NA / ring / dvm → No Answer 1-5 (5+ ayrı gün → No Answer 5 UP)</w:t>
-      </w:r>
-    </w:p>
-    <w:p>
-      <w:pPr>
-        <w:pStyle w:val="ListNumber"/>
-        <w:spacing w:after="40"/>
-      </w:pPr>
-      <w:r>
-        <w:rPr>
-          <w:rFonts w:ascii="Calibri" w:hAnsi="Calibri" w:eastAsia="Calibri"/>
-          <w:b w:val="0"/>
-          <w:i w:val="0"/>
-          <w:sz w:val="22"/>
-        </w:rPr>
-        <w:t>Karışık / anlaşılmaz → Manual Check</w:t>
-      </w:r>
-    </w:p>
-    <w:p>
-      <w:pPr>
-        <w:pStyle w:val="Heading1"/>
-      </w:pPr>
-      <w:r>
-        <w:rPr>
-          <w:rFonts w:ascii="Calibri" w:hAnsi="Calibri" w:eastAsia="Calibri"/>
-          <w:b/>
-          <w:i w:val="0"/>
-          <w:color w:val="1A365D"/>
-          <w:sz w:val="36"/>
-        </w:rPr>
-        <w:t>2. Status sözlüğü — ne demek, ne zaman?</w:t>
+        <w:t>This handbook matches our Memory Match / Verifier rules. After every call: English comment + status from the newest meaningful customer sentence. Agent dial notes are not customer callbacks.</w:t>
       </w:r>
     </w:p>
     <w:p>
@@ -267,170 +57,137 @@
           <w:b/>
           <w:i w:val="0"/>
           <w:color w:val="2C5282"/>
-          <w:sz w:val="28"/>
+          <w:sz w:val="26"/>
         </w:rPr>
-        <w:t>2.1 Call Again — “Takip et, henüz ölmedi”</w:t>
+        <w:t>---- COMMENTS</w:t>
       </w:r>
     </w:p>
     <w:p>
       <w:pPr>
-        <w:spacing w:after="120"/>
+        <w:pStyle w:val="ListBullet"/>
+        <w:spacing w:after="20"/>
       </w:pPr>
       <w:r>
         <w:rPr>
           <w:rFonts w:ascii="Calibri" w:hAnsi="Calibri" w:eastAsia="Calibri"/>
           <w:b w:val="0"/>
           <w:i w:val="0"/>
-          <w:color w:val="444444"/>
+          <w:color w:val="333333"/>
           <w:sz w:val="22"/>
         </w:rPr>
-        <w:t>Müşteri kapıyı kapatmadı. Net bir devam / randevu / kısa vadeli para planı var.</w:t>
+        <w:t>Put a comment right after you finish the call.</w:t>
       </w:r>
     </w:p>
     <w:p>
       <w:pPr>
-        <w:spacing w:after="120"/>
-      </w:pPr>
-      <w:r>
-        <w:rPr>
-          <w:rFonts w:ascii="Calibri" w:hAnsi="Calibri" w:eastAsia="Calibri"/>
-          <w:b/>
-          <w:i w:val="0"/>
-          <w:color w:val="1A365D"/>
-          <w:sz w:val="22"/>
-        </w:rPr>
-        <w:t>Koy:</w:t>
-      </w:r>
-    </w:p>
-    <w:p>
-      <w:pPr>
         <w:pStyle w:val="ListBullet"/>
-        <w:spacing w:after="40"/>
+        <w:spacing w:after="20"/>
       </w:pPr>
       <w:r>
         <w:rPr>
           <w:rFonts w:ascii="Calibri" w:hAnsi="Calibri" w:eastAsia="Calibri"/>
           <w:b w:val="0"/>
           <w:i w:val="0"/>
+          <w:color w:val="333333"/>
           <w:sz w:val="22"/>
         </w:rPr>
-        <w:t>✓ call me later / call me tomorrow / call at 6pm / I’m busy, call back</w:t>
+        <w:t>Comments only in English (ask TL / translate if needed).</w:t>
       </w:r>
     </w:p>
     <w:p>
       <w:pPr>
         <w:pStyle w:val="ListBullet"/>
-        <w:spacing w:after="40"/>
+        <w:spacing w:after="20"/>
       </w:pPr>
       <w:r>
         <w:rPr>
           <w:rFonts w:ascii="Calibri" w:hAnsi="Calibri" w:eastAsia="Calibri"/>
           <w:b w:val="0"/>
           <w:i w:val="0"/>
+          <w:color w:val="333333"/>
           <w:sz w:val="22"/>
         </w:rPr>
-        <w:t>✓ no money NOW ama “until salary”, “will arrange funds”, “ask my friends”, “will get help and deposit”</w:t>
+        <w:t>Include meaningful details — not “We talk”, “No interest”, bare “NA”.</w:t>
       </w:r>
     </w:p>
     <w:p>
+      <w:pPr>
+        <w:pStyle w:val="ListBullet"/>
+        <w:spacing w:after="20"/>
+      </w:pPr>
       <w:r>
         <w:rPr>
           <w:rFonts w:ascii="Calibri" w:hAnsi="Calibri" w:eastAsia="Calibri"/>
           <w:b w:val="0"/>
           <w:i w:val="0"/>
+          <w:color w:val="333333"/>
           <w:sz w:val="22"/>
         </w:rPr>
-        <w:t>✓ dont need your help / i will do it by myself (red yok) — kendi yatıracak, yardım istemiyor → Call Again</w:t>
+        <w:t>Wrong ringing: write how it sounds (beeping / no route / no ring / DVM).</w:t>
       </w:r>
     </w:p>
     <w:p>
       <w:pPr>
         <w:pStyle w:val="ListBullet"/>
-        <w:spacing w:after="40"/>
+        <w:spacing w:after="20"/>
       </w:pPr>
       <w:r>
         <w:rPr>
           <w:rFonts w:ascii="Calibri" w:hAnsi="Calibri" w:eastAsia="Calibri"/>
           <w:b w:val="0"/>
           <w:i w:val="0"/>
+          <w:color w:val="333333"/>
           <w:sz w:val="22"/>
         </w:rPr>
-        <w:t>✓ pu said to call him later / still busy call later</w:t>
+        <w:t>Official tone only — no slang or insults.</w:t>
       </w:r>
     </w:p>
     <w:p>
       <w:pPr>
-        <w:spacing w:after="120"/>
-      </w:pPr>
-      <w:r>
-        <w:rPr>
-          <w:rFonts w:ascii="Calibri" w:hAnsi="Calibri" w:eastAsia="Calibri"/>
-          <w:b/>
-          <w:i w:val="0"/>
-          <w:color w:val="1A365D"/>
-          <w:sz w:val="22"/>
-        </w:rPr>
-        <w:t>Koyma:</w:t>
-      </w:r>
-    </w:p>
-    <w:p>
-      <w:pPr>
         <w:pStyle w:val="ListBullet"/>
-        <w:spacing w:after="40"/>
+        <w:spacing w:after="20"/>
       </w:pPr>
       <w:r>
         <w:rPr>
           <w:rFonts w:ascii="Calibri" w:hAnsi="Calibri" w:eastAsia="Calibri"/>
           <w:b w:val="0"/>
           <w:i w:val="0"/>
+          <w:color w:val="333333"/>
           <w:sz w:val="22"/>
         </w:rPr>
-        <w:t>✗ next month / by October / in 4 months / don’t know when → bu No Potential</w:t>
+        <w:t>Mail-only contact: paste mails translated to English.</w:t>
       </w:r>
     </w:p>
     <w:p>
       <w:pPr>
         <w:pStyle w:val="ListBullet"/>
-        <w:spacing w:after="40"/>
+        <w:spacing w:after="20"/>
       </w:pPr>
       <w:r>
         <w:rPr>
           <w:rFonts w:ascii="Calibri" w:hAnsi="Calibri" w:eastAsia="Calibri"/>
           <w:b w:val="0"/>
           <w:i w:val="0"/>
+          <w:color w:val="333333"/>
           <w:sz w:val="22"/>
         </w:rPr>
-        <w:t>✗ cb:vm, cb na, call again rej, CALLED BACK PUHU → bunlar agent’ın kendi araması, müşteri CB değil</w:t>
+        <w:t>Do not leave the status name as the only comment. Explain why.</w:t>
       </w:r>
     </w:p>
     <w:p>
       <w:pPr>
         <w:pStyle w:val="ListBullet"/>
-        <w:spacing w:after="40"/>
+        <w:spacing w:after="20"/>
       </w:pPr>
       <w:r>
         <w:rPr>
           <w:rFonts w:ascii="Calibri" w:hAnsi="Calibri" w:eastAsia="Calibri"/>
           <w:b w:val="0"/>
           <w:i w:val="0"/>
+          <w:color w:val="333333"/>
           <w:sz w:val="22"/>
         </w:rPr>
-        <w:t>✗ dont think I’m interested → Recall (DIY değil)</w:t>
-      </w:r>
-    </w:p>
-    <w:p>
-      <w:pPr>
-        <w:pStyle w:val="ListBullet"/>
-        <w:spacing w:after="40"/>
-      </w:pPr>
-      <w:r>
-        <w:rPr>
-          <w:rFonts w:ascii="Calibri" w:hAnsi="Calibri" w:eastAsia="Calibri"/>
-          <w:b w:val="0"/>
-          <w:i w:val="0"/>
-          <w:sz w:val="22"/>
-        </w:rPr>
-        <w:t>✗ CB REJS / cb reject → genelde No Answer kalır</w:t>
+        <w:t>Do not add a TASK if you did not talk to the client.</w:t>
       </w:r>
     </w:p>
     <w:p>
@@ -443,159 +200,150 @@
           <w:b/>
           <w:i w:val="0"/>
           <w:color w:val="2C5282"/>
-          <w:sz w:val="28"/>
+          <w:sz w:val="26"/>
         </w:rPr>
-        <w:t>2.2 Recall — “Bugün red / soğuk, yarın bir daha dene”</w:t>
+        <w:t>---- NO ANSWER 1-5 / 5 UP</w:t>
       </w:r>
     </w:p>
     <w:p>
       <w:pPr>
-        <w:spacing w:after="120"/>
+        <w:spacing w:after="80"/>
+      </w:pPr>
+      <w:r>
+        <w:rPr>
+          <w:rFonts w:ascii="Calibri" w:hAnsi="Calibri" w:eastAsia="Calibri"/>
+          <w:b/>
+          <w:i w:val="0"/>
+          <w:color w:val="333333"/>
+          <w:sz w:val="22"/>
+        </w:rPr>
+        <w:t>No Answer 1-5 — phone alive, no real conversation:</w:t>
+      </w:r>
+    </w:p>
+    <w:p>
+      <w:pPr>
+        <w:pStyle w:val="ListBullet"/>
+        <w:spacing w:after="20"/>
       </w:pPr>
       <w:r>
         <w:rPr>
           <w:rFonts w:ascii="Calibri" w:hAnsi="Calibri" w:eastAsia="Calibri"/>
           <w:b w:val="0"/>
           <w:i w:val="0"/>
-          <w:color w:val="444444"/>
+          <w:color w:val="333333"/>
           <w:sz w:val="22"/>
         </w:rPr>
-        <w:t>Tek günde yumuşak veya net red var; henüz kalıcı No Interest değil.</w:t>
+        <w:t>Didn’t pick up; pickup but no talk; hung up immediately during/after intro.</w:t>
       </w:r>
     </w:p>
     <w:p>
       <w:pPr>
-        <w:spacing w:after="120"/>
+        <w:pStyle w:val="ListBullet"/>
+        <w:spacing w:after="20"/>
+      </w:pPr>
+      <w:r>
+        <w:rPr>
+          <w:rFonts w:ascii="Calibri" w:hAnsi="Calibri" w:eastAsia="Calibri"/>
+          <w:b w:val="0"/>
+          <w:i w:val="0"/>
+          <w:color w:val="333333"/>
+          <w:sz w:val="22"/>
+        </w:rPr>
+        <w:t>Dialer-only: na / vm / dvm / ring / ndt / db / cnbr / currently busy (no talk).</w:t>
+      </w:r>
+    </w:p>
+    <w:p>
+      <w:pPr>
+        <w:pStyle w:val="ListBullet"/>
+        <w:spacing w:after="20"/>
+      </w:pPr>
+      <w:r>
+        <w:rPr>
+          <w:rFonts w:ascii="Calibri" w:hAnsi="Calibri" w:eastAsia="Calibri"/>
+          <w:b w:val="0"/>
+          <w:i w:val="0"/>
+          <w:color w:val="333333"/>
+          <w:sz w:val="22"/>
+        </w:rPr>
+        <w:t>HU with no conversation → No Answer, NOT Call Again.</w:t>
+      </w:r>
+    </w:p>
+    <w:p>
+      <w:pPr>
+        <w:spacing w:after="80"/>
       </w:pPr>
       <w:r>
         <w:rPr>
           <w:rFonts w:ascii="Calibri" w:hAnsi="Calibri" w:eastAsia="Calibri"/>
           <w:b/>
           <w:i w:val="0"/>
-          <w:color w:val="1A365D"/>
+          <w:color w:val="333333"/>
           <w:sz w:val="22"/>
         </w:rPr>
-        <w:t>Koy:</w:t>
+        <w:t>No Answer 5 UP — 5+ distinct days of no-answer / no real conversation.</w:t>
       </w:r>
     </w:p>
     <w:p>
       <w:pPr>
+        <w:spacing w:after="80"/>
+      </w:pPr>
+      <w:r>
+        <w:rPr>
+          <w:rFonts w:ascii="Calibri" w:hAnsi="Calibri" w:eastAsia="Calibri"/>
+          <w:b/>
+          <w:i w:val="0"/>
+          <w:color w:val="333333"/>
+          <w:sz w:val="22"/>
+        </w:rPr>
+        <w:t>System guards:</w:t>
+      </w:r>
+    </w:p>
+    <w:p>
+      <w:pPr>
         <w:pStyle w:val="ListBullet"/>
-        <w:spacing w:after="40"/>
+        <w:spacing w:after="20"/>
       </w:pPr>
       <w:r>
         <w:rPr>
           <w:rFonts w:ascii="Calibri" w:hAnsi="Calibri" w:eastAsia="Calibri"/>
           <w:b w:val="0"/>
           <w:i w:val="0"/>
+          <w:color w:val="333333"/>
           <w:sz w:val="22"/>
         </w:rPr>
-        <w:t>✓ not interested (ilk gün) / doesnt want to proceed / leave me alone</w:t>
+        <w:t>Invalid email + newest ring/NA/VM/DVM → keep No Answer (not Wrong Number).</w:t>
       </w:r>
     </w:p>
     <w:p>
       <w:pPr>
         <w:pStyle w:val="ListBullet"/>
-        <w:spacing w:after="40"/>
+        <w:spacing w:after="20"/>
       </w:pPr>
       <w:r>
         <w:rPr>
           <w:rFonts w:ascii="Calibri" w:hAnsi="Calibri" w:eastAsia="Calibri"/>
           <w:b w:val="0"/>
           <w:i w:val="0"/>
+          <w:color w:val="333333"/>
           <w:sz w:val="22"/>
         </w:rPr>
-        <w:t>✓ not interested (ilk gün) / doesnt want to proceed / leave me alone</w:t>
+        <w:t>CB REJS / cb reject alone → usually No Answer (not Call Again).</w:t>
       </w:r>
     </w:p>
     <w:p>
       <w:pPr>
         <w:pStyle w:val="ListBullet"/>
-        <w:spacing w:after="40"/>
+        <w:spacing w:after="20"/>
       </w:pPr>
       <w:r>
         <w:rPr>
           <w:rFonts w:ascii="Calibri" w:hAnsi="Calibri" w:eastAsia="Calibri"/>
           <w:b w:val="0"/>
           <w:i w:val="0"/>
+          <w:color w:val="333333"/>
           <w:sz w:val="22"/>
         </w:rPr>
-        <w:t>✓ hung up after intro + red kokusu; “playing games”, “not serious” (tek gün)</w:t>
-      </w:r>
-    </w:p>
-    <w:p>
-      <w:pPr>
-        <w:pStyle w:val="ListBullet"/>
-        <w:spacing w:after="40"/>
-      </w:pPr>
-      <w:r>
-        <w:rPr>
-          <w:rFonts w:ascii="Calibri" w:hAnsi="Calibri" w:eastAsia="Calibri"/>
-          <w:b w:val="0"/>
-          <w:i w:val="0"/>
-          <w:sz w:val="22"/>
-        </w:rPr>
-        <w:t>✓ kayıt “ben yapmadım” ama “ben o kişi değilim” demiyor → Recall (Denied değil)</w:t>
-      </w:r>
-    </w:p>
-    <w:p>
-      <w:pPr>
-        <w:spacing w:after="120"/>
-      </w:pPr>
-      <w:r>
-        <w:rPr>
-          <w:rFonts w:ascii="Calibri" w:hAnsi="Calibri" w:eastAsia="Calibri"/>
-          <w:b/>
-          <w:i w:val="0"/>
-          <w:color w:val="1A365D"/>
-          <w:sz w:val="22"/>
-        </w:rPr>
-        <w:t>Koyma:</w:t>
-      </w:r>
-    </w:p>
-    <w:p>
-      <w:pPr>
-        <w:pStyle w:val="ListBullet"/>
-        <w:spacing w:after="40"/>
-      </w:pPr>
-      <w:r>
-        <w:rPr>
-          <w:rFonts w:ascii="Calibri" w:hAnsi="Calibri" w:eastAsia="Calibri"/>
-          <w:b w:val="0"/>
-          <w:i w:val="0"/>
-          <w:sz w:val="22"/>
-        </w:rPr>
-        <w:t>✗ İki ayrı günde red → No Interest</w:t>
-      </w:r>
-    </w:p>
-    <w:p>
-      <w:pPr>
-        <w:pStyle w:val="ListBullet"/>
-        <w:spacing w:after="40"/>
-      </w:pPr>
-      <w:r>
-        <w:rPr>
-          <w:rFonts w:ascii="Calibri" w:hAnsi="Calibri" w:eastAsia="Calibri"/>
-          <w:b w:val="0"/>
-          <w:i w:val="0"/>
-          <w:sz w:val="22"/>
-        </w:rPr>
-        <w:t>✗ Küfür + istemiyorum net kalıcı red → No Interest (doğrudan)</w:t>
-      </w:r>
-    </w:p>
-    <w:p>
-      <w:pPr>
-        <w:pStyle w:val="ListBullet"/>
-        <w:spacing w:after="40"/>
-      </w:pPr>
-      <w:r>
-        <w:rPr>
-          <w:rFonts w:ascii="Calibri" w:hAnsi="Calibri" w:eastAsia="Calibri"/>
-          <w:b w:val="0"/>
-          <w:i w:val="0"/>
-          <w:sz w:val="22"/>
-        </w:rPr>
-        <w:t>✗ Aile yardım ediyor (oğul çeviri, kız kart foto) → third_party / Recall zorlaması yok; asıl cümleye bak</w:t>
+        <w:t>Agent notes cb:vm / cb na / call again rej are YOUR redials — do not upgrade to Call Again.</w:t>
       </w:r>
     </w:p>
     <w:p>
@@ -608,114 +356,229 @@
           <w:b/>
           <w:i w:val="0"/>
           <w:color w:val="2C5282"/>
-          <w:sz w:val="28"/>
+          <w:sz w:val="26"/>
         </w:rPr>
-        <w:t>2.3 No Interest — “Kalıcı ilgisiz”</w:t>
+        <w:t>---- CALL AGAIN</w:t>
       </w:r>
     </w:p>
     <w:p>
       <w:pPr>
-        <w:spacing w:after="120"/>
+        <w:spacing w:after="80"/>
+      </w:pPr>
+      <w:r>
+        <w:rPr>
+          <w:rFonts w:ascii="Calibri" w:hAnsi="Calibri" w:eastAsia="Calibri"/>
+          <w:b/>
+          <w:i w:val="0"/>
+          <w:color w:val="333333"/>
+          <w:sz w:val="22"/>
+        </w:rPr>
+        <w:t>Real conversation or clear customer ask to be called; lead still workable.</w:t>
+      </w:r>
+    </w:p>
+    <w:p>
+      <w:pPr>
+        <w:spacing w:after="80"/>
+      </w:pPr>
+      <w:r>
+        <w:rPr>
+          <w:rFonts w:ascii="Calibri" w:hAnsi="Calibri" w:eastAsia="Calibri"/>
+          <w:b/>
+          <w:i w:val="0"/>
+          <w:color w:val="333333"/>
+          <w:sz w:val="22"/>
+        </w:rPr>
+        <w:t>Put Call Again when:</w:t>
+      </w:r>
+    </w:p>
+    <w:p>
+      <w:pPr>
+        <w:pStyle w:val="ListBullet"/>
+        <w:spacing w:after="20"/>
       </w:pPr>
       <w:r>
         <w:rPr>
           <w:rFonts w:ascii="Calibri" w:hAnsi="Calibri" w:eastAsia="Calibri"/>
           <w:b w:val="0"/>
           <w:i w:val="0"/>
-          <w:color w:val="444444"/>
+          <w:color w:val="333333"/>
           <w:sz w:val="22"/>
         </w:rPr>
-        <w:t>İki yoldan biri:</w:t>
+        <w:t>Busy / rush / call me later / tomorrow / at a time.</w:t>
       </w:r>
     </w:p>
     <w:p>
       <w:pPr>
-        <w:pStyle w:val="ListNumber"/>
-        <w:spacing w:after="40"/>
+        <w:pStyle w:val="ListBullet"/>
+        <w:spacing w:after="20"/>
       </w:pPr>
       <w:r>
         <w:rPr>
           <w:rFonts w:ascii="Calibri" w:hAnsi="Calibri" w:eastAsia="Calibri"/>
           <w:b w:val="0"/>
           <w:i w:val="0"/>
+          <w:color w:val="333333"/>
           <w:sz w:val="22"/>
         </w:rPr>
-        <w:t>Red / not interested ifadesi iki farklı günde</w:t>
+        <w:t>Someone PU: client not here right now (short real talk).</w:t>
       </w:r>
     </w:p>
     <w:p>
       <w:pPr>
-        <w:pStyle w:val="ListNumber"/>
-        <w:spacing w:after="40"/>
+        <w:pStyle w:val="ListBullet"/>
+        <w:spacing w:after="20"/>
       </w:pPr>
       <w:r>
         <w:rPr>
           <w:rFonts w:ascii="Calibri" w:hAnsi="Calibri" w:eastAsia="Calibri"/>
           <w:b w:val="0"/>
           <w:i w:val="0"/>
+          <w:color w:val="333333"/>
           <w:sz w:val="22"/>
         </w:rPr>
-        <w:t>Küfür + açık “istemiyorum / ilgilenmiyorum” (doğrudan No Interest)</w:t>
+        <w:t>Interested but no money YET + near plan: salary soon, arrange funds, ask friends, will get help and deposit.</w:t>
       </w:r>
     </w:p>
     <w:p>
       <w:pPr>
-        <w:pStyle w:val="ListNumber"/>
-        <w:spacing w:after="40"/>
+        <w:pStyle w:val="ListBullet"/>
+        <w:spacing w:after="20"/>
       </w:pPr>
       <w:r>
         <w:rPr>
           <w:rFonts w:ascii="Calibri" w:hAnsi="Calibri" w:eastAsia="Calibri"/>
           <w:b w:val="0"/>
           <w:i w:val="0"/>
+          <w:color w:val="333333"/>
           <w:sz w:val="22"/>
         </w:rPr>
-        <w:t>Recall sonrası 3 ayrı günde hiç cevap yok (NA streak) → No Interest’e yükselt</w:t>
+        <w:t>DIY self-serve: dont need your help / i will do it by myself (still wants to invest) → Call Again.</w:t>
       </w:r>
     </w:p>
     <w:p>
       <w:pPr>
-        <w:spacing w:after="120"/>
+        <w:pStyle w:val="ListBullet"/>
+        <w:spacing w:after="20"/>
+      </w:pPr>
+      <w:r>
+        <w:rPr>
+          <w:rFonts w:ascii="Calibri" w:hAnsi="Calibri" w:eastAsia="Calibri"/>
+          <w:b w:val="0"/>
+          <w:i w:val="0"/>
+          <w:color w:val="333333"/>
+          <w:sz w:val="22"/>
+        </w:rPr>
+        <w:t>Arabic desk transfer: arabic speaker / fluent in arabic → Call Again (not No Language).</w:t>
+      </w:r>
+    </w:p>
+    <w:p>
+      <w:pPr>
+        <w:pStyle w:val="ListBullet"/>
+        <w:spacing w:after="20"/>
+      </w:pPr>
+      <w:r>
+        <w:rPr>
+          <w:rFonts w:ascii="Calibri" w:hAnsi="Calibri" w:eastAsia="Calibri"/>
+          <w:b w:val="0"/>
+          <w:i w:val="0"/>
+          <w:color w:val="333333"/>
+          <w:sz w:val="22"/>
+        </w:rPr>
+        <w:t>Concrete customer callback / appointment (note IST vs local).</w:t>
+      </w:r>
+    </w:p>
+    <w:p>
+      <w:pPr>
+        <w:spacing w:after="80"/>
       </w:pPr>
       <w:r>
         <w:rPr>
           <w:rFonts w:ascii="Calibri" w:hAnsi="Calibri" w:eastAsia="Calibri"/>
           <w:b/>
           <w:i w:val="0"/>
-          <w:color w:val="1A365D"/>
+          <w:color w:val="333333"/>
           <w:sz w:val="22"/>
         </w:rPr>
-        <w:t>Koyma:</w:t>
+        <w:t>Do NOT put Call Again when:</w:t>
       </w:r>
     </w:p>
     <w:p>
       <w:pPr>
         <w:pStyle w:val="ListBullet"/>
-        <w:spacing w:after="40"/>
+        <w:spacing w:after="20"/>
       </w:pPr>
       <w:r>
         <w:rPr>
           <w:rFonts w:ascii="Calibri" w:hAnsi="Calibri" w:eastAsia="Calibri"/>
           <w:b w:val="0"/>
           <w:i w:val="0"/>
+          <w:color w:val="333333"/>
           <w:sz w:val="22"/>
         </w:rPr>
-        <w:t>✗ Tek günde bir kez “not interested” → bu Recall</w:t>
+        <w:t>HU with no conversation → No Answer.</w:t>
       </w:r>
     </w:p>
     <w:p>
       <w:pPr>
         <w:pStyle w:val="ListBullet"/>
-        <w:spacing w:after="40"/>
+        <w:spacing w:after="20"/>
       </w:pPr>
       <w:r>
         <w:rPr>
           <w:rFonts w:ascii="Calibri" w:hAnsi="Calibri" w:eastAsia="Calibri"/>
           <w:b w:val="0"/>
           <w:i w:val="0"/>
+          <w:color w:val="333333"/>
           <w:sz w:val="22"/>
         </w:rPr>
-        <w:t>✗ Sadece hang-up (hu) → tek başına red sayılmaz</w:t>
+        <w:t>Only agent dial noise → keep NA / prior outcome.</w:t>
+      </w:r>
+    </w:p>
+    <w:p>
+      <w:pPr>
+        <w:pStyle w:val="ListBullet"/>
+        <w:spacing w:after="20"/>
+      </w:pPr>
+      <w:r>
+        <w:rPr>
+          <w:rFonts w:ascii="Calibri" w:hAnsi="Calibri" w:eastAsia="Calibri"/>
+          <w:b w:val="0"/>
+          <w:i w:val="0"/>
+          <w:color w:val="333333"/>
+          <w:sz w:val="22"/>
+        </w:rPr>
+        <w:t>next month / by October / in 4 months / dont know when + no near plan → No Potential.</w:t>
+      </w:r>
+    </w:p>
+    <w:p>
+      <w:pPr>
+        <w:pStyle w:val="ListBullet"/>
+        <w:spacing w:after="20"/>
+      </w:pPr>
+      <w:r>
+        <w:rPr>
+          <w:rFonts w:ascii="Calibri" w:hAnsi="Calibri" w:eastAsia="Calibri"/>
+          <w:b w:val="0"/>
+          <w:i w:val="0"/>
+          <w:color w:val="333333"/>
+          <w:sz w:val="22"/>
+        </w:rPr>
+        <w:t>dont think I’m interested (first soft refuse) → Recall.</w:t>
+      </w:r>
+    </w:p>
+    <w:p>
+      <w:pPr>
+        <w:spacing w:after="80"/>
+      </w:pPr>
+      <w:r>
+        <w:rPr>
+          <w:rFonts w:ascii="Calibri" w:hAnsi="Calibri" w:eastAsia="Calibri"/>
+          <w:b/>
+          <w:i w:val="0"/>
+          <w:color w:val="333333"/>
+          <w:sz w:val="22"/>
+        </w:rPr>
+        <w:t>If you truly spoke and no harder final status fits → Call Again. It cannot be No Answer.</w:t>
       </w:r>
     </w:p>
     <w:p>
@@ -728,174 +591,89 @@
           <w:b/>
           <w:i w:val="0"/>
           <w:color w:val="2C5282"/>
-          <w:sz w:val="28"/>
+          <w:sz w:val="26"/>
         </w:rPr>
-        <w:t>2.4 No Potential — “Para/kapasite yolu kapalı”</w:t>
+        <w:t>---- APPOINTMENT</w:t>
       </w:r>
     </w:p>
     <w:p>
       <w:pPr>
-        <w:spacing w:after="120"/>
+        <w:pStyle w:val="ListBullet"/>
+        <w:spacing w:after="20"/>
       </w:pPr>
       <w:r>
         <w:rPr>
           <w:rFonts w:ascii="Calibri" w:hAnsi="Calibri" w:eastAsia="Calibri"/>
           <w:b w:val="0"/>
           <w:i w:val="0"/>
-          <w:color w:val="444444"/>
+          <w:color w:val="333333"/>
           <w:sz w:val="22"/>
         </w:rPr>
-        <w:t>Yatırım için para yok ve geri dönüş yolu yok (uzak, belirsiz veya vazgeçmiş).</w:t>
+        <w:t>Call exactly when the client asked.</w:t>
       </w:r>
     </w:p>
     <w:p>
       <w:pPr>
-        <w:spacing w:after="120"/>
-      </w:pPr>
-      <w:r>
-        <w:rPr>
-          <w:rFonts w:ascii="Calibri" w:hAnsi="Calibri" w:eastAsia="Calibri"/>
-          <w:b/>
-          <w:i w:val="0"/>
-          <w:color w:val="1A365D"/>
-          <w:sz w:val="22"/>
-        </w:rPr>
-        <w:t>Koy:</w:t>
-      </w:r>
-    </w:p>
-    <w:p>
-      <w:pPr>
         <w:pStyle w:val="ListBullet"/>
-        <w:spacing w:after="40"/>
+        <w:spacing w:after="20"/>
       </w:pPr>
       <w:r>
         <w:rPr>
           <w:rFonts w:ascii="Calibri" w:hAnsi="Calibri" w:eastAsia="Calibri"/>
           <w:b w:val="0"/>
           <w:i w:val="0"/>
+          <w:color w:val="333333"/>
           <w:sz w:val="22"/>
         </w:rPr>
-        <w:t>✓ does not have the money / cant afford + next month / by October / in 4 months</w:t>
+        <w:t>Date only → call that day at different hours.</w:t>
       </w:r>
     </w:p>
     <w:p>
       <w:pPr>
         <w:pStyle w:val="ListBullet"/>
-        <w:spacing w:after="40"/>
+        <w:spacing w:after="20"/>
       </w:pPr>
       <w:r>
         <w:rPr>
           <w:rFonts w:ascii="Calibri" w:hAnsi="Calibri" w:eastAsia="Calibri"/>
           <w:b w:val="0"/>
           <w:i w:val="0"/>
+          <w:color w:val="333333"/>
           <w:sz w:val="22"/>
         </w:rPr>
-        <w:t>✓ no starting capital + doesn’t know when / reply when ready</w:t>
+        <w:t>Exact time → within ~15 min, several tries that hour.</w:t>
       </w:r>
     </w:p>
     <w:p>
       <w:pPr>
         <w:pStyle w:val="ListBullet"/>
-        <w:spacing w:after="40"/>
+        <w:spacing w:after="20"/>
       </w:pPr>
       <w:r>
         <w:rPr>
           <w:rFonts w:ascii="Calibri" w:hAnsi="Calibri" w:eastAsia="Calibri"/>
           <w:b w:val="0"/>
           <w:i w:val="0"/>
+          <w:color w:val="333333"/>
           <w:sz w:val="22"/>
         </w:rPr>
-        <w:t>✓ not serious / didn’t mean to invest / discontinue + no money</w:t>
+        <w:t>Vague “I’ll text when ready” → still try within about a week; usually Call Again.</w:t>
       </w:r>
     </w:p>
     <w:p>
       <w:pPr>
         <w:pStyle w:val="ListBullet"/>
-        <w:spacing w:after="40"/>
+        <w:spacing w:after="20"/>
       </w:pPr>
       <w:r>
         <w:rPr>
           <w:rFonts w:ascii="Calibri" w:hAnsi="Calibri" w:eastAsia="Calibri"/>
           <w:b w:val="0"/>
           <w:i w:val="0"/>
+          <w:color w:val="333333"/>
           <w:sz w:val="22"/>
         </w:rPr>
-        <w:t>✓ capital affordable? no + hung up</w:t>
-      </w:r>
-    </w:p>
-    <w:p>
-      <w:pPr>
-        <w:pStyle w:val="ListBullet"/>
-        <w:spacing w:after="40"/>
-      </w:pPr>
-      <w:r>
-        <w:rPr>
-          <w:rFonts w:ascii="Calibri" w:hAnsi="Calibri" w:eastAsia="Calibri"/>
-          <w:b w:val="0"/>
-          <w:i w:val="0"/>
-          <w:sz w:val="22"/>
-        </w:rPr>
-        <w:t>✓ telefon hiç açılmıyor, sadece email ile iletişim istiyor</w:t>
-      </w:r>
-    </w:p>
-    <w:p>
-      <w:pPr>
-        <w:spacing w:after="120"/>
-      </w:pPr>
-      <w:r>
-        <w:rPr>
-          <w:rFonts w:ascii="Calibri" w:hAnsi="Calibri" w:eastAsia="Calibri"/>
-          <w:b/>
-          <w:i w:val="0"/>
-          <w:color w:val="1A365D"/>
-          <w:sz w:val="22"/>
-        </w:rPr>
-        <w:t>Koyma (bunlar Call Again):</w:t>
-      </w:r>
-    </w:p>
-    <w:p>
-      <w:pPr>
-        <w:pStyle w:val="ListBullet"/>
-        <w:spacing w:after="40"/>
-      </w:pPr>
-      <w:r>
-        <w:rPr>
-          <w:rFonts w:ascii="Calibri" w:hAnsi="Calibri" w:eastAsia="Calibri"/>
-          <w:b w:val="0"/>
-          <w:i w:val="0"/>
-          <w:sz w:val="22"/>
-        </w:rPr>
-        <w:t>✗ no money until salary in a few days / will start after salary</w:t>
-      </w:r>
-    </w:p>
-    <w:p>
-      <w:pPr>
-        <w:pStyle w:val="ListBullet"/>
-        <w:spacing w:after="40"/>
-      </w:pPr>
-      <w:r>
-        <w:rPr>
-          <w:rFonts w:ascii="Calibri" w:hAnsi="Calibri" w:eastAsia="Calibri"/>
-          <w:b w:val="0"/>
-          <w:i w:val="0"/>
-          <w:sz w:val="22"/>
-        </w:rPr>
-        <w:t>✗ cant afford now but will get help and deposit</w:t>
-      </w:r>
-    </w:p>
-    <w:p>
-      <w:pPr>
-        <w:pStyle w:val="ListBullet"/>
-        <w:spacing w:after="40"/>
-      </w:pPr>
-      <w:r>
-        <w:rPr>
-          <w:rFonts w:ascii="Calibri" w:hAnsi="Calibri" w:eastAsia="Calibri"/>
-          <w:b w:val="0"/>
-          <w:i w:val="0"/>
-          <w:sz w:val="22"/>
-        </w:rPr>
-        <w:t>✗ dont have funds — give me time to source</w:t>
+        <w:t>Add appointment day/time (IST/local) in comment/task after the call.</w:t>
       </w:r>
     </w:p>
     <w:p>
@@ -908,54 +686,57 @@
           <w:b/>
           <w:i w:val="0"/>
           <w:color w:val="2C5282"/>
-          <w:sz w:val="28"/>
+          <w:sz w:val="26"/>
         </w:rPr>
-        <w:t>2.5 No Potential - no documents — “Evrak engeli”</w:t>
+        <w:t>---- POTENTIAL</w:t>
       </w:r>
     </w:p>
     <w:p>
       <w:pPr>
-        <w:spacing w:after="120"/>
+        <w:pStyle w:val="ListBullet"/>
+        <w:spacing w:after="20"/>
       </w:pPr>
       <w:r>
         <w:rPr>
           <w:rFonts w:ascii="Calibri" w:hAnsi="Calibri" w:eastAsia="Calibri"/>
           <w:b w:val="0"/>
           <w:i w:val="0"/>
-          <w:color w:val="444444"/>
+          <w:color w:val="333333"/>
           <w:sz w:val="22"/>
         </w:rPr>
-        <w:t>Potansiyel yok çünkü ID / banka / POR yok. Genel No Potential’dan daha spesifik; varsa bunu seç.</w:t>
+        <w:t>Only with FTD agreement (date/time better) AND full or partial KYC.</w:t>
       </w:r>
     </w:p>
     <w:p>
       <w:pPr>
         <w:pStyle w:val="ListBullet"/>
-        <w:spacing w:after="40"/>
+        <w:spacing w:after="20"/>
       </w:pPr>
       <w:r>
         <w:rPr>
           <w:rFonts w:ascii="Calibri" w:hAnsi="Calibri" w:eastAsia="Calibri"/>
           <w:b w:val="0"/>
           <w:i w:val="0"/>
+          <w:color w:val="333333"/>
           <w:sz w:val="22"/>
         </w:rPr>
-        <w:t>✓ no id / no documents / no bank account / no POR</w:t>
+        <w:t>Bot often flags bare Potential as Manual Check — humans apply ops rules.</w:t>
       </w:r>
     </w:p>
     <w:p>
       <w:pPr>
         <w:pStyle w:val="ListBullet"/>
-        <w:spacing w:after="40"/>
+        <w:spacing w:after="20"/>
       </w:pPr>
       <w:r>
         <w:rPr>
           <w:rFonts w:ascii="Calibri" w:hAnsi="Calibri" w:eastAsia="Calibri"/>
           <w:b w:val="0"/>
           <w:i w:val="0"/>
+          <w:color w:val="333333"/>
           <w:sz w:val="22"/>
         </w:rPr>
-        <w:t>✗ Sadece “didnt register” → bu Recall; evrak değil</w:t>
+        <w:t>Later “not interested” → Recall, then No Interest if still refuses.</w:t>
       </w:r>
     </w:p>
     <w:p>
@@ -968,84 +749,151 @@
           <w:b/>
           <w:i w:val="0"/>
           <w:color w:val="2C5282"/>
-          <w:sz w:val="28"/>
+          <w:sz w:val="26"/>
         </w:rPr>
-        <w:t>2.6 No Answer 1-5 — “Telefon canlı, kimse yok”</w:t>
+        <w:t>---- RECALL</w:t>
       </w:r>
     </w:p>
     <w:p>
       <w:pPr>
-        <w:spacing w:after="120"/>
+        <w:spacing w:after="80"/>
+      </w:pPr>
+      <w:r>
+        <w:rPr>
+          <w:rFonts w:ascii="Calibri" w:hAnsi="Calibri" w:eastAsia="Calibri"/>
+          <w:b/>
+          <w:i w:val="0"/>
+          <w:color w:val="333333"/>
+          <w:sz w:val="22"/>
+        </w:rPr>
+        <w:t>First refusal / soft cold day — follow up next day.</w:t>
+      </w:r>
+    </w:p>
+    <w:p>
+      <w:pPr>
+        <w:pStyle w:val="ListBullet"/>
+        <w:spacing w:after="20"/>
       </w:pPr>
       <w:r>
         <w:rPr>
           <w:rFonts w:ascii="Calibri" w:hAnsi="Calibri" w:eastAsia="Calibri"/>
           <w:b w:val="0"/>
           <w:i w:val="0"/>
-          <w:color w:val="444444"/>
+          <w:color w:val="333333"/>
           <w:sz w:val="22"/>
         </w:rPr>
-        <w:t>Numara çalışıyor; ring / NA / VM / DVM / ndt / db. 1–5 deneme bandı.</w:t>
+        <w:t>not interested / doesn’t want (first day).</w:t>
       </w:r>
     </w:p>
     <w:p>
       <w:pPr>
         <w:pStyle w:val="ListBullet"/>
-        <w:spacing w:after="40"/>
+        <w:spacing w:after="20"/>
       </w:pPr>
       <w:r>
         <w:rPr>
           <w:rFonts w:ascii="Calibri" w:hAnsi="Calibri" w:eastAsia="Calibri"/>
           <w:b w:val="0"/>
           <w:i w:val="0"/>
+          <w:color w:val="333333"/>
           <w:sz w:val="22"/>
         </w:rPr>
-        <w:t>✓ na, vm, dvm, ring, ndt, cnbr, currently busy (konuşma yoksa)</w:t>
+        <w:t>dont think I’m interested.</w:t>
       </w:r>
     </w:p>
     <w:p>
       <w:pPr>
         <w:pStyle w:val="ListBullet"/>
-        <w:spacing w:after="40"/>
+        <w:spacing w:after="20"/>
       </w:pPr>
       <w:r>
         <w:rPr>
           <w:rFonts w:ascii="Calibri" w:hAnsi="Calibri" w:eastAsia="Calibri"/>
           <w:b w:val="0"/>
           <w:i w:val="0"/>
+          <w:color w:val="333333"/>
           <w:sz w:val="22"/>
         </w:rPr>
-        <w:t>✓ Invalid email olsa bile newest satır ring/NA/DVM ise → No Answer kalır (Wrong Number’a çekme)</w:t>
+        <w:t>Bare didnt register without identity denial (“not me”).</w:t>
       </w:r>
     </w:p>
     <w:p>
       <w:pPr>
         <w:pStyle w:val="ListBullet"/>
-        <w:spacing w:after="40"/>
+        <w:spacing w:after="20"/>
       </w:pPr>
       <w:r>
         <w:rPr>
           <w:rFonts w:ascii="Calibri" w:hAnsi="Calibri" w:eastAsia="Calibri"/>
           <w:b w:val="0"/>
           <w:i w:val="0"/>
+          <w:color w:val="333333"/>
           <w:sz w:val="22"/>
         </w:rPr>
-        <w:t>✗ Müşteri “call me later” dediyse → Call Again</w:t>
+        <w:t>Comment: Client not interested — follow-up next day (+ reason).</w:t>
       </w:r>
     </w:p>
     <w:p>
       <w:pPr>
+        <w:spacing w:after="80"/>
+      </w:pPr>
+      <w:r>
+        <w:rPr>
+          <w:rFonts w:ascii="Calibri" w:hAnsi="Calibri" w:eastAsia="Calibri"/>
+          <w:b/>
+          <w:i w:val="0"/>
+          <w:color w:val="333333"/>
+          <w:sz w:val="22"/>
+        </w:rPr>
+        <w:t>Not Recall:</w:t>
+      </w:r>
+    </w:p>
+    <w:p>
+      <w:pPr>
         <w:pStyle w:val="ListBullet"/>
-        <w:spacing w:after="40"/>
+        <w:spacing w:after="20"/>
       </w:pPr>
       <w:r>
         <w:rPr>
           <w:rFonts w:ascii="Calibri" w:hAnsi="Calibri" w:eastAsia="Calibri"/>
           <w:b w:val="0"/>
           <w:i w:val="0"/>
+          <w:color w:val="333333"/>
           <w:sz w:val="22"/>
         </w:rPr>
-        <w:t>✗ 5+ ayrı günde hep NA → No Answer 5 UP</w:t>
+        <w:t>DIY / dont need your help with no refuse → Call Again.</w:t>
+      </w:r>
+    </w:p>
+    <w:p>
+      <w:pPr>
+        <w:pStyle w:val="ListBullet"/>
+        <w:spacing w:after="20"/>
+      </w:pPr>
+      <w:r>
+        <w:rPr>
+          <w:rFonts w:ascii="Calibri" w:hAnsi="Calibri" w:eastAsia="Calibri"/>
+          <w:b w:val="0"/>
+          <w:i w:val="0"/>
+          <w:color w:val="333333"/>
+          <w:sz w:val="22"/>
+        </w:rPr>
+        <w:t>Two refusal days → No Interest.</w:t>
+      </w:r>
+    </w:p>
+    <w:p>
+      <w:pPr>
+        <w:pStyle w:val="ListBullet"/>
+        <w:spacing w:after="20"/>
+      </w:pPr>
+      <w:r>
+        <w:rPr>
+          <w:rFonts w:ascii="Calibri" w:hAnsi="Calibri" w:eastAsia="Calibri"/>
+          <w:b w:val="0"/>
+          <w:i w:val="0"/>
+          <w:color w:val="333333"/>
+          <w:sz w:val="22"/>
+        </w:rPr>
+        <w:t>Identity denial → Denied Registration.</w:t>
       </w:r>
     </w:p>
     <w:p>
@@ -1058,76 +906,120 @@
           <w:b/>
           <w:i w:val="0"/>
           <w:color w:val="2C5282"/>
-          <w:sz w:val="28"/>
+          <w:sz w:val="26"/>
         </w:rPr>
-        <w:t>2.7 No Answer 5 UP</w:t>
+        <w:t>---- NO INTEREST</w:t>
       </w:r>
     </w:p>
     <w:p>
       <w:pPr>
-        <w:spacing w:after="120"/>
+        <w:spacing w:after="80"/>
+      </w:pPr>
+      <w:r>
+        <w:rPr>
+          <w:rFonts w:ascii="Calibri" w:hAnsi="Calibri" w:eastAsia="Calibri"/>
+          <w:b/>
+          <w:i w:val="0"/>
+          <w:color w:val="333333"/>
+          <w:sz w:val="22"/>
+        </w:rPr>
+        <w:t>Lasting refusal. Push first.</w:t>
+      </w:r>
+    </w:p>
+    <w:p>
+      <w:pPr>
+        <w:pStyle w:val="ListBullet"/>
+        <w:spacing w:after="20"/>
       </w:pPr>
       <w:r>
         <w:rPr>
           <w:rFonts w:ascii="Calibri" w:hAnsi="Calibri" w:eastAsia="Calibri"/>
           <w:b w:val="0"/>
           <w:i w:val="0"/>
-          <w:color w:val="444444"/>
+          <w:color w:val="333333"/>
           <w:sz w:val="22"/>
         </w:rPr>
-        <w:t>5 veya daha fazla ayrı günde cevap yok. Mekanik yükseltme; Call Again’i de bu streak’te keser.</w:t>
+        <w:t>Refusal on two different days, OR</w:t>
       </w:r>
     </w:p>
     <w:p>
       <w:pPr>
-        <w:pStyle w:val="Heading2"/>
-      </w:pPr>
-      <w:r>
-        <w:rPr>
-          <w:rFonts w:ascii="Calibri" w:hAnsi="Calibri" w:eastAsia="Calibri"/>
-          <w:b w:val="0"/>
-          <w:sz w:val="22"/>
-        </w:rPr>
-        <w:t>Dil tutmuyor ve o dilde masa/çalışan yoksa No Language. Arapça gibi raporda masası olan dilde müşteri o agent’a aktarılır → Call Again.</w:t>
-      </w:r>
-    </w:p>
-    <w:p>
-      <w:pPr>
         <w:pStyle w:val="ListBullet"/>
-        <w:spacing w:after="40"/>
-      </w:pPr>
-      <w:r>
-        <w:rPr>
-          <w:rFonts w:ascii="Calibri" w:hAnsi="Calibri" w:eastAsia="Calibri"/>
-          <w:b w:val="0"/>
-          <w:sz w:val="22"/>
-        </w:rPr>
-        <w:t>✓ Mandarin / Tamil / hard time English (aktarım masası yok) → No Language</w:t>
-      </w:r>
-    </w:p>
-    <w:p>
-      <w:r>
-        <w:rPr>
-          <w:rFonts w:ascii="Calibri" w:hAnsi="Calibri" w:eastAsia="Calibri"/>
-          <w:b w:val="0"/>
-          <w:sz w:val="22"/>
-        </w:rPr>
-        <w:t>✓ arabic speaker / fluent in arabic (Arap ülkeleri masası var) → Call Again (aktarım)</w:t>
-      </w:r>
-    </w:p>
-    <w:p>
-      <w:pPr>
-        <w:pStyle w:val="ListBullet"/>
-        <w:spacing w:after="40"/>
+        <w:spacing w:after="20"/>
       </w:pPr>
       <w:r>
         <w:rPr>
           <w:rFonts w:ascii="Calibri" w:hAnsi="Calibri" w:eastAsia="Calibri"/>
           <w:b w:val="0"/>
           <w:i w:val="0"/>
+          <w:color w:val="333333"/>
           <w:sz w:val="22"/>
         </w:rPr>
-        <w:t>✗ Aynı cümlede “im not Ahmad … speak Arabic” → önce kimlik: Denied Registration (identity &gt; language)</w:t>
+        <w:t>Curse / scream / abusive + clear don’t want, OR</w:t>
+      </w:r>
+    </w:p>
+    <w:p>
+      <w:pPr>
+        <w:pStyle w:val="ListBullet"/>
+        <w:spacing w:after="20"/>
+      </w:pPr>
+      <w:r>
+        <w:rPr>
+          <w:rFonts w:ascii="Calibri" w:hAnsi="Calibri" w:eastAsia="Calibri"/>
+          <w:b w:val="0"/>
+          <w:i w:val="0"/>
+          <w:color w:val="333333"/>
+          <w:sz w:val="22"/>
+        </w:rPr>
+        <w:t>After Recall, 3 distinct NA days, OR</w:t>
+      </w:r>
+    </w:p>
+    <w:p>
+      <w:pPr>
+        <w:pStyle w:val="ListBullet"/>
+        <w:spacing w:after="20"/>
+      </w:pPr>
+      <w:r>
+        <w:rPr>
+          <w:rFonts w:ascii="Calibri" w:hAnsi="Calibri" w:eastAsia="Calibri"/>
+          <w:b w:val="0"/>
+          <w:i w:val="0"/>
+          <w:color w:val="333333"/>
+          <w:sz w:val="22"/>
+        </w:rPr>
+        <w:t>Strong never-call-again after proper Recall follow-up.</w:t>
+      </w:r>
+    </w:p>
+    <w:p>
+      <w:pPr>
+        <w:pStyle w:val="ListBullet"/>
+        <w:spacing w:after="20"/>
+      </w:pPr>
+      <w:r>
+        <w:rPr>
+          <w:rFonts w:ascii="Calibri" w:hAnsi="Calibri" w:eastAsia="Calibri"/>
+          <w:b w:val="0"/>
+          <w:i w:val="0"/>
+          <w:color w:val="333333"/>
+          <w:sz w:val="22"/>
+        </w:rPr>
+        <w:t>Always write the full reason in the comment.</w:t>
+      </w:r>
+    </w:p>
+    <w:p>
+      <w:pPr>
+        <w:pStyle w:val="ListBullet"/>
+        <w:spacing w:after="20"/>
+      </w:pPr>
+      <w:r>
+        <w:rPr>
+          <w:rFonts w:ascii="Calibri" w:hAnsi="Calibri" w:eastAsia="Calibri"/>
+          <w:b w:val="0"/>
+          <w:i w:val="0"/>
+          <w:color w:val="333333"/>
+          <w:sz w:val="22"/>
+        </w:rPr>
+        <w:t>First “not interested” only → Recall. Bare HU is not a refusal.</w:t>
       </w:r>
     </w:p>
     <w:p>
@@ -1140,69 +1032,119 @@
           <w:b/>
           <w:i w:val="0"/>
           <w:color w:val="2C5282"/>
-          <w:sz w:val="28"/>
+          <w:sz w:val="26"/>
         </w:rPr>
-        <w:t>2.9 Denied Registration — “Ben kayıtlı kişi değilim”</w:t>
+        <w:t>---- NO POTENTIAL</w:t>
       </w:r>
     </w:p>
     <w:p>
       <w:pPr>
-        <w:spacing w:after="120"/>
+        <w:spacing w:after="80"/>
+      </w:pPr>
+      <w:r>
+        <w:rPr>
+          <w:rFonts w:ascii="Calibri" w:hAnsi="Calibri" w:eastAsia="Calibri"/>
+          <w:b/>
+          <w:i w:val="0"/>
+          <w:color w:val="333333"/>
+          <w:sz w:val="22"/>
+        </w:rPr>
+        <w:t>Money/capacity path closed — not a short follow-up.</w:t>
+      </w:r>
+    </w:p>
+    <w:p>
+      <w:pPr>
+        <w:pStyle w:val="ListBullet"/>
+        <w:spacing w:after="20"/>
       </w:pPr>
       <w:r>
         <w:rPr>
           <w:rFonts w:ascii="Calibri" w:hAnsi="Calibri" w:eastAsia="Calibri"/>
           <w:b w:val="0"/>
           <w:i w:val="0"/>
-          <w:color w:val="444444"/>
+          <w:color w:val="333333"/>
           <w:sz w:val="22"/>
         </w:rPr>
-        <w:t>Kimlik inkârı şart. Tek gün → Denied Registration. İkinci gün tekrar → Wrong Number or Email.</w:t>
+        <w:t>No money / can’t afford / no capital + next month / by October / in 4 months / dont know when / reply when ready / not serious / discontinue with no plan.</w:t>
       </w:r>
     </w:p>
     <w:p>
       <w:pPr>
         <w:pStyle w:val="ListBullet"/>
-        <w:spacing w:after="40"/>
+        <w:spacing w:after="20"/>
       </w:pPr>
       <w:r>
         <w:rPr>
           <w:rFonts w:ascii="Calibri" w:hAnsi="Calibri" w:eastAsia="Calibri"/>
           <w:b w:val="0"/>
           <w:i w:val="0"/>
+          <w:color w:val="333333"/>
           <w:sz w:val="22"/>
         </w:rPr>
-        <w:t>✓ im not Ahmad / this is not me / wrong person / someone registered with my number + kimlik reddi</w:t>
+        <w:t>Capital affordable? no + HU.</w:t>
       </w:r>
     </w:p>
     <w:p>
       <w:pPr>
         <w:pStyle w:val="ListBullet"/>
-        <w:spacing w:after="40"/>
+        <w:spacing w:after="20"/>
       </w:pPr>
       <w:r>
         <w:rPr>
           <w:rFonts w:ascii="Calibri" w:hAnsi="Calibri" w:eastAsia="Calibri"/>
           <w:b w:val="0"/>
           <w:i w:val="0"/>
+          <w:color w:val="333333"/>
           <w:sz w:val="22"/>
         </w:rPr>
-        <w:t>✗ said I didnt register (kimlik yok) → Recall</w:t>
+        <w:t>Email-only / cannot take calls.</w:t>
       </w:r>
     </w:p>
     <w:p>
       <w:pPr>
+        <w:spacing w:after="80"/>
+      </w:pPr>
+      <w:r>
+        <w:rPr>
+          <w:rFonts w:ascii="Calibri" w:hAnsi="Calibri" w:eastAsia="Calibri"/>
+          <w:b/>
+          <w:i w:val="0"/>
+          <w:color w:val="333333"/>
+          <w:sz w:val="22"/>
+        </w:rPr>
+        <w:t>Not No Potential:</w:t>
+      </w:r>
+    </w:p>
+    <w:p>
+      <w:pPr>
         <w:pStyle w:val="ListBullet"/>
-        <w:spacing w:after="40"/>
+        <w:spacing w:after="20"/>
       </w:pPr>
       <w:r>
         <w:rPr>
           <w:rFonts w:ascii="Calibri" w:hAnsi="Calibri" w:eastAsia="Calibri"/>
           <w:b w:val="0"/>
           <w:i w:val="0"/>
+          <w:color w:val="333333"/>
           <w:sz w:val="22"/>
         </w:rPr>
-        <w:t>✗ no id / no bank → No Potential - no documents</w:t>
+        <w:t>Soft money + near plan → Call Again.</w:t>
+      </w:r>
+    </w:p>
+    <w:p>
+      <w:pPr>
+        <w:pStyle w:val="ListBullet"/>
+        <w:spacing w:after="20"/>
+      </w:pPr>
+      <w:r>
+        <w:rPr>
+          <w:rFonts w:ascii="Calibri" w:hAnsi="Calibri" w:eastAsia="Calibri"/>
+          <w:b w:val="0"/>
+          <w:i w:val="0"/>
+          <w:color w:val="333333"/>
+          <w:sz w:val="22"/>
+        </w:rPr>
+        <w:t>DIY self-serve without hard refuse → Call Again.</w:t>
       </w:r>
     </w:p>
     <w:p>
@@ -1215,69 +1157,41 @@
           <w:b/>
           <w:i w:val="0"/>
           <w:color w:val="2C5282"/>
-          <w:sz w:val="28"/>
+          <w:sz w:val="26"/>
         </w:rPr>
-        <w:t>2.10 Wrong Number or Email — “Numara/email gerçekten yanlış”</w:t>
+        <w:t>---- NO POTENTIAL - NO DOCUMENTS</w:t>
       </w:r>
     </w:p>
     <w:p>
       <w:pPr>
         <w:pStyle w:val="ListBullet"/>
-        <w:spacing w:after="40"/>
+        <w:spacing w:after="20"/>
       </w:pPr>
       <w:r>
         <w:rPr>
           <w:rFonts w:ascii="Calibri" w:hAnsi="Calibri" w:eastAsia="Calibri"/>
           <w:b w:val="0"/>
           <w:i w:val="0"/>
+          <w:color w:val="333333"/>
           <w:sz w:val="22"/>
         </w:rPr>
-        <w:t>✓ wrong number confirmed / number not in service / invalid number (telefon ölü)</w:t>
+        <w:t>no id / no documents / no bank / no POR.</w:t>
       </w:r>
     </w:p>
     <w:p>
       <w:pPr>
         <w:pStyle w:val="ListBullet"/>
-        <w:spacing w:after="40"/>
+        <w:spacing w:after="20"/>
       </w:pPr>
       <w:r>
         <w:rPr>
           <w:rFonts w:ascii="Calibri" w:hAnsi="Calibri" w:eastAsia="Calibri"/>
           <w:b w:val="0"/>
           <w:i w:val="0"/>
+          <w:color w:val="333333"/>
           <w:sz w:val="22"/>
         </w:rPr>
-        <w:t>✓ Kimlik inkârının ikinci günü</w:t>
-      </w:r>
-    </w:p>
-    <w:p>
-      <w:pPr>
-        <w:pStyle w:val="ListBullet"/>
-        <w:spacing w:after="40"/>
-      </w:pPr>
-      <w:r>
-        <w:rPr>
-          <w:rFonts w:ascii="Calibri" w:hAnsi="Calibri" w:eastAsia="Calibri"/>
-          <w:b w:val="0"/>
-          <w:i w:val="0"/>
-          <w:sz w:val="22"/>
-        </w:rPr>
-        <w:t>✗ Invalid email - CRM + newest ring/NA → No Answer (telefon canlı)</w:t>
-      </w:r>
-    </w:p>
-    <w:p>
-      <w:pPr>
-        <w:pStyle w:val="ListBullet"/>
-        <w:spacing w:after="40"/>
-      </w:pPr>
-      <w:r>
-        <w:rPr>
-          <w:rFonts w:ascii="Calibri" w:hAnsi="Calibri" w:eastAsia="Calibri"/>
-          <w:b w:val="0"/>
-          <w:i w:val="0"/>
-          <w:sz w:val="22"/>
-        </w:rPr>
-        <w:t>✗ Tek başına “CRM” kelimesi Wrong üretmez</w:t>
+        <w:t>Bare didnt register alone → Recall (not this status).</w:t>
       </w:r>
     </w:p>
     <w:p>
@@ -1290,24 +1204,57 @@
           <w:b/>
           <w:i w:val="0"/>
           <w:color w:val="2C5282"/>
-          <w:sz w:val="28"/>
+          <w:sz w:val="26"/>
         </w:rPr>
-        <w:t>2.11 Under 18 / Invalid Country</w:t>
+        <w:t>---- DECLINE</w:t>
       </w:r>
     </w:p>
     <w:p>
       <w:pPr>
-        <w:spacing w:after="120"/>
+        <w:pStyle w:val="ListBullet"/>
+        <w:spacing w:after="20"/>
       </w:pPr>
       <w:r>
         <w:rPr>
           <w:rFonts w:ascii="Calibri" w:hAnsi="Calibri" w:eastAsia="Calibri"/>
           <w:b w:val="0"/>
           <w:i w:val="0"/>
-          <w:color w:val="444444"/>
+          <w:color w:val="333333"/>
           <w:sz w:val="22"/>
         </w:rPr>
-        <w:t>Yaş &lt;18 veya ülke/pazar geçersiz. Net sinyal varsa koy; tahmin etme.</w:t>
+        <w:t>Tried deposit / decline path — comment full reason.</w:t>
+      </w:r>
+    </w:p>
+    <w:p>
+      <w:pPr>
+        <w:pStyle w:val="ListBullet"/>
+        <w:spacing w:after="20"/>
+      </w:pPr>
+      <w:r>
+        <w:rPr>
+          <w:rFonts w:ascii="Calibri" w:hAnsi="Calibri" w:eastAsia="Calibri"/>
+          <w:b w:val="0"/>
+          <w:i w:val="0"/>
+          <w:color w:val="333333"/>
+          <w:sz w:val="22"/>
+        </w:rPr>
+        <w:t>On-call decline: set from conversation (Call Again if they ask later).</w:t>
+      </w:r>
+    </w:p>
+    <w:p>
+      <w:pPr>
+        <w:pStyle w:val="ListBullet"/>
+        <w:spacing w:after="20"/>
+      </w:pPr>
+      <w:r>
+        <w:rPr>
+          <w:rFonts w:ascii="Calibri" w:hAnsi="Calibri" w:eastAsia="Calibri"/>
+          <w:b w:val="0"/>
+          <w:i w:val="0"/>
+          <w:color w:val="333333"/>
+          <w:sz w:val="22"/>
+        </w:rPr>
+        <w:t>CRM Decline often Manual Check for the bot.</w:t>
       </w:r>
     </w:p>
     <w:p>
@@ -1320,54 +1267,73 @@
           <w:b/>
           <w:i w:val="0"/>
           <w:color w:val="2C5282"/>
-          <w:sz w:val="28"/>
+          <w:sz w:val="26"/>
         </w:rPr>
-        <w:t>2.12 Manual Check / Decline / Duplicate / DNC</w:t>
+        <w:t>---- DENIED REGISTRATION</w:t>
       </w:r>
     </w:p>
     <w:p>
       <w:pPr>
-        <w:spacing w:after="120"/>
+        <w:pStyle w:val="ListBullet"/>
+        <w:spacing w:after="20"/>
       </w:pPr>
       <w:r>
         <w:rPr>
           <w:rFonts w:ascii="Calibri" w:hAnsi="Calibri" w:eastAsia="Calibri"/>
           <w:b w:val="0"/>
           <w:i w:val="0"/>
-          <w:color w:val="444444"/>
+          <w:color w:val="333333"/>
           <w:sz w:val="22"/>
         </w:rPr>
-        <w:t>Manual Check: karışık intent, hem kayıt hem red, net karar yok → insan baksın.</w:t>
+        <w:t>Identity denial: I’m not [name] / wrong person / this is not me.</w:t>
       </w:r>
     </w:p>
     <w:p>
       <w:pPr>
-        <w:spacing w:after="120"/>
+        <w:pStyle w:val="ListBullet"/>
+        <w:spacing w:after="20"/>
       </w:pPr>
       <w:r>
         <w:rPr>
           <w:rFonts w:ascii="Calibri" w:hAnsi="Calibri" w:eastAsia="Calibri"/>
           <w:b w:val="0"/>
           <w:i w:val="0"/>
-          <w:color w:val="444444"/>
+          <w:color w:val="333333"/>
           <w:sz w:val="22"/>
         </w:rPr>
-        <w:t>Decline / Duplicate / DNC: operasyonel; yorumdan otomatik uydurma. CRM’de bu status varsa Manual Check bandında bırak.</w:t>
+        <w:t>Day 1 → Denied Registration. Same claim later day → Wrong Number or Email.</w:t>
       </w:r>
     </w:p>
     <w:p>
       <w:pPr>
-        <w:pStyle w:val="Heading1"/>
+        <w:pStyle w:val="ListBullet"/>
+        <w:spacing w:after="20"/>
       </w:pPr>
       <w:r>
         <w:rPr>
           <w:rFonts w:ascii="Calibri" w:hAnsi="Calibri" w:eastAsia="Calibri"/>
-          <w:b/>
+          <w:b w:val="0"/>
           <w:i w:val="0"/>
-          <w:color w:val="1A365D"/>
-          <w:sz w:val="36"/>
+          <w:color w:val="333333"/>
+          <w:sz w:val="22"/>
         </w:rPr>
-        <w:t>3. En çok karışan durumlar</w:t>
+        <w:t>Bare didnt register → Recall. no id → NP-no documents.</w:t>
+      </w:r>
+    </w:p>
+    <w:p>
+      <w:pPr>
+        <w:pStyle w:val="ListBullet"/>
+        <w:spacing w:after="20"/>
+      </w:pPr>
+      <w:r>
+        <w:rPr>
+          <w:rFonts w:ascii="Calibri" w:hAnsi="Calibri" w:eastAsia="Calibri"/>
+          <w:b w:val="0"/>
+          <w:i w:val="0"/>
+          <w:color w:val="333333"/>
+          <w:sz w:val="22"/>
+        </w:rPr>
+        <w:t>Priority: identity &gt; language (im not Ahmad speak Arabic → Denied).</w:t>
       </w:r>
     </w:p>
     <w:p>
@@ -1380,99 +1346,73 @@
           <w:b/>
           <w:i w:val="0"/>
           <w:color w:val="2C5282"/>
-          <w:sz w:val="28"/>
+          <w:sz w:val="26"/>
         </w:rPr>
-        <w:t>3.1 Call Again mı, No Potential mı? (para)</w:t>
+        <w:t>---- NO LANGUAGE</w:t>
       </w:r>
     </w:p>
     <w:p>
       <w:pPr>
-        <w:spacing w:after="120"/>
+        <w:pStyle w:val="ListBullet"/>
+        <w:spacing w:after="20"/>
       </w:pPr>
       <w:r>
         <w:rPr>
           <w:rFonts w:ascii="Calibri" w:hAnsi="Calibri" w:eastAsia="Calibri"/>
           <w:b w:val="0"/>
           <w:i w:val="0"/>
-          <w:color w:val="444444"/>
+          <w:color w:val="333333"/>
           <w:sz w:val="22"/>
         </w:rPr>
-        <w:t>Soru: “Parası yok — ama yakında bir yol var mı?”</w:t>
+        <w:t>No desk speaker for that language (e.g. Mandarin / unsupported) → No Language.</w:t>
       </w:r>
     </w:p>
     <w:p>
       <w:pPr>
         <w:pStyle w:val="ListBullet"/>
-        <w:spacing w:after="40"/>
+        <w:spacing w:after="20"/>
       </w:pPr>
       <w:r>
         <w:rPr>
           <w:rFonts w:ascii="Calibri" w:hAnsi="Calibri" w:eastAsia="Calibri"/>
           <w:b w:val="0"/>
           <w:i w:val="0"/>
+          <w:color w:val="333333"/>
           <w:sz w:val="22"/>
         </w:rPr>
-        <w:t>Yakın plan (maaş günü, arrange, friends, will deposit soon) → Call Again</w:t>
+        <w:t>Arabic with desk/speakers in report → Call Again (transfer).</w:t>
       </w:r>
     </w:p>
     <w:p>
       <w:pPr>
         <w:pStyle w:val="ListBullet"/>
-        <w:spacing w:after="40"/>
+        <w:spacing w:after="20"/>
       </w:pPr>
       <w:r>
         <w:rPr>
           <w:rFonts w:ascii="Calibri" w:hAnsi="Calibri" w:eastAsia="Calibri"/>
           <w:b w:val="0"/>
           <w:i w:val="0"/>
+          <w:color w:val="333333"/>
           <w:sz w:val="22"/>
         </w:rPr>
-        <w:t>Uzak / belirsiz / vazgeçmiş (next month, October, not sure when, not serious) → No Potential</w:t>
+        <w:t>arabic not available / no Arabic agent → No Language OK.</w:t>
       </w:r>
     </w:p>
     <w:p>
       <w:pPr>
-        <w:spacing w:after="120"/>
+        <w:pStyle w:val="ListBullet"/>
+        <w:spacing w:after="20"/>
       </w:pPr>
       <w:r>
         <w:rPr>
           <w:rFonts w:ascii="Calibri" w:hAnsi="Calibri" w:eastAsia="Calibri"/>
           <w:b w:val="0"/>
           <w:i w:val="0"/>
-          <w:color w:val="444444"/>
+          <w:color w:val="333333"/>
           <w:sz w:val="22"/>
         </w:rPr>
-        <w:t>Örnek:</w:t>
-      </w:r>
-    </w:p>
-    <w:p>
-      <w:pPr>
-        <w:pStyle w:val="ListBullet"/>
-        <w:spacing w:after="40"/>
-      </w:pPr>
-      <w:r>
-        <w:rPr>
-          <w:rFonts w:ascii="Calibri" w:hAnsi="Calibri" w:eastAsia="Calibri"/>
-          <w:b w:val="0"/>
-          <w:i w:val="0"/>
-          <w:sz w:val="22"/>
-        </w:rPr>
-        <w:t>✓ “no money until salary then will start” → Call Again</w:t>
-      </w:r>
-    </w:p>
-    <w:p>
-      <w:pPr>
-        <w:pStyle w:val="ListBullet"/>
-        <w:spacing w:after="40"/>
-      </w:pPr>
-      <w:r>
-        <w:rPr>
-          <w:rFonts w:ascii="Calibri" w:hAnsi="Calibri" w:eastAsia="Calibri"/>
-          <w:b w:val="0"/>
-          <w:i w:val="0"/>
-          <w:sz w:val="22"/>
-        </w:rPr>
-        <w:t>✗ “does not have the money next month not sure” → No Potential</w:t>
+        <w:t>Do not use from VM/background/country code/NA alone. Comment which language.</w:t>
       </w:r>
     </w:p>
     <w:p>
@@ -1485,54 +1425,25 @@
           <w:b/>
           <w:i w:val="0"/>
           <w:color w:val="2C5282"/>
-          <w:sz w:val="28"/>
+          <w:sz w:val="26"/>
         </w:rPr>
-        <w:t>3.2 Call Again mı, Recall mı?</w:t>
+        <w:t>---- UNDER 18</w:t>
       </w:r>
     </w:p>
     <w:p>
       <w:pPr>
         <w:pStyle w:val="ListBullet"/>
-        <w:spacing w:after="40"/>
+        <w:spacing w:after="20"/>
       </w:pPr>
       <w:r>
         <w:rPr>
           <w:rFonts w:ascii="Calibri" w:hAnsi="Calibri" w:eastAsia="Calibri"/>
           <w:b w:val="0"/>
           <w:i w:val="0"/>
+          <w:color w:val="333333"/>
           <w:sz w:val="22"/>
         </w:rPr>
-        <w:t>Müşteri “beni ara” / meşgul ama açık kapı → Call Again</w:t>
-      </w:r>
-    </w:p>
-    <w:p>
-      <w:pPr>
-        <w:pStyle w:val="ListBullet"/>
-        <w:spacing w:after="40"/>
-      </w:pPr>
-      <w:r>
-        <w:rPr>
-          <w:rFonts w:ascii="Calibri" w:hAnsi="Calibri" w:eastAsia="Calibri"/>
-          <w:b w:val="0"/>
-          <w:i w:val="0"/>
-          <w:sz w:val="22"/>
-        </w:rPr>
-        <w:t>Müşteri “istemiyorum / kendim yaparım / ilgilenmiyorum” → Recall</w:t>
-      </w:r>
-    </w:p>
-    <w:p>
-      <w:pPr>
-        <w:pStyle w:val="ListBullet"/>
-        <w:spacing w:after="40"/>
-      </w:pPr>
-      <w:r>
-        <w:rPr>
-          <w:rFonts w:ascii="Calibri" w:hAnsi="Calibri" w:eastAsia="Calibri"/>
-          <w:b w:val="0"/>
-          <w:i w:val="0"/>
-          <w:sz w:val="22"/>
-        </w:rPr>
-        <w:t>Agent cb:vm yazmış ama müşteri red demiş → Recall (agent notu Call Again yapmaz)</w:t>
+        <w:t>Under 18 — write exact age. Do not guess; ask again if unsure.</w:t>
       </w:r>
     </w:p>
     <w:p>
@@ -1545,39 +1456,89 @@
           <w:b/>
           <w:i w:val="0"/>
           <w:color w:val="2C5282"/>
-          <w:sz w:val="28"/>
+          <w:sz w:val="26"/>
         </w:rPr>
-        <w:t>3.3 Recall mı, No Interest mı?</w:t>
+        <w:t>---- WRONG NUMBER OR EMAIL</w:t>
       </w:r>
     </w:p>
     <w:p>
       <w:pPr>
         <w:pStyle w:val="ListBullet"/>
-        <w:spacing w:after="40"/>
+        <w:spacing w:after="20"/>
       </w:pPr>
       <w:r>
         <w:rPr>
           <w:rFonts w:ascii="Calibri" w:hAnsi="Calibri" w:eastAsia="Calibri"/>
           <w:b w:val="0"/>
           <w:i w:val="0"/>
+          <w:color w:val="333333"/>
           <w:sz w:val="22"/>
         </w:rPr>
-        <w:t>1. red günü → Recall</w:t>
+        <w:t>Not in service / incorrect / support-confirmed invalid.</w:t>
       </w:r>
     </w:p>
     <w:p>
       <w:pPr>
         <w:pStyle w:val="ListBullet"/>
-        <w:spacing w:after="40"/>
+        <w:spacing w:after="20"/>
       </w:pPr>
       <w:r>
         <w:rPr>
           <w:rFonts w:ascii="Calibri" w:hAnsi="Calibri" w:eastAsia="Calibri"/>
           <w:b w:val="0"/>
           <w:i w:val="0"/>
+          <w:color w:val="333333"/>
           <w:sz w:val="22"/>
         </w:rPr>
-        <w:t>2. red günü (veya küfür+istemiyorum) → No Interest</w:t>
+        <w:t>Identity denial repeated on a second day.</w:t>
+      </w:r>
+    </w:p>
+    <w:p>
+      <w:pPr>
+        <w:pStyle w:val="ListBullet"/>
+        <w:spacing w:after="20"/>
+      </w:pPr>
+      <w:r>
+        <w:rPr>
+          <w:rFonts w:ascii="Calibri" w:hAnsi="Calibri" w:eastAsia="Calibri"/>
+          <w:b w:val="0"/>
+          <w:i w:val="0"/>
+          <w:color w:val="333333"/>
+          <w:sz w:val="22"/>
+        </w:rPr>
+        <w:t>Do NOT: invalid email while phone rings/NA/VM → No Answer.</w:t>
+      </w:r>
+    </w:p>
+    <w:p>
+      <w:pPr>
+        <w:pStyle w:val="ListBullet"/>
+        <w:spacing w:after="20"/>
+      </w:pPr>
+      <w:r>
+        <w:rPr>
+          <w:rFonts w:ascii="Calibri" w:hAnsi="Calibri" w:eastAsia="Calibri"/>
+          <w:b w:val="0"/>
+          <w:i w:val="0"/>
+          <w:color w:val="333333"/>
+          <w:sz w:val="22"/>
+        </w:rPr>
+        <w:t>Do NOT: day-one weird tone only — note it; don’t junk immediately.</w:t>
+      </w:r>
+    </w:p>
+    <w:p>
+      <w:pPr>
+        <w:pStyle w:val="ListBullet"/>
+        <w:spacing w:after="20"/>
+      </w:pPr>
+      <w:r>
+        <w:rPr>
+          <w:rFonts w:ascii="Calibri" w:hAnsi="Calibri" w:eastAsia="Calibri"/>
+          <w:b w:val="0"/>
+          <w:i w:val="0"/>
+          <w:color w:val="333333"/>
+          <w:sz w:val="22"/>
+        </w:rPr>
+        <w:t>Do NOT: “my name but I didn’t register” alone → Recall/NI path, not Wrong Number.</w:t>
       </w:r>
     </w:p>
     <w:p>
@@ -1590,54 +1551,25 @@
           <w:b/>
           <w:i w:val="0"/>
           <w:color w:val="2C5282"/>
-          <w:sz w:val="28"/>
+          <w:sz w:val="26"/>
         </w:rPr>
-        <w:t>3.4 No Answer mı, Wrong Number mı?</w:t>
+        <w:t>---- DUPLICATE / DNC / INVALID COUNTRY</w:t>
       </w:r>
     </w:p>
     <w:p>
       <w:pPr>
         <w:pStyle w:val="ListBullet"/>
-        <w:spacing w:after="40"/>
+        <w:spacing w:after="20"/>
       </w:pPr>
       <w:r>
         <w:rPr>
           <w:rFonts w:ascii="Calibri" w:hAnsi="Calibri" w:eastAsia="Calibri"/>
           <w:b w:val="0"/>
           <w:i w:val="0"/>
+          <w:color w:val="333333"/>
           <w:sz w:val="22"/>
         </w:rPr>
-        <w:t>Telefon çalıyor / VM / NA → No Answer</w:t>
-      </w:r>
-    </w:p>
-    <w:p>
-      <w:pPr>
-        <w:pStyle w:val="ListBullet"/>
-        <w:spacing w:after="40"/>
-      </w:pPr>
-      <w:r>
-        <w:rPr>
-          <w:rFonts w:ascii="Calibri" w:hAnsi="Calibri" w:eastAsia="Calibri"/>
-          <w:b w:val="0"/>
-          <w:i w:val="0"/>
-          <w:sz w:val="22"/>
-        </w:rPr>
-        <w:t>Numara geçersiz / servis dışı / ikinci kimlik inkârı günü → Wrong Number</w:t>
-      </w:r>
-    </w:p>
-    <w:p>
-      <w:pPr>
-        <w:pStyle w:val="ListBullet"/>
-        <w:spacing w:after="40"/>
-      </w:pPr>
-      <w:r>
-        <w:rPr>
-          <w:rFonts w:ascii="Calibri" w:hAnsi="Calibri" w:eastAsia="Calibri"/>
-          <w:b w:val="0"/>
-          <w:i w:val="0"/>
-          <w:sz w:val="22"/>
-        </w:rPr>
-        <w:t>Eski satırda Invalid email, yenide ring → No Answer</w:t>
+        <w:t>Duplicate / DNC / Invalid Country — mostly TL/CRM/support; bot often Manual Check.</w:t>
       </w:r>
     </w:p>
     <w:p>
@@ -1650,39 +1582,169 @@
           <w:b/>
           <w:i w:val="0"/>
           <w:color w:val="2C5282"/>
-          <w:sz w:val="28"/>
+          <w:sz w:val="26"/>
         </w:rPr>
-        <w:t>3.5 No Language mı, Denied Registration mı?</w:t>
+        <w:t>---- PRIORITY TREE</w:t>
       </w:r>
     </w:p>
     <w:p>
       <w:pPr>
         <w:pStyle w:val="ListBullet"/>
-        <w:spacing w:after="40"/>
+        <w:spacing w:after="20"/>
       </w:pPr>
       <w:r>
         <w:rPr>
           <w:rFonts w:ascii="Calibri" w:hAnsi="Calibri" w:eastAsia="Calibri"/>
           <w:b w:val="0"/>
           <w:i w:val="0"/>
+          <w:color w:val="333333"/>
           <w:sz w:val="22"/>
         </w:rPr>
-        <w:t>Sadece dil → No Language</w:t>
+        <w:t>1) Identity denial → Denied (then Wrong on repeat day)</w:t>
       </w:r>
     </w:p>
     <w:p>
       <w:pPr>
         <w:pStyle w:val="ListBullet"/>
-        <w:spacing w:after="40"/>
+        <w:spacing w:after="20"/>
       </w:pPr>
       <w:r>
         <w:rPr>
           <w:rFonts w:ascii="Calibri" w:hAnsi="Calibri" w:eastAsia="Calibri"/>
           <w:b w:val="0"/>
           <w:i w:val="0"/>
+          <w:color w:val="333333"/>
           <w:sz w:val="22"/>
         </w:rPr>
-        <w:t>“Ben o değilim” (+ dil olsa bile) → Denied Registration</w:t>
+        <w:t>2) Arabic desk → Call Again; unsupported language → No Language</w:t>
+      </w:r>
+    </w:p>
+    <w:p>
+      <w:pPr>
+        <w:pStyle w:val="ListBullet"/>
+        <w:spacing w:after="20"/>
+      </w:pPr>
+      <w:r>
+        <w:rPr>
+          <w:rFonts w:ascii="Calibri" w:hAnsi="Calibri" w:eastAsia="Calibri"/>
+          <w:b w:val="0"/>
+          <w:i w:val="0"/>
+          <w:color w:val="333333"/>
+          <w:sz w:val="22"/>
+        </w:rPr>
+        <w:t>3) Under 18 / Invalid Country</w:t>
+      </w:r>
+    </w:p>
+    <w:p>
+      <w:pPr>
+        <w:pStyle w:val="ListBullet"/>
+        <w:spacing w:after="20"/>
+      </w:pPr>
+      <w:r>
+        <w:rPr>
+          <w:rFonts w:ascii="Calibri" w:hAnsi="Calibri" w:eastAsia="Calibri"/>
+          <w:b w:val="0"/>
+          <w:i w:val="0"/>
+          <w:color w:val="333333"/>
+          <w:sz w:val="22"/>
+        </w:rPr>
+        <w:t>4) Hard/distant money → No Potential</w:t>
+      </w:r>
+    </w:p>
+    <w:p>
+      <w:pPr>
+        <w:pStyle w:val="ListBullet"/>
+        <w:spacing w:after="20"/>
+      </w:pPr>
+      <w:r>
+        <w:rPr>
+          <w:rFonts w:ascii="Calibri" w:hAnsi="Calibri" w:eastAsia="Calibri"/>
+          <w:b w:val="0"/>
+          <w:i w:val="0"/>
+          <w:color w:val="333333"/>
+          <w:sz w:val="22"/>
+        </w:rPr>
+        <w:t>5) Soft money + near plan → Call Again</w:t>
+      </w:r>
+    </w:p>
+    <w:p>
+      <w:pPr>
+        <w:pStyle w:val="ListBullet"/>
+        <w:spacing w:after="20"/>
+      </w:pPr>
+      <w:r>
+        <w:rPr>
+          <w:rFonts w:ascii="Calibri" w:hAnsi="Calibri" w:eastAsia="Calibri"/>
+          <w:b w:val="0"/>
+          <w:i w:val="0"/>
+          <w:color w:val="333333"/>
+          <w:sz w:val="22"/>
+        </w:rPr>
+        <w:t>6) no id/bank/POR → No Potential - no documents</w:t>
+      </w:r>
+    </w:p>
+    <w:p>
+      <w:pPr>
+        <w:pStyle w:val="ListBullet"/>
+        <w:spacing w:after="20"/>
+      </w:pPr>
+      <w:r>
+        <w:rPr>
+          <w:rFonts w:ascii="Calibri" w:hAnsi="Calibri" w:eastAsia="Calibri"/>
+          <w:b w:val="0"/>
+          <w:i w:val="0"/>
+          <w:color w:val="333333"/>
+          <w:sz w:val="22"/>
+        </w:rPr>
+        <w:t>7) Refuse → Recall (day1) / No Interest (day2 or abuse)</w:t>
+      </w:r>
+    </w:p>
+    <w:p>
+      <w:pPr>
+        <w:pStyle w:val="ListBullet"/>
+        <w:spacing w:after="20"/>
+      </w:pPr>
+      <w:r>
+        <w:rPr>
+          <w:rFonts w:ascii="Calibri" w:hAnsi="Calibri" w:eastAsia="Calibri"/>
+          <w:b w:val="0"/>
+          <w:i w:val="0"/>
+          <w:color w:val="333333"/>
+          <w:sz w:val="22"/>
+        </w:rPr>
+        <w:t>8) Real customer CB / busy-with-talk → Call Again</w:t>
+      </w:r>
+    </w:p>
+    <w:p>
+      <w:pPr>
+        <w:pStyle w:val="ListBullet"/>
+        <w:spacing w:after="20"/>
+      </w:pPr>
+      <w:r>
+        <w:rPr>
+          <w:rFonts w:ascii="Calibri" w:hAnsi="Calibri" w:eastAsia="Calibri"/>
+          <w:b w:val="0"/>
+          <w:i w:val="0"/>
+          <w:color w:val="333333"/>
+          <w:sz w:val="22"/>
+        </w:rPr>
+        <w:t>9) Dialer-only / HU no talk → No Answer 1-5 (5+ days → 5 UP)</w:t>
+      </w:r>
+    </w:p>
+    <w:p>
+      <w:pPr>
+        <w:pStyle w:val="ListBullet"/>
+        <w:spacing w:after="20"/>
+      </w:pPr>
+      <w:r>
+        <w:rPr>
+          <w:rFonts w:ascii="Calibri" w:hAnsi="Calibri" w:eastAsia="Calibri"/>
+          <w:b w:val="0"/>
+          <w:i w:val="0"/>
+          <w:color w:val="333333"/>
+          <w:sz w:val="22"/>
+        </w:rPr>
+        <w:t>10) Unclear → Manual Check</w:t>
       </w:r>
     </w:p>
     <w:p>
@@ -1695,249 +1757,189 @@
           <w:b/>
           <w:i w:val="0"/>
           <w:color w:val="2C5282"/>
-          <w:sz w:val="28"/>
+          <w:sz w:val="26"/>
         </w:rPr>
-        <w:t>3.6 Denied Registration mı, Recall mı, NP-docs mı?</w:t>
+        <w:t>---- SHORT RULES</w:t>
       </w:r>
     </w:p>
     <w:p>
       <w:pPr>
-        <w:pStyle w:val="ListBullet"/>
-        <w:spacing w:after="40"/>
-      </w:pPr>
-      <w:r>
-        <w:rPr>
-          <w:rFonts w:ascii="Calibri" w:hAnsi="Calibri" w:eastAsia="Calibri"/>
-          <w:b w:val="0"/>
-          <w:i w:val="0"/>
-          <w:sz w:val="22"/>
-        </w:rPr>
-        <w:t>Kimlik inkârı → Denied</w:t>
-      </w:r>
-    </w:p>
-    <w:p>
-      <w:pPr>
-        <w:pStyle w:val="ListBullet"/>
-        <w:spacing w:after="40"/>
-      </w:pPr>
-      <w:r>
-        <w:rPr>
-          <w:rFonts w:ascii="Calibri" w:hAnsi="Calibri" w:eastAsia="Calibri"/>
-          <w:b w:val="0"/>
-          <w:i w:val="0"/>
-          <w:sz w:val="22"/>
-        </w:rPr>
-        <w:t>Bare “didnt register” → Recall</w:t>
-      </w:r>
-    </w:p>
-    <w:p>
-      <w:pPr>
-        <w:pStyle w:val="ListBullet"/>
-        <w:spacing w:after="40"/>
-      </w:pPr>
-      <w:r>
-        <w:rPr>
-          <w:rFonts w:ascii="Calibri" w:hAnsi="Calibri" w:eastAsia="Calibri"/>
-          <w:b w:val="0"/>
-          <w:i w:val="0"/>
-          <w:sz w:val="22"/>
-        </w:rPr>
-        <w:t>no id / no documents / no bank → No Potential - no documents</w:t>
-      </w:r>
-    </w:p>
-    <w:p>
-      <w:pPr>
-        <w:pStyle w:val="Heading1"/>
+        <w:spacing w:after="80"/>
       </w:pPr>
       <w:r>
         <w:rPr>
           <w:rFonts w:ascii="Calibri" w:hAnsi="Calibri" w:eastAsia="Calibri"/>
           <w:b/>
           <w:i w:val="0"/>
-          <w:color w:val="1A365D"/>
-          <w:sz w:val="36"/>
+          <w:color w:val="333333"/>
+          <w:sz w:val="22"/>
         </w:rPr>
-        <w:t>4. Agent notu ≠ müşteri sözü</w:t>
+        <w:t>Call Again — real talk still workable; customer CB; soft money + near plan; DIY self-serve; Arabic transfer.</w:t>
       </w:r>
     </w:p>
     <w:p>
       <w:pPr>
-        <w:spacing w:after="120"/>
-      </w:pPr>
-      <w:r>
-        <w:rPr>
-          <w:rFonts w:ascii="Calibri" w:hAnsi="Calibri" w:eastAsia="Calibri"/>
-          <w:b w:val="0"/>
-          <w:i w:val="0"/>
-          <w:color w:val="444444"/>
-          <w:sz w:val="22"/>
-        </w:rPr>
-        <w:t>Şunlar agent’ın kendi arama kaydıdır. Müşteri “beni ara” demiş sayılmaz:</w:t>
-      </w:r>
-    </w:p>
-    <w:p>
-      <w:pPr>
-        <w:pStyle w:val="ListBullet"/>
-        <w:spacing w:after="40"/>
-      </w:pPr>
-      <w:r>
-        <w:rPr>
-          <w:rFonts w:ascii="Calibri" w:hAnsi="Calibri" w:eastAsia="Calibri"/>
-          <w:b w:val="0"/>
-          <w:i w:val="0"/>
-          <w:sz w:val="22"/>
-        </w:rPr>
-        <w:t>cb : vm  /  cb na  /  cb ndt  /  cb rej  /  call again rej</w:t>
-      </w:r>
-    </w:p>
-    <w:p>
-      <w:pPr>
-        <w:pStyle w:val="ListBullet"/>
-        <w:spacing w:after="40"/>
-      </w:pPr>
-      <w:r>
-        <w:rPr>
-          <w:rFonts w:ascii="Calibri" w:hAnsi="Calibri" w:eastAsia="Calibri"/>
-          <w:b w:val="0"/>
-          <w:i w:val="0"/>
-          <w:sz w:val="22"/>
-        </w:rPr>
-        <w:t>CALLED BACK PUHU  /  when I tried to cb she rejected</w:t>
-      </w:r>
-    </w:p>
-    <w:p>
-      <w:pPr>
-        <w:pStyle w:val="ListBullet"/>
-        <w:spacing w:after="40"/>
-      </w:pPr>
-      <w:r>
-        <w:rPr>
-          <w:rFonts w:ascii="Calibri" w:hAnsi="Calibri" w:eastAsia="Calibri"/>
-          <w:b w:val="0"/>
-          <w:i w:val="0"/>
-          <w:sz w:val="22"/>
-        </w:rPr>
-        <w:t>I said I would hang up and call back</w:t>
-      </w:r>
-    </w:p>
-    <w:p>
-      <w:pPr>
-        <w:spacing w:after="120"/>
-      </w:pPr>
-      <w:r>
-        <w:rPr>
-          <w:rFonts w:ascii="Calibri" w:hAnsi="Calibri" w:eastAsia="Calibri"/>
-          <w:b w:val="0"/>
-          <w:i w:val="0"/>
-          <w:color w:val="444444"/>
-          <w:sz w:val="22"/>
-        </w:rPr>
-        <w:t>Ne yapmalısın? Bu notları silip düşün: geriye müşteri ne demiş? O cümle status’u belirler.</w:t>
-      </w:r>
-    </w:p>
-    <w:p>
-      <w:pPr>
-        <w:pStyle w:val="Heading1"/>
+        <w:spacing w:after="80"/>
       </w:pPr>
       <w:r>
         <w:rPr>
           <w:rFonts w:ascii="Calibri" w:hAnsi="Calibri" w:eastAsia="Calibri"/>
           <w:b/>
           <w:i w:val="0"/>
-          <w:color w:val="1A365D"/>
-          <w:sz w:val="36"/>
+          <w:color w:val="333333"/>
+          <w:sz w:val="22"/>
         </w:rPr>
-        <w:t>5. Yorum okuma alışkanlığı</w:t>
+        <w:t>No Potential — money/capacity dead or distant (next month, don’t know when, not serious).</w:t>
       </w:r>
     </w:p>
     <w:p>
       <w:pPr>
-        <w:pStyle w:val="ListNumber"/>
-        <w:spacing w:after="40"/>
-      </w:pPr>
-      <w:r>
-        <w:rPr>
-          <w:rFonts w:ascii="Calibri" w:hAnsi="Calibri" w:eastAsia="Calibri"/>
-          <w:b w:val="0"/>
-          <w:i w:val="0"/>
-          <w:sz w:val="22"/>
-        </w:rPr>
-        <w:t>En yeni anlamlı satırı bul (email subject / In Progress / tek başına status etiketi değil).</w:t>
-      </w:r>
-    </w:p>
-    <w:p>
-      <w:pPr>
-        <w:pStyle w:val="ListNumber"/>
-        <w:spacing w:after="40"/>
-      </w:pPr>
-      <w:r>
-        <w:rPr>
-          <w:rFonts w:ascii="Calibri" w:hAnsi="Calibri" w:eastAsia="Calibri"/>
-          <w:b w:val="0"/>
-          <w:i w:val="0"/>
-          <w:sz w:val="22"/>
-        </w:rPr>
-        <w:t>Agent dial notunu ayıkla.</w:t>
-      </w:r>
-    </w:p>
-    <w:p>
-      <w:pPr>
-        <w:pStyle w:val="ListNumber"/>
-        <w:spacing w:after="40"/>
-      </w:pPr>
-      <w:r>
-        <w:rPr>
-          <w:rFonts w:ascii="Calibri" w:hAnsi="Calibri" w:eastAsia="Calibri"/>
-          <w:b w:val="0"/>
-          <w:i w:val="0"/>
-          <w:sz w:val="22"/>
-        </w:rPr>
-        <w:t>Öncelik ağacını uygula (bölüm 1).</w:t>
-      </w:r>
-    </w:p>
-    <w:p>
-      <w:pPr>
-        <w:pStyle w:val="ListNumber"/>
-        <w:spacing w:after="40"/>
-      </w:pPr>
-      <w:r>
-        <w:rPr>
-          <w:rFonts w:ascii="Calibri" w:hAnsi="Calibri" w:eastAsia="Calibri"/>
-          <w:b w:val="0"/>
-          <w:i w:val="0"/>
-          <w:sz w:val="22"/>
-        </w:rPr>
-        <w:t>Şüphen varsa: Manual Check — uydurma status koyma.</w:t>
-      </w:r>
-    </w:p>
-    <w:p>
-      <w:pPr>
-        <w:pStyle w:val="ListNumber"/>
-        <w:spacing w:after="40"/>
-      </w:pPr>
-      <w:r>
-        <w:rPr>
-          <w:rFonts w:ascii="Calibri" w:hAnsi="Calibri" w:eastAsia="Calibri"/>
-          <w:b w:val="0"/>
-          <w:i w:val="0"/>
-          <w:sz w:val="22"/>
-        </w:rPr>
-        <w:t>CRM’de zaten doğru bir nihai status varsa ve yeni yorum çelişmiyorsa değiştirme.</w:t>
-      </w:r>
-    </w:p>
-    <w:p>
-      <w:pPr>
-        <w:pStyle w:val="Heading1"/>
+        <w:spacing w:after="80"/>
       </w:pPr>
       <w:r>
         <w:rPr>
           <w:rFonts w:ascii="Calibri" w:hAnsi="Calibri" w:eastAsia="Calibri"/>
           <w:b/>
           <w:i w:val="0"/>
-          <w:color w:val="1A365D"/>
-          <w:sz w:val="36"/>
+          <w:color w:val="333333"/>
+          <w:sz w:val="22"/>
         </w:rPr>
-        <w:t>6. Cep kartı (özet tablo)</w:t>
+        <w:t>Recall — first refusal day / bare didn’t register (no identity denial).</w:t>
+      </w:r>
+    </w:p>
+    <w:p>
+      <w:pPr>
+        <w:spacing w:after="80"/>
+      </w:pPr>
+      <w:r>
+        <w:rPr>
+          <w:rFonts w:ascii="Calibri" w:hAnsi="Calibri" w:eastAsia="Calibri"/>
+          <w:b/>
+          <w:i w:val="0"/>
+          <w:color w:val="333333"/>
+          <w:sz w:val="22"/>
+        </w:rPr>
+        <w:t>No Interest — two refusal days, abuse+refuse, or Recall then 3 NA days.</w:t>
+      </w:r>
+    </w:p>
+    <w:p>
+      <w:pPr>
+        <w:spacing w:after="80"/>
+      </w:pPr>
+      <w:r>
+        <w:rPr>
+          <w:rFonts w:ascii="Calibri" w:hAnsi="Calibri" w:eastAsia="Calibri"/>
+          <w:b/>
+          <w:i w:val="0"/>
+          <w:color w:val="333333"/>
+          <w:sz w:val="22"/>
+        </w:rPr>
+        <w:t>No Answer — no real conversation; phone alive.</w:t>
+      </w:r>
+    </w:p>
+    <w:p>
+      <w:pPr>
+        <w:spacing w:after="80"/>
+      </w:pPr>
+      <w:r>
+        <w:rPr>
+          <w:rFonts w:ascii="Calibri" w:hAnsi="Calibri" w:eastAsia="Calibri"/>
+          <w:b/>
+          <w:i w:val="0"/>
+          <w:color w:val="333333"/>
+          <w:sz w:val="22"/>
+        </w:rPr>
+        <w:t>Denied — not me / wrong person day 1; repeat → Wrong Number.</w:t>
+      </w:r>
+    </w:p>
+    <w:p>
+      <w:pPr>
+        <w:spacing w:after="80"/>
+      </w:pPr>
+      <w:r>
+        <w:rPr>
+          <w:rFonts w:ascii="Calibri" w:hAnsi="Calibri" w:eastAsia="Calibri"/>
+          <w:b/>
+          <w:i w:val="0"/>
+          <w:color w:val="333333"/>
+          <w:sz w:val="22"/>
+        </w:rPr>
+        <w:t>No Language — no desk speaker; Arabic with desk → Call Again.</w:t>
+      </w:r>
+    </w:p>
+    <w:p>
+      <w:pPr>
+        <w:spacing w:after="80"/>
+      </w:pPr>
+      <w:r>
+        <w:rPr>
+          <w:rFonts w:ascii="Calibri" w:hAnsi="Calibri" w:eastAsia="Calibri"/>
+          <w:b/>
+          <w:i w:val="0"/>
+          <w:color w:val="333333"/>
+          <w:sz w:val="22"/>
+        </w:rPr>
+        <w:t>Wrong Number — truly invalid number; not invalid-email-only while phone lives.</w:t>
+      </w:r>
+    </w:p>
+    <w:p>
+      <w:pPr>
+        <w:spacing w:after="80"/>
+      </w:pPr>
+      <w:r>
+        <w:rPr>
+          <w:rFonts w:ascii="Calibri" w:hAnsi="Calibri" w:eastAsia="Calibri"/>
+          <w:b/>
+          <w:i w:val="0"/>
+          <w:color w:val="333333"/>
+          <w:sz w:val="22"/>
+        </w:rPr>
+        <w:t>Potential — FTD agreement + KYC only.</w:t>
+      </w:r>
+    </w:p>
+    <w:p>
+      <w:pPr>
+        <w:pStyle w:val="Heading2"/>
+      </w:pPr>
+      <w:r>
+        <w:rPr>
+          <w:rFonts w:ascii="Calibri" w:hAnsi="Calibri" w:eastAsia="Calibri"/>
+          <w:b/>
+          <w:i w:val="0"/>
+          <w:color w:val="2C5282"/>
+          <w:sz w:val="26"/>
+        </w:rPr>
+        <w:t>---- AGENT DIAL NOTES</w:t>
+      </w:r>
+    </w:p>
+    <w:p>
+      <w:pPr>
+        <w:spacing w:after="80"/>
+      </w:pPr>
+      <w:r>
+        <w:rPr>
+          <w:rFonts w:ascii="Calibri" w:hAnsi="Calibri" w:eastAsia="Calibri"/>
+          <w:b w:val="0"/>
+          <w:i/>
+          <w:color w:val="333333"/>
+          <w:sz w:val="22"/>
+        </w:rPr>
+        <w:t>Not customer callbacks: cb:vm · cb na · cb rej · call again rej · CALLED BACK PUHU · when I tried to cb she rejected</w:t>
+      </w:r>
+    </w:p>
+    <w:p>
+      <w:pPr>
+        <w:pStyle w:val="Heading2"/>
+      </w:pPr>
+      <w:r>
+        <w:rPr>
+          <w:rFonts w:ascii="Calibri" w:hAnsi="Calibri" w:eastAsia="Calibri"/>
+          <w:b/>
+          <w:i w:val="0"/>
+          <w:color w:val="2C5282"/>
+          <w:sz w:val="26"/>
+        </w:rPr>
+        <w:t>---- MINI EXAMPLES</w:t>
       </w:r>
     </w:p>
     <w:tbl>
@@ -1947,14 +1949,13 @@
         <w:tblLook w:firstColumn="1" w:firstRow="1" w:lastColumn="0" w:lastRow="0" w:noHBand="0" w:noVBand="1" w:val="04A0"/>
       </w:tblPr>
       <w:tblGrid>
-        <w:gridCol w:w="3324"/>
-        <w:gridCol w:w="3324"/>
-        <w:gridCol w:w="3324"/>
+        <w:gridCol w:w="5100"/>
+        <w:gridCol w:w="5100"/>
       </w:tblGrid>
       <w:tr>
         <w:tc>
           <w:tcPr>
-            <w:tcW w:type="dxa" w:w="3324"/>
+            <w:tcW w:type="dxa" w:w="5100"/>
           </w:tcPr>
           <w:p>
             <w:r>
@@ -1965,13 +1966,13 @@
                 <w:color w:val="1A365D"/>
                 <w:sz w:val="20"/>
               </w:rPr>
-              <w:t>Gördüğün sinyal</w:t>
+              <w:t>Signal</w:t>
             </w:r>
           </w:p>
         </w:tc>
         <w:tc>
           <w:tcPr>
-            <w:tcW w:type="dxa" w:w="3324"/>
+            <w:tcW w:type="dxa" w:w="5100"/>
           </w:tcPr>
           <w:p>
             <w:r>
@@ -1986,20 +1987,39 @@
             </w:r>
           </w:p>
         </w:tc>
+      </w:tr>
+      <w:tr>
         <w:tc>
           <w:tcPr>
-            <w:tcW w:type="dxa" w:w="3324"/>
+            <w:tcW w:type="dxa" w:w="5100"/>
           </w:tcPr>
           <w:p>
             <w:r>
               <w:rPr>
                 <w:rFonts w:ascii="Calibri" w:hAnsi="Calibri" w:eastAsia="Calibri"/>
-                <w:b/>
+                <w:b w:val="0"/>
                 <w:i w:val="0"/>
-                <w:color w:val="1A365D"/>
-                <w:sz w:val="20"/>
+                <w:color w:val="333333"/>
+                <w:sz w:val="18"/>
               </w:rPr>
-              <w:t>Dikkat</w:t>
+              <w:t>pu said to call him later</w:t>
+            </w:r>
+          </w:p>
+        </w:tc>
+        <w:tc>
+          <w:tcPr>
+            <w:tcW w:type="dxa" w:w="5100"/>
+          </w:tcPr>
+          <w:p>
+            <w:r>
+              <w:rPr>
+                <w:rFonts w:ascii="Calibri" w:hAnsi="Calibri" w:eastAsia="Calibri"/>
+                <w:b w:val="0"/>
+                <w:i w:val="0"/>
+                <w:color w:val="333333"/>
+                <w:sz w:val="18"/>
+              </w:rPr>
+              <w:t>Call Again</w:t>
             </w:r>
           </w:p>
         </w:tc>
@@ -2007,7 +2027,7 @@
       <w:tr>
         <w:tc>
           <w:tcPr>
-            <w:tcW w:type="dxa" w:w="3324"/>
+            <w:tcW w:type="dxa" w:w="5100"/>
           </w:tcPr>
           <w:p>
             <w:r>
@@ -2015,15 +2035,16 @@
                 <w:rFonts w:ascii="Calibri" w:hAnsi="Calibri" w:eastAsia="Calibri"/>
                 <w:b w:val="0"/>
                 <w:i w:val="0"/>
+                <w:color w:val="333333"/>
                 <w:sz w:val="18"/>
               </w:rPr>
-              <w:t>call me later / busy call back</w:t>
+              <w:t>no money until salary then will start</w:t>
             </w:r>
           </w:p>
         </w:tc>
         <w:tc>
           <w:tcPr>
-            <w:tcW w:type="dxa" w:w="3324"/>
+            <w:tcW w:type="dxa" w:w="5100"/>
           </w:tcPr>
           <w:p>
             <w:r>
@@ -2031,15 +2052,18 @@
                 <w:rFonts w:ascii="Calibri" w:hAnsi="Calibri" w:eastAsia="Calibri"/>
                 <w:b w:val="0"/>
                 <w:i w:val="0"/>
+                <w:color w:val="333333"/>
                 <w:sz w:val="18"/>
               </w:rPr>
               <w:t>Call Again</w:t>
             </w:r>
           </w:p>
         </w:tc>
+      </w:tr>
+      <w:tr>
         <w:tc>
           <w:tcPr>
-            <w:tcW w:type="dxa" w:w="3324"/>
+            <w:tcW w:type="dxa" w:w="5100"/>
           </w:tcPr>
           <w:p>
             <w:r>
@@ -2047,9 +2071,27 @@
                 <w:rFonts w:ascii="Calibri" w:hAnsi="Calibri" w:eastAsia="Calibri"/>
                 <w:b w:val="0"/>
                 <w:i w:val="0"/>
+                <w:color w:val="333333"/>
                 <w:sz w:val="18"/>
               </w:rPr>
-              <w:t>Agent cb:vm değil</w:t>
+              <w:t>dont need your help / i will do it by myself</w:t>
+            </w:r>
+          </w:p>
+        </w:tc>
+        <w:tc>
+          <w:tcPr>
+            <w:tcW w:type="dxa" w:w="5100"/>
+          </w:tcPr>
+          <w:p>
+            <w:r>
+              <w:rPr>
+                <w:rFonts w:ascii="Calibri" w:hAnsi="Calibri" w:eastAsia="Calibri"/>
+                <w:b w:val="0"/>
+                <w:i w:val="0"/>
+                <w:color w:val="333333"/>
+                <w:sz w:val="18"/>
+              </w:rPr>
+              <w:t>Call Again</w:t>
             </w:r>
           </w:p>
         </w:tc>
@@ -2057,7 +2099,7 @@
       <w:tr>
         <w:tc>
           <w:tcPr>
-            <w:tcW w:type="dxa" w:w="3324"/>
+            <w:tcW w:type="dxa" w:w="5100"/>
           </w:tcPr>
           <w:p>
             <w:r>
@@ -2065,15 +2107,16 @@
                 <w:rFonts w:ascii="Calibri" w:hAnsi="Calibri" w:eastAsia="Calibri"/>
                 <w:b w:val="0"/>
                 <w:i w:val="0"/>
+                <w:color w:val="333333"/>
                 <w:sz w:val="18"/>
               </w:rPr>
-              <w:t>no money + salary soon / arrange</w:t>
+              <w:t>arabic speaker / fluent in arabic</w:t>
             </w:r>
           </w:p>
         </w:tc>
         <w:tc>
           <w:tcPr>
-            <w:tcW w:type="dxa" w:w="3324"/>
+            <w:tcW w:type="dxa" w:w="5100"/>
           </w:tcPr>
           <w:p>
             <w:r>
@@ -2081,15 +2124,18 @@
                 <w:rFonts w:ascii="Calibri" w:hAnsi="Calibri" w:eastAsia="Calibri"/>
                 <w:b w:val="0"/>
                 <w:i w:val="0"/>
+                <w:color w:val="333333"/>
                 <w:sz w:val="18"/>
               </w:rPr>
               <w:t>Call Again</w:t>
             </w:r>
           </w:p>
         </w:tc>
+      </w:tr>
+      <w:tr>
         <w:tc>
           <w:tcPr>
-            <w:tcW w:type="dxa" w:w="3324"/>
+            <w:tcW w:type="dxa" w:w="5100"/>
           </w:tcPr>
           <w:p>
             <w:r>
@@ -2097,9 +2143,27 @@
                 <w:rFonts w:ascii="Calibri" w:hAnsi="Calibri" w:eastAsia="Calibri"/>
                 <w:b w:val="0"/>
                 <w:i w:val="0"/>
+                <w:color w:val="333333"/>
                 <w:sz w:val="18"/>
               </w:rPr>
-              <w:t>Soft money</w:t>
+              <w:t>does not have the money next month</w:t>
+            </w:r>
+          </w:p>
+        </w:tc>
+        <w:tc>
+          <w:tcPr>
+            <w:tcW w:type="dxa" w:w="5100"/>
+          </w:tcPr>
+          <w:p>
+            <w:r>
+              <w:rPr>
+                <w:rFonts w:ascii="Calibri" w:hAnsi="Calibri" w:eastAsia="Calibri"/>
+                <w:b w:val="0"/>
+                <w:i w:val="0"/>
+                <w:color w:val="333333"/>
+                <w:sz w:val="18"/>
+              </w:rPr>
+              <w:t>No Potential</w:t>
             </w:r>
           </w:p>
         </w:tc>
@@ -2107,7 +2171,7 @@
       <w:tr>
         <w:tc>
           <w:tcPr>
-            <w:tcW w:type="dxa" w:w="3324"/>
+            <w:tcW w:type="dxa" w:w="5100"/>
           </w:tcPr>
           <w:p>
             <w:r>
@@ -2115,15 +2179,16 @@
                 <w:rFonts w:ascii="Calibri" w:hAnsi="Calibri" w:eastAsia="Calibri"/>
                 <w:b w:val="0"/>
                 <w:i w:val="0"/>
+                <w:color w:val="333333"/>
                 <w:sz w:val="18"/>
               </w:rPr>
-              <w:t>no money + next month / October</w:t>
+              <w:t>not interested (first day)</w:t>
             </w:r>
           </w:p>
         </w:tc>
         <w:tc>
           <w:tcPr>
-            <w:tcW w:type="dxa" w:w="3324"/>
+            <w:tcW w:type="dxa" w:w="5100"/>
           </w:tcPr>
           <w:p>
             <w:r>
@@ -2131,15 +2196,18 @@
                 <w:rFonts w:ascii="Calibri" w:hAnsi="Calibri" w:eastAsia="Calibri"/>
                 <w:b w:val="0"/>
                 <w:i w:val="0"/>
+                <w:color w:val="333333"/>
                 <w:sz w:val="18"/>
               </w:rPr>
-              <w:t>No Potential</w:t>
+              <w:t>Recall</w:t>
             </w:r>
           </w:p>
         </w:tc>
+      </w:tr>
+      <w:tr>
         <w:tc>
           <w:tcPr>
-            <w:tcW w:type="dxa" w:w="3324"/>
+            <w:tcW w:type="dxa" w:w="5100"/>
           </w:tcPr>
           <w:p>
             <w:r>
@@ -2147,9 +2215,27 @@
                 <w:rFonts w:ascii="Calibri" w:hAnsi="Calibri" w:eastAsia="Calibri"/>
                 <w:b w:val="0"/>
                 <w:i w:val="0"/>
+                <w:color w:val="333333"/>
                 <w:sz w:val="18"/>
               </w:rPr>
-              <w:t>Hard / distant</w:t>
+              <w:t>not interested on two days</w:t>
+            </w:r>
+          </w:p>
+        </w:tc>
+        <w:tc>
+          <w:tcPr>
+            <w:tcW w:type="dxa" w:w="5100"/>
+          </w:tcPr>
+          <w:p>
+            <w:r>
+              <w:rPr>
+                <w:rFonts w:ascii="Calibri" w:hAnsi="Calibri" w:eastAsia="Calibri"/>
+                <w:b w:val="0"/>
+                <w:i w:val="0"/>
+                <w:color w:val="333333"/>
+                <w:sz w:val="18"/>
+              </w:rPr>
+              <w:t>No Interest</w:t>
             </w:r>
           </w:p>
         </w:tc>
@@ -2157,7 +2243,7 @@
       <w:tr>
         <w:tc>
           <w:tcPr>
-            <w:tcW w:type="dxa" w:w="3324"/>
+            <w:tcW w:type="dxa" w:w="5100"/>
           </w:tcPr>
           <w:p>
             <w:r>
@@ -2165,15 +2251,16 @@
                 <w:rFonts w:ascii="Calibri" w:hAnsi="Calibri" w:eastAsia="Calibri"/>
                 <w:b w:val="0"/>
                 <w:i w:val="0"/>
+                <w:color w:val="333333"/>
                 <w:sz w:val="18"/>
               </w:rPr>
-              <w:t>not interested (1. gün)</w:t>
+              <w:t>im not Ahmad speak Arabic</w:t>
             </w:r>
           </w:p>
         </w:tc>
         <w:tc>
           <w:tcPr>
-            <w:tcW w:type="dxa" w:w="3324"/>
+            <w:tcW w:type="dxa" w:w="5100"/>
           </w:tcPr>
           <w:p>
             <w:r>
@@ -2181,15 +2268,18 @@
                 <w:rFonts w:ascii="Calibri" w:hAnsi="Calibri" w:eastAsia="Calibri"/>
                 <w:b w:val="0"/>
                 <w:i w:val="0"/>
+                <w:color w:val="333333"/>
                 <w:sz w:val="18"/>
               </w:rPr>
-              <w:t>Recall</w:t>
+              <w:t>Denied Registration</w:t>
             </w:r>
           </w:p>
         </w:tc>
+      </w:tr>
+      <w:tr>
         <w:tc>
           <w:tcPr>
-            <w:tcW w:type="dxa" w:w="3324"/>
+            <w:tcW w:type="dxa" w:w="5100"/>
           </w:tcPr>
           <w:p>
             <w:r>
@@ -2197,9 +2287,27 @@
                 <w:rFonts w:ascii="Calibri" w:hAnsi="Calibri" w:eastAsia="Calibri"/>
                 <w:b w:val="0"/>
                 <w:i w:val="0"/>
+                <w:color w:val="333333"/>
                 <w:sz w:val="18"/>
               </w:rPr>
-              <w:t>2. gün → No Interest</w:t>
+              <w:t>said i didnt register</w:t>
+            </w:r>
+          </w:p>
+        </w:tc>
+        <w:tc>
+          <w:tcPr>
+            <w:tcW w:type="dxa" w:w="5100"/>
+          </w:tcPr>
+          <w:p>
+            <w:r>
+              <w:rPr>
+                <w:rFonts w:ascii="Calibri" w:hAnsi="Calibri" w:eastAsia="Calibri"/>
+                <w:b w:val="0"/>
+                <w:i w:val="0"/>
+                <w:color w:val="333333"/>
+                <w:sz w:val="18"/>
+              </w:rPr>
+              <w:t>Recall</w:t>
             </w:r>
           </w:p>
         </w:tc>
@@ -2207,7 +2315,7 @@
       <w:tr>
         <w:tc>
           <w:tcPr>
-            <w:tcW w:type="dxa" w:w="3324"/>
+            <w:tcW w:type="dxa" w:w="5100"/>
           </w:tcPr>
           <w:p>
             <w:r>
@@ -2215,15 +2323,16 @@
                 <w:rFonts w:ascii="Calibri" w:hAnsi="Calibri" w:eastAsia="Calibri"/>
                 <w:b w:val="0"/>
                 <w:i w:val="0"/>
+                <w:color w:val="333333"/>
                 <w:sz w:val="18"/>
               </w:rPr>
-              <w:t>curse + istemiyorum</w:t>
+              <w:t>no id / no bank</w:t>
             </w:r>
           </w:p>
         </w:tc>
         <w:tc>
           <w:tcPr>
-            <w:tcW w:type="dxa" w:w="3324"/>
+            <w:tcW w:type="dxa" w:w="5100"/>
           </w:tcPr>
           <w:p>
             <w:r>
@@ -2231,15 +2340,18 @@
                 <w:rFonts w:ascii="Calibri" w:hAnsi="Calibri" w:eastAsia="Calibri"/>
                 <w:b w:val="0"/>
                 <w:i w:val="0"/>
+                <w:color w:val="333333"/>
                 <w:sz w:val="18"/>
               </w:rPr>
-              <w:t>No Interest</w:t>
+              <w:t>No Potential - no documents</w:t>
             </w:r>
           </w:p>
         </w:tc>
+      </w:tr>
+      <w:tr>
         <w:tc>
           <w:tcPr>
-            <w:tcW w:type="dxa" w:w="3324"/>
+            <w:tcW w:type="dxa" w:w="5100"/>
           </w:tcPr>
           <w:p>
             <w:r>
@@ -2247,9 +2359,27 @@
                 <w:rFonts w:ascii="Calibri" w:hAnsi="Calibri" w:eastAsia="Calibri"/>
                 <w:b w:val="0"/>
                 <w:i w:val="0"/>
+                <w:color w:val="333333"/>
                 <w:sz w:val="18"/>
               </w:rPr>
-              <w:t>Doğrudan</w:t>
+              <w:t>mandarin / hard time English (no desk)</w:t>
+            </w:r>
+          </w:p>
+        </w:tc>
+        <w:tc>
+          <w:tcPr>
+            <w:tcW w:type="dxa" w:w="5100"/>
+          </w:tcPr>
+          <w:p>
+            <w:r>
+              <w:rPr>
+                <w:rFonts w:ascii="Calibri" w:hAnsi="Calibri" w:eastAsia="Calibri"/>
+                <w:b w:val="0"/>
+                <w:i w:val="0"/>
+                <w:color w:val="333333"/>
+                <w:sz w:val="18"/>
+              </w:rPr>
+              <w:t>No Language</w:t>
             </w:r>
           </w:p>
         </w:tc>
@@ -2257,7 +2387,7 @@
       <w:tr>
         <w:tc>
           <w:tcPr>
-            <w:tcW w:type="dxa" w:w="3324"/>
+            <w:tcW w:type="dxa" w:w="5100"/>
           </w:tcPr>
           <w:p>
             <w:r>
@@ -2265,15 +2395,16 @@
                 <w:rFonts w:ascii="Calibri" w:hAnsi="Calibri" w:eastAsia="Calibri"/>
                 <w:b w:val="0"/>
                 <w:i w:val="0"/>
+                <w:color w:val="333333"/>
                 <w:sz w:val="18"/>
               </w:rPr>
-              <w:t>im not [name] / wrong person</w:t>
+              <w:t>dvm in arabic not available</w:t>
             </w:r>
           </w:p>
         </w:tc>
         <w:tc>
           <w:tcPr>
-            <w:tcW w:type="dxa" w:w="3324"/>
+            <w:tcW w:type="dxa" w:w="5100"/>
           </w:tcPr>
           <w:p>
             <w:r>
@@ -2281,15 +2412,18 @@
                 <w:rFonts w:ascii="Calibri" w:hAnsi="Calibri" w:eastAsia="Calibri"/>
                 <w:b w:val="0"/>
                 <w:i w:val="0"/>
+                <w:color w:val="333333"/>
                 <w:sz w:val="18"/>
               </w:rPr>
-              <w:t>Denied Registration</w:t>
+              <w:t>No Language</w:t>
             </w:r>
           </w:p>
         </w:tc>
+      </w:tr>
+      <w:tr>
         <w:tc>
           <w:tcPr>
-            <w:tcW w:type="dxa" w:w="3324"/>
+            <w:tcW w:type="dxa" w:w="5100"/>
           </w:tcPr>
           <w:p>
             <w:r>
@@ -2297,9 +2431,27 @@
                 <w:rFonts w:ascii="Calibri" w:hAnsi="Calibri" w:eastAsia="Calibri"/>
                 <w:b w:val="0"/>
                 <w:i w:val="0"/>
+                <w:color w:val="333333"/>
                 <w:sz w:val="18"/>
               </w:rPr>
-              <w:t>Dil olsa bile</w:t>
+              <w:t>Invalid email + ring/dvm newest</w:t>
+            </w:r>
+          </w:p>
+        </w:tc>
+        <w:tc>
+          <w:tcPr>
+            <w:tcW w:type="dxa" w:w="5100"/>
+          </w:tcPr>
+          <w:p>
+            <w:r>
+              <w:rPr>
+                <w:rFonts w:ascii="Calibri" w:hAnsi="Calibri" w:eastAsia="Calibri"/>
+                <w:b w:val="0"/>
+                <w:i w:val="0"/>
+                <w:color w:val="333333"/>
+                <w:sz w:val="18"/>
+              </w:rPr>
+              <w:t>No Answer 1-5</w:t>
             </w:r>
           </w:p>
         </w:tc>
@@ -2307,7 +2459,7 @@
       <w:tr>
         <w:tc>
           <w:tcPr>
-            <w:tcW w:type="dxa" w:w="3324"/>
+            <w:tcW w:type="dxa" w:w="5100"/>
           </w:tcPr>
           <w:p>
             <w:r>
@@ -2315,15 +2467,16 @@
                 <w:rFonts w:ascii="Calibri" w:hAnsi="Calibri" w:eastAsia="Calibri"/>
                 <w:b w:val="0"/>
                 <w:i w:val="0"/>
+                <w:color w:val="333333"/>
                 <w:sz w:val="18"/>
               </w:rPr>
-              <w:t>Mandarin / no English (kimlik yok)</w:t>
+              <w:t>HU with no conversation</w:t>
             </w:r>
           </w:p>
         </w:tc>
         <w:tc>
           <w:tcPr>
-            <w:tcW w:type="dxa" w:w="3324"/>
+            <w:tcW w:type="dxa" w:w="5100"/>
           </w:tcPr>
           <w:p>
             <w:r>
@@ -2331,15 +2484,18 @@
                 <w:rFonts w:ascii="Calibri" w:hAnsi="Calibri" w:eastAsia="Calibri"/>
                 <w:b w:val="0"/>
                 <w:i w:val="0"/>
+                <w:color w:val="333333"/>
                 <w:sz w:val="18"/>
               </w:rPr>
-              <w:t>No Language</w:t>
+              <w:t>No Answer 1-5</w:t>
             </w:r>
           </w:p>
         </w:tc>
+      </w:tr>
+      <w:tr>
         <w:tc>
           <w:tcPr>
-            <w:tcW w:type="dxa" w:w="3324"/>
+            <w:tcW w:type="dxa" w:w="5100"/>
           </w:tcPr>
           <w:p>
             <w:r>
@@ -2347,17 +2503,16 @@
                 <w:rFonts w:ascii="Calibri" w:hAnsi="Calibri" w:eastAsia="Calibri"/>
                 <w:b w:val="0"/>
                 <w:i w:val="0"/>
+                <w:color w:val="333333"/>
                 <w:sz w:val="18"/>
               </w:rPr>
-              <w:t>identity &gt; language</w:t>
+              <w:t>CB REJS only</w:t>
             </w:r>
           </w:p>
         </w:tc>
-      </w:tr>
-      <w:tr>
         <w:tc>
           <w:tcPr>
-            <w:tcW w:type="dxa" w:w="3324"/>
+            <w:tcW w:type="dxa" w:w="5100"/>
           </w:tcPr>
           <w:p>
             <w:r>
@@ -2365,340 +2520,10 @@
                 <w:rFonts w:ascii="Calibri" w:hAnsi="Calibri" w:eastAsia="Calibri"/>
                 <w:b w:val="0"/>
                 <w:i w:val="0"/>
-                <w:sz w:val="18"/>
-              </w:rPr>
-              <w:t>didnt register (kimlik yok)</w:t>
-            </w:r>
-          </w:p>
-        </w:tc>
-        <w:tc>
-          <w:tcPr>
-            <w:tcW w:type="dxa" w:w="3324"/>
-          </w:tcPr>
-          <w:p>
-            <w:r>
-              <w:rPr>
-                <w:rFonts w:ascii="Calibri" w:hAnsi="Calibri" w:eastAsia="Calibri"/>
-                <w:b w:val="0"/>
-                <w:i w:val="0"/>
-                <w:sz w:val="18"/>
-              </w:rPr>
-              <w:t>Recall</w:t>
-            </w:r>
-          </w:p>
-        </w:tc>
-        <w:tc>
-          <w:tcPr>
-            <w:tcW w:type="dxa" w:w="3324"/>
-          </w:tcPr>
-          <w:p>
-            <w:r>
-              <w:rPr>
-                <w:rFonts w:ascii="Calibri" w:hAnsi="Calibri" w:eastAsia="Calibri"/>
-                <w:b w:val="0"/>
-                <w:i w:val="0"/>
-                <w:sz w:val="18"/>
-              </w:rPr>
-              <w:t>Denied değil</w:t>
-            </w:r>
-          </w:p>
-        </w:tc>
-      </w:tr>
-      <w:tr>
-        <w:tc>
-          <w:tcPr>
-            <w:tcW w:type="dxa" w:w="3324"/>
-          </w:tcPr>
-          <w:p>
-            <w:r>
-              <w:rPr>
-                <w:rFonts w:ascii="Calibri" w:hAnsi="Calibri" w:eastAsia="Calibri"/>
-                <w:b w:val="0"/>
-                <w:i w:val="0"/>
-                <w:sz w:val="18"/>
-              </w:rPr>
-              <w:t>no id / no bank / no POR</w:t>
-            </w:r>
-          </w:p>
-        </w:tc>
-        <w:tc>
-          <w:tcPr>
-            <w:tcW w:type="dxa" w:w="3324"/>
-          </w:tcPr>
-          <w:p>
-            <w:r>
-              <w:rPr>
-                <w:rFonts w:ascii="Calibri" w:hAnsi="Calibri" w:eastAsia="Calibri"/>
-                <w:b w:val="0"/>
-                <w:i w:val="0"/>
-                <w:sz w:val="18"/>
-              </w:rPr>
-              <w:t>No Potential - no documents</w:t>
-            </w:r>
-          </w:p>
-        </w:tc>
-        <w:tc>
-          <w:tcPr>
-            <w:tcW w:type="dxa" w:w="3324"/>
-          </w:tcPr>
-          <w:p>
-            <w:r>
-              <w:rPr>
-                <w:rFonts w:ascii="Calibri" w:hAnsi="Calibri" w:eastAsia="Calibri"/>
-                <w:b w:val="0"/>
-                <w:i w:val="0"/>
-                <w:sz w:val="18"/>
-              </w:rPr>
-            </w:r>
-          </w:p>
-        </w:tc>
-      </w:tr>
-      <w:tr>
-        <w:tc>
-          <w:tcPr>
-            <w:tcW w:type="dxa" w:w="3324"/>
-          </w:tcPr>
-          <w:p>
-            <w:r>
-              <w:rPr>
-                <w:rFonts w:ascii="Calibri" w:hAnsi="Calibri" w:eastAsia="Calibri"/>
-                <w:b w:val="0"/>
-                <w:i w:val="0"/>
-                <w:sz w:val="18"/>
-              </w:rPr>
-              <w:t>na / vm / dvm / ring</w:t>
-            </w:r>
-          </w:p>
-        </w:tc>
-        <w:tc>
-          <w:tcPr>
-            <w:tcW w:type="dxa" w:w="3324"/>
-          </w:tcPr>
-          <w:p>
-            <w:r>
-              <w:rPr>
-                <w:rFonts w:ascii="Calibri" w:hAnsi="Calibri" w:eastAsia="Calibri"/>
-                <w:b w:val="0"/>
-                <w:i w:val="0"/>
+                <w:color w:val="333333"/>
                 <w:sz w:val="18"/>
               </w:rPr>
               <w:t>No Answer 1-5</w:t>
-            </w:r>
-          </w:p>
-        </w:tc>
-        <w:tc>
-          <w:tcPr>
-            <w:tcW w:type="dxa" w:w="3324"/>
-          </w:tcPr>
-          <w:p>
-            <w:r>
-              <w:rPr>
-                <w:rFonts w:ascii="Calibri" w:hAnsi="Calibri" w:eastAsia="Calibri"/>
-                <w:b w:val="0"/>
-                <w:i w:val="0"/>
-                <w:sz w:val="18"/>
-              </w:rPr>
-              <w:t>5+ gün → 5 UP</w:t>
-            </w:r>
-          </w:p>
-        </w:tc>
-      </w:tr>
-      <w:tr>
-        <w:tc>
-          <w:tcPr>
-            <w:tcW w:type="dxa" w:w="3324"/>
-          </w:tcPr>
-          <w:p>
-            <w:r>
-              <w:rPr>
-                <w:rFonts w:ascii="Calibri" w:hAnsi="Calibri" w:eastAsia="Calibri"/>
-                <w:b w:val="0"/>
-                <w:i w:val="0"/>
-                <w:sz w:val="18"/>
-              </w:rPr>
-              <w:t>invalid email + ring/NA</w:t>
-            </w:r>
-          </w:p>
-        </w:tc>
-        <w:tc>
-          <w:tcPr>
-            <w:tcW w:type="dxa" w:w="3324"/>
-          </w:tcPr>
-          <w:p>
-            <w:r>
-              <w:rPr>
-                <w:rFonts w:ascii="Calibri" w:hAnsi="Calibri" w:eastAsia="Calibri"/>
-                <w:b w:val="0"/>
-                <w:i w:val="0"/>
-                <w:sz w:val="18"/>
-              </w:rPr>
-              <w:t>No Answer 1-5</w:t>
-            </w:r>
-          </w:p>
-        </w:tc>
-        <w:tc>
-          <w:tcPr>
-            <w:tcW w:type="dxa" w:w="3324"/>
-          </w:tcPr>
-          <w:p>
-            <w:r>
-              <w:rPr>
-                <w:rFonts w:ascii="Calibri" w:hAnsi="Calibri" w:eastAsia="Calibri"/>
-                <w:b w:val="0"/>
-                <w:i w:val="0"/>
-                <w:sz w:val="18"/>
-              </w:rPr>
-              <w:t>Wrong Number değil</w:t>
-            </w:r>
-          </w:p>
-        </w:tc>
-      </w:tr>
-      <w:tr>
-        <w:tc>
-          <w:tcPr>
-            <w:tcW w:type="dxa" w:w="3324"/>
-          </w:tcPr>
-          <w:p>
-            <w:r>
-              <w:rPr>
-                <w:rFonts w:ascii="Calibri" w:hAnsi="Calibri" w:eastAsia="Calibri"/>
-                <w:b w:val="0"/>
-                <w:i w:val="0"/>
-                <w:sz w:val="18"/>
-              </w:rPr>
-              <w:t>i will do it by myself</w:t>
-            </w:r>
-          </w:p>
-        </w:tc>
-        <w:tc>
-          <w:tcPr>
-            <w:tcW w:type="dxa" w:w="3324"/>
-          </w:tcPr>
-          <w:p>
-            <w:r>
-              <w:rPr>
-                <w:rFonts w:ascii="Calibri" w:hAnsi="Calibri" w:eastAsia="Calibri"/>
-                <w:b w:val="0"/>
-                <w:i w:val="0"/>
-                <w:sz w:val="18"/>
-              </w:rPr>
-              <w:t>Recall</w:t>
-            </w:r>
-          </w:p>
-        </w:tc>
-        <w:tc>
-          <w:tcPr>
-            <w:tcW w:type="dxa" w:w="3324"/>
-          </w:tcPr>
-          <w:p>
-            <w:r>
-              <w:rPr>
-                <w:rFonts w:ascii="Calibri" w:hAnsi="Calibri" w:eastAsia="Calibri"/>
-                <w:b w:val="0"/>
-                <w:i w:val="0"/>
-                <w:sz w:val="18"/>
-              </w:rPr>
-              <w:t>Call Again değil</w:t>
-            </w:r>
-          </w:p>
-        </w:tc>
-      </w:tr>
-      <w:tr>
-        <w:tc>
-          <w:tcPr>
-            <w:tcW w:type="dxa" w:w="3324"/>
-          </w:tcPr>
-          <w:p>
-            <w:r>
-              <w:rPr>
-                <w:rFonts w:ascii="Calibri" w:hAnsi="Calibri" w:eastAsia="Calibri"/>
-                <w:b w:val="0"/>
-                <w:i w:val="0"/>
-                <w:sz w:val="18"/>
-              </w:rPr>
-              <w:t>CB REJS</w:t>
-            </w:r>
-          </w:p>
-        </w:tc>
-        <w:tc>
-          <w:tcPr>
-            <w:tcW w:type="dxa" w:w="3324"/>
-          </w:tcPr>
-          <w:p>
-            <w:r>
-              <w:rPr>
-                <w:rFonts w:ascii="Calibri" w:hAnsi="Calibri" w:eastAsia="Calibri"/>
-                <w:b w:val="0"/>
-                <w:i w:val="0"/>
-                <w:sz w:val="18"/>
-              </w:rPr>
-              <w:t>No Answer (genelde)</w:t>
-            </w:r>
-          </w:p>
-        </w:tc>
-        <w:tc>
-          <w:tcPr>
-            <w:tcW w:type="dxa" w:w="3324"/>
-          </w:tcPr>
-          <w:p>
-            <w:r>
-              <w:rPr>
-                <w:rFonts w:ascii="Calibri" w:hAnsi="Calibri" w:eastAsia="Calibri"/>
-                <w:b w:val="0"/>
-                <w:i w:val="0"/>
-                <w:sz w:val="18"/>
-              </w:rPr>
-              <w:t>Callback değil</w:t>
-            </w:r>
-          </w:p>
-        </w:tc>
-      </w:tr>
-      <w:tr>
-        <w:tc>
-          <w:tcPr>
-            <w:tcW w:type="dxa" w:w="3324"/>
-          </w:tcPr>
-          <w:p>
-            <w:r>
-              <w:rPr>
-                <w:rFonts w:ascii="Calibri" w:hAnsi="Calibri" w:eastAsia="Calibri"/>
-                <w:b w:val="0"/>
-                <w:i w:val="0"/>
-                <w:sz w:val="18"/>
-              </w:rPr>
-              <w:t>karışık / emin değilim</w:t>
-            </w:r>
-          </w:p>
-        </w:tc>
-        <w:tc>
-          <w:tcPr>
-            <w:tcW w:type="dxa" w:w="3324"/>
-          </w:tcPr>
-          <w:p>
-            <w:r>
-              <w:rPr>
-                <w:rFonts w:ascii="Calibri" w:hAnsi="Calibri" w:eastAsia="Calibri"/>
-                <w:b w:val="0"/>
-                <w:i w:val="0"/>
-                <w:sz w:val="18"/>
-              </w:rPr>
-              <w:t>Manual Check</w:t>
-            </w:r>
-          </w:p>
-        </w:tc>
-        <w:tc>
-          <w:tcPr>
-            <w:tcW w:type="dxa" w:w="3324"/>
-          </w:tcPr>
-          <w:p>
-            <w:r>
-              <w:rPr>
-                <w:rFonts w:ascii="Calibri" w:hAnsi="Calibri" w:eastAsia="Calibri"/>
-                <w:b w:val="0"/>
-                <w:i w:val="0"/>
-                <w:sz w:val="18"/>
-              </w:rPr>
-              <w:t>Uydurma</w:t>
             </w:r>
           </w:p>
         </w:tc>
@@ -2707,694 +2532,37 @@
     <w:p/>
     <w:p>
       <w:pPr>
-        <w:pStyle w:val="Heading1"/>
-      </w:pPr>
-      <w:r>
-        <w:rPr>
-          <w:rFonts w:ascii="Calibri" w:hAnsi="Calibri" w:eastAsia="Calibri"/>
-          <w:b/>
-          <w:i w:val="0"/>
-          <w:color w:val="1A365D"/>
-          <w:sz w:val="36"/>
-        </w:rPr>
-        <w:t>7. Mini senaryolar (alıştırma)</w:t>
-      </w:r>
-    </w:p>
-    <w:p>
-      <w:pPr>
-        <w:spacing w:after="120"/>
-      </w:pPr>
-      <w:r>
-        <w:rPr>
-          <w:rFonts w:ascii="Calibri" w:hAnsi="Calibri" w:eastAsia="Calibri"/>
-          <w:b/>
-          <w:i w:val="0"/>
-          <w:color w:val="1A365D"/>
-          <w:sz w:val="22"/>
-        </w:rPr>
-        <w:t>Senaryo A</w:t>
-      </w:r>
-    </w:p>
-    <w:p>
-      <w:pPr>
-        <w:spacing w:after="120"/>
+        <w:spacing w:after="80"/>
       </w:pPr>
       <w:r>
         <w:rPr>
           <w:rFonts w:ascii="Calibri" w:hAnsi="Calibri" w:eastAsia="Calibri"/>
           <w:b w:val="0"/>
           <w:i/>
-          <w:color w:val="444444"/>
-          <w:sz w:val="22"/>
+          <w:color w:val="333333"/>
+          <w:sz w:val="18"/>
         </w:rPr>
-        <w:t>Yorum: “pu said to call him later hu”</w:t>
+        <w:t>Statuses not auto-used: Chargeback, Compliant, Deposited with me, Fraud, Payment Fraud, PCA, Reassign, No Answer 10 UP, FTD – No Answer</w:t>
       </w:r>
     </w:p>
     <w:p>
       <w:pPr>
-        <w:spacing w:after="120"/>
-      </w:pPr>
-      <w:r>
-        <w:rPr>
-          <w:rFonts w:ascii="Calibri" w:hAnsi="Calibri" w:eastAsia="Calibri"/>
-          <w:b w:val="0"/>
-          <w:i w:val="0"/>
-          <w:color w:val="444444"/>
-          <w:sz w:val="22"/>
-        </w:rPr>
-        <w:t>Cevap: Call Again — Müşteri net CB istedi.</w:t>
-      </w:r>
-    </w:p>
-    <w:p>
-      <w:pPr>
-        <w:spacing w:after="120"/>
-      </w:pPr>
-      <w:r>
-        <w:rPr>
-          <w:rFonts w:ascii="Calibri" w:hAnsi="Calibri" w:eastAsia="Calibri"/>
-          <w:b/>
-          <w:i w:val="0"/>
-          <w:color w:val="1A365D"/>
-          <w:sz w:val="22"/>
-        </w:rPr>
-        <w:t>Senaryo B</w:t>
-      </w:r>
-    </w:p>
-    <w:p>
-      <w:pPr>
-        <w:spacing w:after="120"/>
+        <w:spacing w:after="80"/>
       </w:pPr>
       <w:r>
         <w:rPr>
           <w:rFonts w:ascii="Calibri" w:hAnsi="Calibri" w:eastAsia="Calibri"/>
           <w:b w:val="0"/>
           <w:i/>
-          <w:color w:val="444444"/>
-          <w:sz w:val="22"/>
-        </w:rPr>
-        <w:t>Yorum: “does not have the money next month not sure”</w:t>
-      </w:r>
-    </w:p>
-    <w:p>
-      <w:pPr>
-        <w:spacing w:after="120"/>
-      </w:pPr>
-      <w:r>
-        <w:rPr>
-          <w:rFonts w:ascii="Calibri" w:hAnsi="Calibri" w:eastAsia="Calibri"/>
-          <w:b w:val="0"/>
-          <w:i w:val="0"/>
-          <w:color w:val="444444"/>
-          <w:sz w:val="22"/>
-        </w:rPr>
-        <w:t>Cevap: No Potential — Uzak + belirsiz para.</w:t>
-      </w:r>
-    </w:p>
-    <w:p>
-      <w:pPr>
-        <w:spacing w:after="120"/>
-      </w:pPr>
-      <w:r>
-        <w:rPr>
-          <w:rFonts w:ascii="Calibri" w:hAnsi="Calibri" w:eastAsia="Calibri"/>
-          <w:b/>
-          <w:i w:val="0"/>
-          <w:color w:val="1A365D"/>
-          <w:sz w:val="22"/>
-        </w:rPr>
-        <w:t>Senaryo C</w:t>
-      </w:r>
-    </w:p>
-    <w:p>
-      <w:pPr>
-        <w:spacing w:after="120"/>
-      </w:pPr>
-      <w:r>
-        <w:rPr>
-          <w:rFonts w:ascii="Calibri" w:hAnsi="Calibri" w:eastAsia="Calibri"/>
-          <w:b w:val="0"/>
-          <w:i/>
-          <w:color w:val="444444"/>
-          <w:sz w:val="22"/>
-        </w:rPr>
-        <w:t>Yorum: “no money until salary in a few days then will start”</w:t>
-      </w:r>
-    </w:p>
-    <w:p>
-      <w:pPr>
-        <w:spacing w:after="120"/>
-      </w:pPr>
-      <w:r>
-        <w:rPr>
-          <w:rFonts w:ascii="Calibri" w:hAnsi="Calibri" w:eastAsia="Calibri"/>
-          <w:b w:val="0"/>
-          <w:i w:val="0"/>
-          <w:color w:val="444444"/>
-          <w:sz w:val="22"/>
-        </w:rPr>
-        <w:t>Cevap: Call Again — Soft money + maaş planı.</w:t>
-      </w:r>
-    </w:p>
-    <w:p>
-      <w:pPr>
-        <w:spacing w:after="120"/>
-      </w:pPr>
-      <w:r>
-        <w:rPr>
-          <w:rFonts w:ascii="Calibri" w:hAnsi="Calibri" w:eastAsia="Calibri"/>
-          <w:b/>
-          <w:i w:val="0"/>
-          <w:color w:val="1A365D"/>
-          <w:sz w:val="22"/>
-        </w:rPr>
-        <w:t>Senaryo D</w:t>
-      </w:r>
-    </w:p>
-    <w:p>
-      <w:pPr>
-        <w:spacing w:after="120"/>
-      </w:pPr>
-      <w:r>
-        <w:rPr>
-          <w:rFonts w:ascii="Calibri" w:hAnsi="Calibri" w:eastAsia="Calibri"/>
-          <w:b w:val="0"/>
-          <w:i/>
-          <w:color w:val="444444"/>
-          <w:sz w:val="22"/>
-        </w:rPr>
-        <w:t>Yorum: “not interested (bugün ilk kez)”</w:t>
-      </w:r>
-    </w:p>
-    <w:p>
-      <w:pPr>
-        <w:spacing w:after="120"/>
-      </w:pPr>
-      <w:r>
-        <w:rPr>
-          <w:rFonts w:ascii="Calibri" w:hAnsi="Calibri" w:eastAsia="Calibri"/>
-          <w:b w:val="0"/>
-          <w:i w:val="0"/>
-          <w:color w:val="444444"/>
-          <w:sz w:val="22"/>
-        </w:rPr>
-        <w:t>Cevap: Recall — Tek gün red.</w:t>
-      </w:r>
-    </w:p>
-    <w:p>
-      <w:pPr>
-        <w:spacing w:after="120"/>
-      </w:pPr>
-      <w:r>
-        <w:rPr>
-          <w:rFonts w:ascii="Calibri" w:hAnsi="Calibri" w:eastAsia="Calibri"/>
-          <w:b/>
-          <w:i w:val="0"/>
-          <w:color w:val="1A365D"/>
-          <w:sz w:val="22"/>
-        </w:rPr>
-        <w:t>Senaryo E</w:t>
-      </w:r>
-    </w:p>
-    <w:p>
-      <w:pPr>
-        <w:spacing w:after="120"/>
-      </w:pPr>
-      <w:r>
-        <w:rPr>
-          <w:rFonts w:ascii="Calibri" w:hAnsi="Calibri" w:eastAsia="Calibri"/>
-          <w:b w:val="0"/>
-          <w:i/>
-          <w:color w:val="444444"/>
-          <w:sz w:val="22"/>
-        </w:rPr>
-        <w:t>Yorum: “im not Ahmad please speak Arabic”</w:t>
-      </w:r>
-    </w:p>
-    <w:p>
-      <w:pPr>
-        <w:spacing w:after="120"/>
-      </w:pPr>
-      <w:r>
-        <w:rPr>
-          <w:rFonts w:ascii="Calibri" w:hAnsi="Calibri" w:eastAsia="Calibri"/>
-          <w:b w:val="0"/>
-          <w:i w:val="0"/>
-          <w:color w:val="444444"/>
-          <w:sz w:val="22"/>
-        </w:rPr>
-        <w:t>Cevap: Denied Registration — Kimlik &gt; dil.</w:t>
-      </w:r>
-    </w:p>
-    <w:p>
-      <w:pPr>
-        <w:spacing w:after="120"/>
-      </w:pPr>
-      <w:r>
-        <w:rPr>
-          <w:rFonts w:ascii="Calibri" w:hAnsi="Calibri" w:eastAsia="Calibri"/>
-          <w:b/>
-          <w:i w:val="0"/>
-          <w:color w:val="1A365D"/>
-          <w:sz w:val="22"/>
-        </w:rPr>
-        <w:t>Senaryo F</w:t>
-      </w:r>
-    </w:p>
-    <w:p>
-      <w:pPr>
-        <w:spacing w:after="120"/>
-      </w:pPr>
-      <w:r>
-        <w:rPr>
-          <w:rFonts w:ascii="Calibri" w:hAnsi="Calibri" w:eastAsia="Calibri"/>
-          <w:b w:val="0"/>
-          <w:i/>
-          <w:color w:val="444444"/>
-          <w:sz w:val="22"/>
-        </w:rPr>
-        <w:t>Yorum: “said i didnt register”</w:t>
-      </w:r>
-    </w:p>
-    <w:p>
-      <w:pPr>
-        <w:spacing w:after="120"/>
-      </w:pPr>
-      <w:r>
-        <w:rPr>
-          <w:rFonts w:ascii="Calibri" w:hAnsi="Calibri" w:eastAsia="Calibri"/>
-          <w:b w:val="0"/>
-          <w:i w:val="0"/>
-          <w:color w:val="444444"/>
-          <w:sz w:val="22"/>
-        </w:rPr>
-        <w:t>Cevap: Recall — Kimlik inkârı yok.</w:t>
-      </w:r>
-    </w:p>
-    <w:p>
-      <w:pPr>
-        <w:spacing w:after="120"/>
-      </w:pPr>
-      <w:r>
-        <w:rPr>
-          <w:rFonts w:ascii="Calibri" w:hAnsi="Calibri" w:eastAsia="Calibri"/>
-          <w:b/>
-          <w:i w:val="0"/>
-          <w:color w:val="1A365D"/>
-          <w:sz w:val="22"/>
-        </w:rPr>
-        <w:t>Senaryo G</w:t>
-      </w:r>
-    </w:p>
-    <w:p>
-      <w:pPr>
-        <w:spacing w:after="120"/>
-      </w:pPr>
-      <w:r>
-        <w:rPr>
-          <w:rFonts w:ascii="Calibri" w:hAnsi="Calibri" w:eastAsia="Calibri"/>
-          <w:b w:val="0"/>
-          <w:i/>
-          <w:color w:val="444444"/>
-          <w:sz w:val="22"/>
-        </w:rPr>
-        <w:t>Yorum: “Invalid email - CRM  …  (yeni) ring, dvm”</w:t>
-      </w:r>
-    </w:p>
-    <w:p>
-      <w:pPr>
-        <w:spacing w:after="120"/>
-      </w:pPr>
-      <w:r>
-        <w:rPr>
-          <w:rFonts w:ascii="Calibri" w:hAnsi="Calibri" w:eastAsia="Calibri"/>
-          <w:b w:val="0"/>
-          <w:i w:val="0"/>
-          <w:color w:val="444444"/>
-          <w:sz w:val="22"/>
-        </w:rPr>
-        <w:t>Cevap: No Answer 1-5 — Telefon canlı.</w:t>
-      </w:r>
-    </w:p>
-    <w:p>
-      <w:pPr>
-        <w:spacing w:after="120"/>
-      </w:pPr>
-      <w:r>
-        <w:rPr>
-          <w:rFonts w:ascii="Calibri" w:hAnsi="Calibri" w:eastAsia="Calibri"/>
-          <w:b/>
-          <w:i w:val="0"/>
-          <w:color w:val="1A365D"/>
-          <w:sz w:val="22"/>
-        </w:rPr>
-        <w:t>Senaryo H</w:t>
-      </w:r>
-    </w:p>
-    <w:p>
-      <w:pPr>
-        <w:spacing w:after="120"/>
-      </w:pPr>
-      <w:r>
-        <w:rPr>
-          <w:rFonts w:ascii="Calibri" w:hAnsi="Calibri" w:eastAsia="Calibri"/>
-          <w:b w:val="0"/>
-          <w:i/>
-          <w:color w:val="444444"/>
-          <w:sz w:val="22"/>
-        </w:rPr>
-        <w:t>Yorum: “i will do it by myself”</w:t>
-      </w:r>
-    </w:p>
-    <w:p>
-      <w:pPr>
-        <w:spacing w:after="120"/>
-      </w:pPr>
-      <w:r>
-        <w:rPr>
-          <w:rFonts w:ascii="Calibri" w:hAnsi="Calibri" w:eastAsia="Calibri"/>
-          <w:sz w:val="22"/>
-        </w:rPr>
-        <w:t>Cevap: Call Again — kendi yatırmak istiyor, yardım/aranmak istemiyor.</w:t>
-      </w:r>
-    </w:p>
-    <w:p>
-      <w:pPr>
-        <w:spacing w:after="120"/>
-      </w:pPr>
-      <w:r>
-        <w:rPr>
-          <w:rFonts w:ascii="Calibri" w:hAnsi="Calibri" w:eastAsia="Calibri"/>
-          <w:b/>
-          <w:i w:val="0"/>
-          <w:color w:val="1A365D"/>
-          <w:sz w:val="22"/>
-        </w:rPr>
-        <w:t>Senaryo I</w:t>
-      </w:r>
-    </w:p>
-    <w:p>
-      <w:pPr>
-        <w:spacing w:after="120"/>
-      </w:pPr>
-      <w:r>
-        <w:rPr>
-          <w:rFonts w:ascii="Calibri" w:hAnsi="Calibri" w:eastAsia="Calibri"/>
-          <w:b w:val="0"/>
-          <w:i/>
-          <w:color w:val="444444"/>
-          <w:sz w:val="22"/>
-        </w:rPr>
-        <w:t>Yorum: “cb : vm   +   never reg and hung up”</w:t>
-      </w:r>
-    </w:p>
-    <w:p>
-      <w:pPr>
-        <w:spacing w:after="120"/>
-      </w:pPr>
-      <w:r>
-        <w:rPr>
-          <w:rFonts w:ascii="Calibri" w:hAnsi="Calibri" w:eastAsia="Calibri"/>
-          <w:b w:val="0"/>
-          <w:i w:val="0"/>
-          <w:color w:val="444444"/>
-          <w:sz w:val="22"/>
-        </w:rPr>
-        <w:t>Cevap: Recall — Agent cb yok sayılır.</w:t>
-      </w:r>
-    </w:p>
-    <w:p>
-      <w:pPr>
-        <w:spacing w:after="120"/>
-      </w:pPr>
-      <w:r>
-        <w:rPr>
-          <w:rFonts w:ascii="Calibri" w:hAnsi="Calibri" w:eastAsia="Calibri"/>
-          <w:b/>
-          <w:i w:val="0"/>
-          <w:color w:val="1A365D"/>
-          <w:sz w:val="22"/>
-        </w:rPr>
-        <w:t>Senaryo J</w:t>
-      </w:r>
-    </w:p>
-    <w:p>
-      <w:pPr>
-        <w:spacing w:after="120"/>
-      </w:pPr>
-      <w:r>
-        <w:rPr>
-          <w:rFonts w:ascii="Calibri" w:hAnsi="Calibri" w:eastAsia="Calibri"/>
-          <w:b w:val="0"/>
-          <w:i/>
-          <w:color w:val="444444"/>
-          <w:sz w:val="22"/>
-        </w:rPr>
-        <w:t>Yorum: “cant afford now but will get help and deposit”</w:t>
-      </w:r>
-    </w:p>
-    <w:p>
-      <w:pPr>
-        <w:spacing w:after="120"/>
-      </w:pPr>
-      <w:r>
-        <w:rPr>
-          <w:rFonts w:ascii="Calibri" w:hAnsi="Calibri" w:eastAsia="Calibri"/>
-          <w:b w:val="0"/>
-          <w:i w:val="0"/>
-          <w:color w:val="444444"/>
-          <w:sz w:val="22"/>
-        </w:rPr>
-        <w:t>Cevap: Call Again — Yakın yardım planı.</w:t>
-      </w:r>
-    </w:p>
-    <w:p>
-      <w:pPr>
-        <w:pStyle w:val="Heading1"/>
-      </w:pPr>
-      <w:r>
-        <w:rPr>
-          <w:rFonts w:ascii="Calibri" w:hAnsi="Calibri" w:eastAsia="Calibri"/>
-          <w:b/>
-          <w:i w:val="0"/>
-          <w:color w:val="1A365D"/>
-          <w:sz w:val="36"/>
-        </w:rPr>
-        <w:t>8. Sık yapılan hatalar</w:t>
-      </w:r>
-    </w:p>
-    <w:p>
-      <w:pPr>
-        <w:pStyle w:val="ListBullet"/>
-        <w:spacing w:after="40"/>
-      </w:pPr>
-      <w:r>
-        <w:rPr>
-          <w:rFonts w:ascii="Calibri" w:hAnsi="Calibri" w:eastAsia="Calibri"/>
-          <w:b w:val="0"/>
-          <w:i w:val="0"/>
-          <w:sz w:val="22"/>
-        </w:rPr>
-        <w:t>✗ next month’u Call Again yapmak</w:t>
-      </w:r>
-    </w:p>
-    <w:p>
-      <w:pPr>
-        <w:pStyle w:val="ListBullet"/>
-        <w:spacing w:after="40"/>
-      </w:pPr>
-      <w:r>
-        <w:rPr>
-          <w:rFonts w:ascii="Calibri" w:hAnsi="Calibri" w:eastAsia="Calibri"/>
-          <w:b w:val="0"/>
-          <w:i w:val="0"/>
-          <w:sz w:val="22"/>
-        </w:rPr>
-        <w:t>✗ Agent cb:vm görünce Call Again yapmak</w:t>
-      </w:r>
-    </w:p>
-    <w:p>
-      <w:pPr>
-        <w:pStyle w:val="ListBullet"/>
-        <w:spacing w:after="40"/>
-      </w:pPr>
-      <w:r>
-        <w:rPr>
-          <w:rFonts w:ascii="Calibri" w:hAnsi="Calibri" w:eastAsia="Calibri"/>
-          <w:b w:val="0"/>
-          <w:i w:val="0"/>
-          <w:sz w:val="22"/>
-        </w:rPr>
-        <w:t>✗ Tek “not interested” ile No Interest basmak</w:t>
-      </w:r>
-    </w:p>
-    <w:p>
-      <w:pPr>
-        <w:pStyle w:val="ListBullet"/>
-        <w:spacing w:after="40"/>
-      </w:pPr>
-      <w:r>
-        <w:rPr>
-          <w:rFonts w:ascii="Calibri" w:hAnsi="Calibri" w:eastAsia="Calibri"/>
-          <w:b w:val="0"/>
-          <w:i w:val="0"/>
-          <w:sz w:val="22"/>
-        </w:rPr>
-        <w:t>✗ didnt register = Denied Registration sanmak</w:t>
-      </w:r>
-    </w:p>
-    <w:p>
-      <w:pPr>
-        <w:pStyle w:val="ListBullet"/>
-        <w:spacing w:after="40"/>
-      </w:pPr>
-      <w:r>
-        <w:rPr>
-          <w:rFonts w:ascii="Calibri" w:hAnsi="Calibri" w:eastAsia="Calibri"/>
-          <w:b w:val="0"/>
-          <w:i w:val="0"/>
-          <w:sz w:val="22"/>
-        </w:rPr>
-        <w:t>✗ Invalid email = Wrong Number (telefon ring iken)</w:t>
-      </w:r>
-    </w:p>
-    <w:p>
-      <w:pPr>
-        <w:pStyle w:val="ListBullet"/>
-        <w:spacing w:after="40"/>
-      </w:pPr>
-      <w:r>
-        <w:rPr>
-          <w:rFonts w:ascii="Calibri" w:hAnsi="Calibri" w:eastAsia="Calibri"/>
-          <w:b w:val="0"/>
-          <w:i w:val="0"/>
-          <w:sz w:val="22"/>
-        </w:rPr>
-        <w:t>✗ Aile çeviri/kart yardımını third_party / Wrong saymak</w:t>
-      </w:r>
-    </w:p>
-    <w:p>
-      <w:pPr>
-        <w:pStyle w:val="ListBullet"/>
-        <w:spacing w:after="40"/>
-      </w:pPr>
-      <w:r>
-        <w:rPr>
-          <w:rFonts w:ascii="Calibri" w:hAnsi="Calibri" w:eastAsia="Calibri"/>
-          <w:b w:val="0"/>
-          <w:i w:val="0"/>
-          <w:sz w:val="22"/>
-        </w:rPr>
-        <w:t>✗ Soft money + maaş planını No Potential yapmak</w:t>
-      </w:r>
-    </w:p>
-    <w:p>
-      <w:pPr>
-        <w:pStyle w:val="ListBullet"/>
-        <w:spacing w:after="40"/>
-      </w:pPr>
-      <w:r>
-        <w:rPr>
-          <w:rFonts w:ascii="Calibri" w:hAnsi="Calibri" w:eastAsia="Calibri"/>
-          <w:b w:val="0"/>
-          <w:i w:val="0"/>
-          <w:sz w:val="22"/>
-        </w:rPr>
-        <w:t>✗ Emin değilken rastgele status uydurmak (Manual Check kullan)</w:t>
-      </w:r>
-    </w:p>
-    <w:p>
-      <w:pPr>
-        <w:pStyle w:val="Heading1"/>
-      </w:pPr>
-      <w:r>
-        <w:rPr>
-          <w:rFonts w:ascii="Calibri" w:hAnsi="Calibri" w:eastAsia="Calibri"/>
-          <w:b/>
-          <w:i w:val="0"/>
-          <w:color w:val="1A365D"/>
-          <w:sz w:val="36"/>
-        </w:rPr>
-        <w:t>9. Kısa sistem notu (bilmen yeterli)</w:t>
-      </w:r>
-    </w:p>
-    <w:p>
-      <w:pPr>
-        <w:spacing w:after="120"/>
-      </w:pPr>
-      <w:r>
-        <w:rPr>
-          <w:rFonts w:ascii="Calibri" w:hAnsi="Calibri" w:eastAsia="Calibri"/>
-          <w:b w:val="0"/>
-          <w:i w:val="0"/>
-          <w:color w:val="444444"/>
-          <w:sz w:val="22"/>
-        </w:rPr>
-        <w:t>Telegram’a Excel atınca sistem öneri status üretir; sen Excel’i kontrol edip CRM’e elle girersin. Sistem CRM’e yazmaz.</w:t>
-      </w:r>
-    </w:p>
-    <w:p>
-      <w:pPr>
-        <w:pStyle w:val="ListBullet"/>
-        <w:spacing w:after="40"/>
-      </w:pPr>
-      <w:r>
-        <w:rPr>
-          <w:rFonts w:ascii="Calibri" w:hAnsi="Calibri" w:eastAsia="Calibri"/>
-          <w:b w:val="0"/>
-          <w:i w:val="0"/>
-          <w:sz w:val="22"/>
-        </w:rPr>
-        <w:t>Öneri çoğunlukla Memory Match kurallarından gelir (Sheet + politika).</w:t>
-      </w:r>
-    </w:p>
-    <w:p>
-      <w:pPr>
-        <w:pStyle w:val="ListBullet"/>
-        <w:spacing w:after="40"/>
-      </w:pPr>
-      <w:r>
-        <w:rPr>
-          <w:rFonts w:ascii="Calibri" w:hAnsi="Calibri" w:eastAsia="Calibri"/>
-          <w:b w:val="0"/>
-          <w:i w:val="0"/>
-          <w:sz w:val="22"/>
-        </w:rPr>
-        <w:t>Belirsiz kalanlar AI’ya gider; Verifier cümle bağlamını kontrol eder.</w:t>
-      </w:r>
-    </w:p>
-    <w:p>
-      <w:pPr>
-        <w:pStyle w:val="ListBullet"/>
-        <w:spacing w:after="40"/>
-      </w:pPr>
-      <w:r>
-        <w:rPr>
-          <w:rFonts w:ascii="Calibri" w:hAnsi="Calibri" w:eastAsia="Calibri"/>
-          <w:b w:val="0"/>
-          <w:i w:val="0"/>
-          <w:sz w:val="22"/>
-        </w:rPr>
-        <w:t>Senin işin: öneriyi bu kılavuza göre doğrula; Wrong görünenleri özellikle para / CB / kimlik ailelerinde oku.</w:t>
-      </w:r>
-    </w:p>
-    <w:p>
-      <w:pPr>
-        <w:spacing w:after="120"/>
-      </w:pPr>
-      <w:r>
-        <w:rPr>
-          <w:rFonts w:ascii="Calibri" w:hAnsi="Calibri" w:eastAsia="Calibri"/>
-          <w:b w:val="0"/>
-          <w:i/>
-          <w:color w:val="444444"/>
+          <w:color w:val="333333"/>
           <w:sz w:val="18"/>
         </w:rPr>
-        <w:t>Son güncelleme: Eylül 2026 — Call Again / Recall / No Potential / No Answer / Denied / Language kuralları güncel iş kararlarıyla hizalı.</w:t>
+        <w:t>Handbook aligned to our system rules — September 2026.</w:t>
       </w:r>
     </w:p>
     <w:sectPr>
       <w:pgSz w:w="12240" w:h="15840"/>
-      <w:pgMar w:top="1020" w:right="1134" w:bottom="1020" w:left="1134" w:header="720" w:footer="720" w:gutter="0"/>
+      <w:pgMar w:top="907" w:right="1020" w:bottom="907" w:left="1020" w:header="720" w:footer="720" w:gutter="0"/>
       <w:cols w:space="720"/>
       <w:docGrid w:linePitch="360"/>
     </w:sectPr>

</xml_diff>